<commit_message>
Portada en formato UNAB, nombres completos y sin sección de comentarios del foro
Co-Authored-By: Claude Opus 5.5 <noreply@anthropic.com>
Claude-Session: https://claude.ai/code/session_016SZyvyW7ARQ2pwvZFzr2GZ
</commit_message>
<xml_diff>
--- a/docs/Informe_Formativa1_IBM_HR.docx
+++ b/docs/Informe_Formativa1_IBM_HR.docx
@@ -4,472 +4,239 @@
   <w:body>
     <w:p>
       <w:pPr>
-        <w:spacing w:after="40" w:before="0" w:line="264"/>
-        <w:jc w:val="center"/>
-      </w:pPr>
-      <w:r>
-        <w:rPr>
-          <w:b/>
-          <w:bCs/>
-          <w:color w:val="1F4E79"/>
-          <w:sz w:val="22"/>
-          <w:szCs w:val="22"/>
-        </w:rPr>
-        <w:t xml:space="preserve">MAGÍSTER EN CIENCIA DE DATOS E INTELIGENCIA ARTIFICIAL</w:t>
-      </w:r>
-    </w:p>
-    <w:p>
-      <w:pPr>
-        <w:spacing w:after="600" w:before="0" w:line="264"/>
-        <w:jc w:val="center"/>
-      </w:pPr>
-      <w:r>
-        <w:rPr>
-          <w:sz w:val="22"/>
-          <w:szCs w:val="22"/>
-        </w:rPr>
-        <w:t xml:space="preserve">MCDI501: Estadística Computacional para la Toma de Decisiones</w:t>
-      </w:r>
-    </w:p>
-    <w:p>
-      <w:pPr>
-        <w:spacing w:after="60" w:before="0" w:line="264"/>
-        <w:jc w:val="center"/>
-      </w:pPr>
-      <w:r>
-        <w:rPr>
-          <w:b/>
-          <w:bCs/>
-          <w:color w:val="1F4E79"/>
-          <w:sz w:val="40"/>
-          <w:szCs w:val="40"/>
-        </w:rPr>
-        <w:t xml:space="preserve">Evaluación Formativa 1</w:t>
-      </w:r>
-    </w:p>
-    <w:p>
-      <w:pPr>
-        <w:spacing w:after="60" w:before="0" w:line="264"/>
-        <w:jc w:val="center"/>
-      </w:pPr>
-      <w:r>
-        <w:rPr>
-          <w:sz w:val="28"/>
-          <w:szCs w:val="28"/>
-        </w:rPr>
-        <w:t xml:space="preserve">Análisis Exploratorio e Inferencial</w:t>
-      </w:r>
-    </w:p>
-    <w:p>
-      <w:pPr>
-        <w:spacing w:after="480" w:before="0" w:line="264"/>
-        <w:jc w:val="center"/>
-      </w:pPr>
-      <w:r>
-        <w:rPr>
-          <w:color w:val="595959"/>
-          <w:sz w:val="22"/>
-          <w:szCs w:val="22"/>
-        </w:rPr>
-        <w:t xml:space="preserve">Informe grupal · 0 % (formativa)</w:t>
-      </w:r>
-    </w:p>
-    <w:tbl>
-      <w:tblPr>
-        <w:tblW w:type="dxa" w:w="9070"/>
-        <w:tblBorders>
-          <w:top w:val="single" w:color="auto" w:sz="4"/>
-          <w:left w:val="single" w:color="auto" w:sz="4"/>
-          <w:bottom w:val="single" w:color="auto" w:sz="4"/>
-          <w:right w:val="single" w:color="auto" w:sz="4"/>
-          <w:insideH w:val="single" w:color="auto" w:sz="4"/>
-          <w:insideV w:val="single" w:color="auto" w:sz="4"/>
-        </w:tblBorders>
-      </w:tblPr>
-      <w:tblGrid>
-        <w:gridCol w:w="2600"/>
-        <w:gridCol w:w="6470"/>
-      </w:tblGrid>
-      <w:tr>
-        <w:tc>
-          <w:tcPr>
-            <w:tcW w:type="dxa" w:w="2600"/>
-            <w:tcBorders>
-              <w:top w:val="none" w:color="FFFFFF" w:sz="0"/>
-              <w:left w:val="none" w:color="FFFFFF" w:sz="0"/>
-              <w:bottom w:val="none" w:color="FFFFFF" w:sz="0"/>
-              <w:right w:val="none" w:color="FFFFFF" w:sz="0"/>
-            </w:tcBorders>
-          </w:tcPr>
-          <w:p>
-            <w:pPr>
-              <w:spacing w:after="60"/>
-            </w:pPr>
-            <w:r>
-              <w:rPr>
-                <w:b/>
-                <w:bCs/>
-              </w:rPr>
-              <w:t xml:space="preserve">Título del proyecto:</w:t>
-            </w:r>
-          </w:p>
-        </w:tc>
-        <w:tc>
-          <w:tcPr>
-            <w:tcW w:type="dxa" w:w="6470"/>
-            <w:tcBorders>
-              <w:top w:val="none" w:color="FFFFFF" w:sz="0"/>
-              <w:left w:val="none" w:color="FFFFFF" w:sz="0"/>
-              <w:bottom w:val="none" w:color="FFFFFF" w:sz="0"/>
-              <w:right w:val="none" w:color="FFFFFF" w:sz="0"/>
-            </w:tcBorders>
-          </w:tcPr>
-          <w:p>
-            <w:pPr>
-              <w:spacing w:after="20"/>
-            </w:pPr>
-            <w:r>
-              <w:t xml:space="preserve">¿Qué se asocia con la salida de empleados?</w:t>
-            </w:r>
-          </w:p>
-        </w:tc>
-      </w:tr>
-      <w:tr>
-        <w:tc>
-          <w:tcPr>
-            <w:tcW w:type="dxa" w:w="2600"/>
-            <w:tcBorders>
-              <w:top w:val="none" w:color="FFFFFF" w:sz="0"/>
-              <w:left w:val="none" w:color="FFFFFF" w:sz="0"/>
-              <w:bottom w:val="none" w:color="FFFFFF" w:sz="0"/>
-              <w:right w:val="none" w:color="FFFFFF" w:sz="0"/>
-            </w:tcBorders>
-          </w:tcPr>
-          <w:p>
-            <w:pPr>
-              <w:spacing w:after="60"/>
-            </w:pPr>
-            <w:r>
-              <w:rPr>
-                <w:b/>
-                <w:bCs/>
-              </w:rPr>
-              <w:t xml:space="preserve">Integrantes:</w:t>
-            </w:r>
-          </w:p>
-        </w:tc>
-        <w:tc>
-          <w:tcPr>
-            <w:tcW w:type="dxa" w:w="6470"/>
-            <w:tcBorders>
-              <w:top w:val="none" w:color="FFFFFF" w:sz="0"/>
-              <w:left w:val="none" w:color="FFFFFF" w:sz="0"/>
-              <w:bottom w:val="none" w:color="FFFFFF" w:sz="0"/>
-              <w:right w:val="none" w:color="FFFFFF" w:sz="0"/>
-            </w:tcBorders>
-          </w:tcPr>
-          <w:p>
-            <w:pPr>
-              <w:spacing w:after="20"/>
-            </w:pPr>
-            <w:r>
-              <w:t xml:space="preserve">Hernán Saavedra</w:t>
-            </w:r>
-          </w:p>
-          <w:p>
-            <w:pPr>
-              <w:spacing w:after="20"/>
-            </w:pPr>
-            <w:r>
-              <w:t xml:space="preserve">Lenin Morales Salas</w:t>
-            </w:r>
-          </w:p>
-          <w:p>
-            <w:pPr>
-              <w:spacing w:after="20"/>
-            </w:pPr>
-            <w:r>
-              <w:t xml:space="preserve">Rodrigo Gómez</w:t>
-            </w:r>
-          </w:p>
-        </w:tc>
-      </w:tr>
-      <w:tr>
-        <w:tc>
-          <w:tcPr>
-            <w:tcW w:type="dxa" w:w="2600"/>
-            <w:tcBorders>
-              <w:top w:val="none" w:color="FFFFFF" w:sz="0"/>
-              <w:left w:val="none" w:color="FFFFFF" w:sz="0"/>
-              <w:bottom w:val="none" w:color="FFFFFF" w:sz="0"/>
-              <w:right w:val="none" w:color="FFFFFF" w:sz="0"/>
-            </w:tcBorders>
-          </w:tcPr>
-          <w:p>
-            <w:pPr>
-              <w:spacing w:after="60"/>
-            </w:pPr>
-            <w:r>
-              <w:rPr>
-                <w:b/>
-                <w:bCs/>
-              </w:rPr>
-              <w:t xml:space="preserve">Dataset:</w:t>
-            </w:r>
-          </w:p>
-        </w:tc>
-        <w:tc>
-          <w:tcPr>
-            <w:tcW w:type="dxa" w:w="6470"/>
-            <w:tcBorders>
-              <w:top w:val="none" w:color="FFFFFF" w:sz="0"/>
-              <w:left w:val="none" w:color="FFFFFF" w:sz="0"/>
-              <w:bottom w:val="none" w:color="FFFFFF" w:sz="0"/>
-              <w:right w:val="none" w:color="FFFFFF" w:sz="0"/>
-            </w:tcBorders>
-          </w:tcPr>
-          <w:p>
-            <w:pPr>
-              <w:spacing w:after="20"/>
-            </w:pPr>
-            <w:r>
-              <w:t xml:space="preserve">IBM HR Employee Attrition (rotación de empleados)</w:t>
-            </w:r>
-          </w:p>
-        </w:tc>
-      </w:tr>
-      <w:tr>
-        <w:tc>
-          <w:tcPr>
-            <w:tcW w:type="dxa" w:w="2600"/>
-            <w:tcBorders>
-              <w:top w:val="none" w:color="FFFFFF" w:sz="0"/>
-              <w:left w:val="none" w:color="FFFFFF" w:sz="0"/>
-              <w:bottom w:val="none" w:color="FFFFFF" w:sz="0"/>
-              <w:right w:val="none" w:color="FFFFFF" w:sz="0"/>
-            </w:tcBorders>
-          </w:tcPr>
-          <w:p>
-            <w:pPr>
-              <w:spacing w:after="60"/>
-            </w:pPr>
-            <w:r>
-              <w:rPr>
-                <w:b/>
-                <w:bCs/>
-              </w:rPr>
-              <w:t xml:space="preserve">Docente:</w:t>
-            </w:r>
-          </w:p>
-        </w:tc>
-        <w:tc>
-          <w:tcPr>
-            <w:tcW w:type="dxa" w:w="6470"/>
-            <w:tcBorders>
-              <w:top w:val="none" w:color="FFFFFF" w:sz="0"/>
-              <w:left w:val="none" w:color="FFFFFF" w:sz="0"/>
-              <w:bottom w:val="none" w:color="FFFFFF" w:sz="0"/>
-              <w:right w:val="none" w:color="FFFFFF" w:sz="0"/>
-            </w:tcBorders>
-          </w:tcPr>
-          <w:p>
-            <w:pPr>
-              <w:spacing w:after="20"/>
-            </w:pPr>
-            <w:r>
-              <w:t xml:space="preserve">Jean Paul Maidana</w:t>
-            </w:r>
-          </w:p>
-        </w:tc>
-      </w:tr>
-      <w:tr>
-        <w:tc>
-          <w:tcPr>
-            <w:tcW w:type="dxa" w:w="2600"/>
-            <w:tcBorders>
-              <w:top w:val="none" w:color="FFFFFF" w:sz="0"/>
-              <w:left w:val="none" w:color="FFFFFF" w:sz="0"/>
-              <w:bottom w:val="none" w:color="FFFFFF" w:sz="0"/>
-              <w:right w:val="none" w:color="FFFFFF" w:sz="0"/>
-            </w:tcBorders>
-          </w:tcPr>
-          <w:p>
-            <w:pPr>
-              <w:spacing w:after="60"/>
-            </w:pPr>
-            <w:r>
-              <w:rPr>
-                <w:b/>
-                <w:bCs/>
-              </w:rPr>
-              <w:t xml:space="preserve">Fecha:</w:t>
-            </w:r>
-          </w:p>
-        </w:tc>
-        <w:tc>
-          <w:tcPr>
-            <w:tcW w:type="dxa" w:w="6470"/>
-            <w:tcBorders>
-              <w:top w:val="none" w:color="FFFFFF" w:sz="0"/>
-              <w:left w:val="none" w:color="FFFFFF" w:sz="0"/>
-              <w:bottom w:val="none" w:color="FFFFFF" w:sz="0"/>
-              <w:right w:val="none" w:color="FFFFFF" w:sz="0"/>
-            </w:tcBorders>
-          </w:tcPr>
-          <w:p>
-            <w:pPr>
-              <w:spacing w:after="20"/>
-            </w:pPr>
-            <w:r>
-              <w:t xml:space="preserve">8 de octubre de 2026</w:t>
-            </w:r>
-          </w:p>
-        </w:tc>
-      </w:tr>
-      <w:tr>
-        <w:tc>
-          <w:tcPr>
-            <w:tcW w:type="dxa" w:w="2600"/>
-            <w:tcBorders>
-              <w:top w:val="none" w:color="FFFFFF" w:sz="0"/>
-              <w:left w:val="none" w:color="FFFFFF" w:sz="0"/>
-              <w:bottom w:val="none" w:color="FFFFFF" w:sz="0"/>
-              <w:right w:val="none" w:color="FFFFFF" w:sz="0"/>
-            </w:tcBorders>
-          </w:tcPr>
-          <w:p>
-            <w:pPr>
-              <w:spacing w:after="60"/>
-            </w:pPr>
-            <w:r>
-              <w:rPr>
-                <w:b/>
-                <w:bCs/>
-              </w:rPr>
-              <w:t xml:space="preserve">Repositorio GitHub:</w:t>
-            </w:r>
-          </w:p>
-        </w:tc>
-        <w:tc>
-          <w:tcPr>
-            <w:tcW w:type="dxa" w:w="6470"/>
-            <w:tcBorders>
-              <w:top w:val="none" w:color="FFFFFF" w:sz="0"/>
-              <w:left w:val="none" w:color="FFFFFF" w:sz="0"/>
-              <w:bottom w:val="none" w:color="FFFFFF" w:sz="0"/>
-              <w:right w:val="none" w:color="FFFFFF" w:sz="0"/>
-            </w:tcBorders>
-          </w:tcPr>
-          <w:p>
-            <w:pPr>
-              <w:spacing w:after="20"/>
-            </w:pPr>
-            <w:r>
-              <w:t xml:space="preserve">https://github.com/lmoralessalas-dot/MCDI501-IBM-HR-Attrition</w:t>
-            </w:r>
-          </w:p>
-        </w:tc>
-      </w:tr>
-    </w:tbl>
-    <w:p>
-      <w:pPr>
-        <w:spacing w:after="240" w:before="0" w:line="264"/>
-        <w:jc w:val="both"/>
-      </w:pPr>
-    </w:p>
-    <w:tbl>
-      <w:tblPr>
-        <w:tblW w:type="dxa" w:w="9070"/>
-        <w:tblBorders>
-          <w:top w:val="single" w:color="auto" w:sz="4"/>
-          <w:left w:val="single" w:color="auto" w:sz="4"/>
-          <w:bottom w:val="single" w:color="auto" w:sz="4"/>
-          <w:right w:val="single" w:color="auto" w:sz="4"/>
-          <w:insideH w:val="single" w:color="auto" w:sz="4"/>
-          <w:insideV w:val="single" w:color="auto" w:sz="4"/>
-        </w:tblBorders>
-      </w:tblPr>
-      <w:tblGrid>
-        <w:gridCol w:w="9070"/>
-      </w:tblGrid>
-      <w:tr>
-        <w:tc>
-          <w:tcPr>
-            <w:tcW w:type="dxa" w:w="9070"/>
-            <w:tcBorders>
-              <w:top w:val="none" w:color="FFFFFF" w:sz="0"/>
-              <w:left w:val="single" w:color="1F4E79" w:sz="24"/>
-              <w:bottom w:val="none" w:color="FFFFFF" w:sz="0"/>
-              <w:right w:val="none" w:color="FFFFFF" w:sz="0"/>
-            </w:tcBorders>
-            <w:shd w:fill="EEF3F8" w:color="auto" w:val="clear"/>
-            <w:tcMar>
-              <w:top w:type="dxa" w:w="100"/>
-              <w:left w:type="dxa" w:w="160"/>
-              <w:bottom w:type="dxa" w:w="100"/>
-              <w:right w:type="dxa" w:w="160"/>
-            </w:tcMar>
-          </w:tcPr>
-          <w:p>
-            <w:pPr>
-              <w:spacing w:after="60" w:before="0" w:line="264"/>
-              <w:jc w:val="left"/>
-            </w:pPr>
-            <w:r>
-              <w:rPr>
-                <w:b/>
-                <w:bCs/>
-              </w:rPr>
-              <w:t xml:space="preserve">Información de la evaluación</w:t>
-            </w:r>
-          </w:p>
-          <w:p>
-            <w:pPr>
-              <w:spacing w:after="40" w:before="0" w:line="264"/>
-              <w:jc w:val="left"/>
-            </w:pPr>
-            <w:r>
-              <w:rPr>
-                <w:sz w:val="20"/>
-                <w:szCs w:val="20"/>
-              </w:rPr>
-              <w:t xml:space="preserve">Fase del proyecto: Fases 1 y 2 · Modalidad: grupal · Ponderación: 0 % (formativa) · Entregable: informe PDF en Canvas.</w:t>
-            </w:r>
-          </w:p>
-          <w:p>
-            <w:pPr>
-              <w:spacing w:after="0" w:before="0" w:line="264"/>
-              <w:jc w:val="left"/>
-            </w:pPr>
-            <w:r>
-              <w:rPr>
-                <w:sz w:val="20"/>
-                <w:szCs w:val="20"/>
-              </w:rPr>
-              <w:t xml:space="preserve">Resultado de aprendizaje (RA1): aplicar conceptos fundamentales de probabilidad e inferencia estadística en la resolución de problemas de decisión bajo incertidumbre. Indicadores: ID1.2, ID1.3, ID1.4.</w:t>
-            </w:r>
-          </w:p>
-        </w:tc>
-      </w:tr>
-    </w:tbl>
-    <w:p>
-      <w:pPr>
-        <w:spacing w:after="200" w:before="0" w:line="264"/>
-        <w:jc w:val="both"/>
+        <w:spacing w:after="200"/>
       </w:pPr>
     </w:p>
     <w:p>
       <w:pPr>
-        <w:spacing w:after="80" w:before="0" w:line="264"/>
+        <w:spacing w:after="1300"/>
+        <w:jc w:val="center"/>
+      </w:pPr>
+      <w:r>
+        <w:drawing>
+          <wp:inline distT="0" distB="0" distL="0" distR="0">
+            <wp:extent cx="2000250" cy="704850"/>
+            <wp:effectExtent t="0" r="0" b="0" l="0"/>
+            <wp:docPr id="1" name="" descr="" title=""/>
+            <wp:cNvGraphicFramePr>
+              <a:graphicFrameLocks xmlns:a="http://schemas.openxmlformats.org/drawingml/2006/main" noChangeAspect="1"/>
+            </wp:cNvGraphicFramePr>
+            <a:graphic xmlns:a="http://schemas.openxmlformats.org/drawingml/2006/main">
+              <a:graphicData uri="http://schemas.openxmlformats.org/drawingml/2006/picture">
+                <pic:pic xmlns:pic="http://schemas.openxmlformats.org/drawingml/2006/picture">
+                  <pic:nvPicPr>
+                    <pic:cNvPr id="0" name="" descr=""/>
+                    <pic:cNvPicPr>
+                      <a:picLocks noChangeAspect="1" noChangeArrowheads="1"/>
+                    </pic:cNvPicPr>
+                  </pic:nvPicPr>
+                  <pic:blipFill>
+                    <a:blip r:embed="rId11" cstate="none"/>
+                    <a:srcRect/>
+                    <a:stretch>
+                      <a:fillRect/>
+                    </a:stretch>
+                  </pic:blipFill>
+                  <pic:spPr bwMode="auto">
+                    <a:xfrm>
+                      <a:off x="0" y="0"/>
+                      <a:ext cx="2000250" cy="704850"/>
+                    </a:xfrm>
+                    <a:prstGeom prst="rect">
+                      <a:avLst/>
+                    </a:prstGeom>
+                  </pic:spPr>
+                </pic:pic>
+              </a:graphicData>
+            </a:graphic>
+          </wp:inline>
+        </w:drawing>
+      </w:r>
+    </w:p>
+    <w:p>
+      <w:pPr>
+        <w:spacing w:after="160" w:line="252" w:lineRule="auto"/>
         <w:jc w:val="left"/>
       </w:pPr>
       <w:r>
         <w:rPr>
+          <w:rFonts w:ascii="Arial" w:cs="Arial" w:eastAsia="Arial" w:hAnsi="Arial"/>
+          <w:b/>
+          <w:bCs/>
+          <w:sz w:val="60"/>
+          <w:szCs w:val="60"/>
+        </w:rPr>
+        <w:t xml:space="preserve">MCDI501</w:t>
+      </w:r>
+    </w:p>
+    <w:p>
+      <w:pPr>
+        <w:spacing w:after="480" w:line="252" w:lineRule="auto"/>
+        <w:jc w:val="left"/>
+      </w:pPr>
+      <w:r>
+        <w:rPr>
+          <w:rFonts w:ascii="Arial" w:cs="Arial" w:eastAsia="Arial" w:hAnsi="Arial"/>
+          <w:b/>
+          <w:bCs/>
+          <w:sz w:val="54"/>
+          <w:szCs w:val="54"/>
+        </w:rPr>
+        <w:t xml:space="preserve">ESTADÍSTICA COMPUTACIONAL</w:t>
+      </w:r>
+      <w:r>
+        <w:rPr>
+          <w:rFonts w:ascii="Arial" w:cs="Arial" w:eastAsia="Arial" w:hAnsi="Arial"/>
+          <w:b/>
+          <w:bCs/>
+          <w:sz w:val="54"/>
+          <w:szCs w:val="54"/>
+        </w:rPr>
+        <w:br/>
+        <w:t xml:space="preserve">PARA LA TOMA DE DECISIONES</w:t>
+      </w:r>
+    </w:p>
+    <w:p>
+      <w:pPr>
+        <w:spacing w:after="480" w:line="252" w:lineRule="auto"/>
+        <w:jc w:val="left"/>
+      </w:pPr>
+      <w:r>
+        <w:rPr>
+          <w:rFonts w:ascii="Arial" w:cs="Arial" w:eastAsia="Arial" w:hAnsi="Arial"/>
+          <w:b/>
+          <w:bCs/>
+          <w:sz w:val="50"/>
+          <w:szCs w:val="50"/>
+        </w:rPr>
+        <w:t xml:space="preserve">EVALUACIÓN FORMATIVA 1</w:t>
+      </w:r>
+      <w:r>
+        <w:rPr>
+          <w:rFonts w:ascii="Arial" w:cs="Arial" w:eastAsia="Arial" w:hAnsi="Arial"/>
+          <w:b/>
+          <w:bCs/>
+          <w:sz w:val="50"/>
+          <w:szCs w:val="50"/>
+        </w:rPr>
+        <w:br/>
+        <w:t xml:space="preserve">FASES 1 Y 2</w:t>
+      </w:r>
+    </w:p>
+    <w:p>
+      <w:pPr>
+        <w:spacing w:after="480" w:line="252" w:lineRule="auto"/>
+        <w:jc w:val="left"/>
+      </w:pPr>
+      <w:r>
+        <w:rPr>
+          <w:rFonts w:ascii="Arial" w:cs="Arial" w:eastAsia="Arial" w:hAnsi="Arial"/>
+          <w:b/>
+          <w:bCs/>
+          <w:sz w:val="32"/>
+          <w:szCs w:val="32"/>
+        </w:rPr>
+        <w:t xml:space="preserve">Factores asociados a la salida de empleados</w:t>
+      </w:r>
+      <w:r>
+        <w:rPr>
+          <w:rFonts w:ascii="Arial" w:cs="Arial" w:eastAsia="Arial" w:hAnsi="Arial"/>
+          <w:b/>
+          <w:bCs/>
+          <w:sz w:val="32"/>
+          <w:szCs w:val="32"/>
+        </w:rPr>
+        <w:br/>
+        <w:t xml:space="preserve">en el conjunto IBM HR Employee Attrition</w:t>
+      </w:r>
+    </w:p>
+    <w:p>
+      <w:pPr>
+        <w:spacing w:after="120"/>
+        <w:jc w:val="left"/>
+      </w:pPr>
+      <w:r>
+        <w:rPr>
+          <w:rFonts w:ascii="Arial" w:cs="Arial" w:eastAsia="Arial" w:hAnsi="Arial"/>
+          <w:sz w:val="18"/>
+          <w:szCs w:val="18"/>
+        </w:rPr>
+        <w:t xml:space="preserve">Integrantes: Hernán Saavedra González · Lenin Morales Salas · Rodrigo Gómez Indellicati</w:t>
+      </w:r>
+    </w:p>
+    <w:p>
+      <w:pPr>
+        <w:spacing w:after="120"/>
+        <w:jc w:val="left"/>
+      </w:pPr>
+      <w:r>
+        <w:rPr>
+          <w:rFonts w:ascii="Arial" w:cs="Arial" w:eastAsia="Arial" w:hAnsi="Arial"/>
+          <w:sz w:val="18"/>
+          <w:szCs w:val="18"/>
+        </w:rPr>
+        <w:t xml:space="preserve">Docente: Jean Paul Maidana</w:t>
+      </w:r>
+    </w:p>
+    <w:p>
+      <w:pPr>
+        <w:spacing w:after="120"/>
+        <w:jc w:val="left"/>
+      </w:pPr>
+      <w:r>
+        <w:rPr>
+          <w:rFonts w:ascii="Arial" w:cs="Arial" w:eastAsia="Arial" w:hAnsi="Arial"/>
+          <w:sz w:val="18"/>
+          <w:szCs w:val="18"/>
+        </w:rPr>
+        <w:t xml:space="preserve">Curso: MCDI501 · Estadística Computacional para la Toma de Decisiones</w:t>
+      </w:r>
+    </w:p>
+    <w:p>
+      <w:pPr>
+        <w:spacing w:after="120"/>
+        <w:jc w:val="left"/>
+      </w:pPr>
+      <w:r>
+        <w:rPr>
+          <w:rFonts w:ascii="Arial" w:cs="Arial" w:eastAsia="Arial" w:hAnsi="Arial"/>
+          <w:sz w:val="18"/>
+          <w:szCs w:val="18"/>
+        </w:rPr>
+        <w:t xml:space="preserve">Fecha: octubre de 2026</w:t>
+      </w:r>
+    </w:p>
+    <w:p>
+      <w:pPr>
+        <w:spacing w:after="120"/>
+        <w:jc w:val="left"/>
+      </w:pPr>
+      <w:r>
+        <w:rPr>
+          <w:rFonts w:ascii="Arial" w:cs="Arial" w:eastAsia="Arial" w:hAnsi="Arial"/>
+          <w:sz w:val="18"/>
+          <w:szCs w:val="18"/>
+        </w:rPr>
+        <w:t xml:space="preserve">Repositorio: https://github.com/lmoralessalas-dot/MCDI501-IBM-HR-Attrition</w:t>
+      </w:r>
+    </w:p>
+    <w:p>
+      <w:r>
+        <w:br w:type="page"/>
+      </w:r>
+    </w:p>
+    <w:p>
+      <w:pPr>
+        <w:spacing w:after="160" w:before="200"/>
+      </w:pPr>
+      <w:r>
+        <w:rPr>
+          <w:rFonts w:ascii="Calibri" w:cs="Calibri" w:eastAsia="Calibri" w:hAnsi="Calibri"/>
           <w:b/>
           <w:bCs/>
           <w:color w:val="1F4E79"/>
-          <w:sz w:val="26"/>
-          <w:szCs w:val="26"/>
+          <w:sz w:val="30"/>
+          <w:szCs w:val="30"/>
         </w:rPr>
         <w:t xml:space="preserve">Índice</w:t>
       </w:r>
@@ -494,9 +261,9 @@
       </w:sdtContent>
     </w:sdt>
     <w:p>
-      <w:r>
-        <w:br w:type="page"/>
-      </w:r>
+      <w:pPr>
+        <w:spacing w:after="120"/>
+      </w:pPr>
     </w:p>
     <w:p>
       <w:pPr>
@@ -539,7 +306,7 @@
     </w:p>
     <w:tbl>
       <w:tblPr>
-        <w:tblW w:type="dxa" w:w="9070"/>
+        <w:tblW w:type="dxa" w:w="10080"/>
         <w:tblBorders>
           <w:top w:val="single" w:color="auto" w:sz="4"/>
           <w:left w:val="single" w:color="auto" w:sz="4"/>
@@ -550,12 +317,12 @@
         </w:tblBorders>
       </w:tblPr>
       <w:tblGrid>
-        <w:gridCol w:w="9070"/>
+        <w:gridCol w:w="10080"/>
       </w:tblGrid>
       <w:tr>
         <w:tc>
           <w:tcPr>
-            <w:tcW w:type="dxa" w:w="9070"/>
+            <w:tcW w:type="dxa" w:w="10080"/>
             <w:tcBorders>
               <w:top w:val="none" w:color="FFFFFF" w:sz="0"/>
               <w:left w:val="single" w:color="1F4E79" w:sz="24"/>
@@ -606,7 +373,7 @@
     </w:p>
     <w:tbl>
       <w:tblPr>
-        <w:tblW w:type="dxa" w:w="9070"/>
+        <w:tblW w:type="dxa" w:w="10080"/>
         <w:jc w:val="center"/>
         <w:tblBorders>
           <w:top w:val="single" w:color="auto" w:sz="4"/>
@@ -618,8 +385,8 @@
         </w:tblBorders>
       </w:tblPr>
       <w:tblGrid>
-        <w:gridCol w:w="2500"/>
-        <w:gridCol w:w="6570"/>
+        <w:gridCol w:w="2778"/>
+        <w:gridCol w:w="7302"/>
       </w:tblGrid>
       <w:tr>
         <w:trPr>
@@ -627,7 +394,7 @@
         </w:trPr>
         <w:tc>
           <w:tcPr>
-            <w:tcW w:type="dxa" w:w="2500"/>
+            <w:tcW w:type="dxa" w:w="2778"/>
             <w:tcBorders>
               <w:top w:val="single" w:color="BFBFBF" w:sz="4"/>
               <w:left w:val="none" w:color="FFFFFF" w:sz="0"/>
@@ -662,7 +429,7 @@
         </w:tc>
         <w:tc>
           <w:tcPr>
-            <w:tcW w:type="dxa" w:w="6570"/>
+            <w:tcW w:type="dxa" w:w="7302"/>
             <w:tcBorders>
               <w:top w:val="single" w:color="BFBFBF" w:sz="4"/>
               <w:left w:val="none" w:color="FFFFFF" w:sz="0"/>
@@ -702,7 +469,7 @@
         </w:trPr>
         <w:tc>
           <w:tcPr>
-            <w:tcW w:type="dxa" w:w="2500"/>
+            <w:tcW w:type="dxa" w:w="2778"/>
             <w:tcBorders>
               <w:top w:val="single" w:color="BFBFBF" w:sz="4"/>
               <w:left w:val="none" w:color="FFFFFF" w:sz="0"/>
@@ -736,7 +503,7 @@
         </w:tc>
         <w:tc>
           <w:tcPr>
-            <w:tcW w:type="dxa" w:w="6570"/>
+            <w:tcW w:type="dxa" w:w="7302"/>
             <w:tcBorders>
               <w:top w:val="single" w:color="BFBFBF" w:sz="4"/>
               <w:left w:val="none" w:color="FFFFFF" w:sz="0"/>
@@ -786,7 +553,7 @@
         </w:trPr>
         <w:tc>
           <w:tcPr>
-            <w:tcW w:type="dxa" w:w="2500"/>
+            <w:tcW w:type="dxa" w:w="2778"/>
             <w:tcBorders>
               <w:top w:val="single" w:color="BFBFBF" w:sz="4"/>
               <w:left w:val="none" w:color="FFFFFF" w:sz="0"/>
@@ -820,7 +587,7 @@
         </w:tc>
         <w:tc>
           <w:tcPr>
-            <w:tcW w:type="dxa" w:w="6570"/>
+            <w:tcW w:type="dxa" w:w="7302"/>
             <w:tcBorders>
               <w:top w:val="single" w:color="BFBFBF" w:sz="4"/>
               <w:left w:val="none" w:color="FFFFFF" w:sz="0"/>
@@ -859,7 +626,7 @@
         </w:trPr>
         <w:tc>
           <w:tcPr>
-            <w:tcW w:type="dxa" w:w="2500"/>
+            <w:tcW w:type="dxa" w:w="2778"/>
             <w:tcBorders>
               <w:top w:val="single" w:color="BFBFBF" w:sz="4"/>
               <w:left w:val="none" w:color="FFFFFF" w:sz="0"/>
@@ -893,7 +660,7 @@
         </w:tc>
         <w:tc>
           <w:tcPr>
-            <w:tcW w:type="dxa" w:w="6570"/>
+            <w:tcW w:type="dxa" w:w="7302"/>
             <w:tcBorders>
               <w:top w:val="single" w:color="BFBFBF" w:sz="4"/>
               <w:left w:val="none" w:color="FFFFFF" w:sz="0"/>
@@ -932,7 +699,7 @@
         </w:trPr>
         <w:tc>
           <w:tcPr>
-            <w:tcW w:type="dxa" w:w="2500"/>
+            <w:tcW w:type="dxa" w:w="2778"/>
             <w:tcBorders>
               <w:top w:val="single" w:color="BFBFBF" w:sz="4"/>
               <w:left w:val="none" w:color="FFFFFF" w:sz="0"/>
@@ -966,7 +733,7 @@
         </w:tc>
         <w:tc>
           <w:tcPr>
-            <w:tcW w:type="dxa" w:w="6570"/>
+            <w:tcW w:type="dxa" w:w="7302"/>
             <w:tcBorders>
               <w:top w:val="single" w:color="BFBFBF" w:sz="4"/>
               <w:left w:val="none" w:color="FFFFFF" w:sz="0"/>
@@ -1016,7 +783,7 @@
         </w:trPr>
         <w:tc>
           <w:tcPr>
-            <w:tcW w:type="dxa" w:w="2500"/>
+            <w:tcW w:type="dxa" w:w="2778"/>
             <w:tcBorders>
               <w:top w:val="single" w:color="BFBFBF" w:sz="4"/>
               <w:left w:val="none" w:color="FFFFFF" w:sz="0"/>
@@ -1050,7 +817,7 @@
         </w:tc>
         <w:tc>
           <w:tcPr>
-            <w:tcW w:type="dxa" w:w="6570"/>
+            <w:tcW w:type="dxa" w:w="7302"/>
             <w:tcBorders>
               <w:top w:val="single" w:color="BFBFBF" w:sz="4"/>
               <w:left w:val="none" w:color="FFFFFF" w:sz="0"/>
@@ -1109,24 +876,24 @@
         </w:trPr>
         <w:tc>
           <w:tcPr>
-            <w:tcW w:type="dxa" w:w="2500"/>
-            <w:tcBorders>
-              <w:top w:val="single" w:color="BFBFBF" w:sz="4"/>
-              <w:left w:val="none" w:color="FFFFFF" w:sz="0"/>
-              <w:bottom w:val="single" w:color="BFBFBF" w:sz="4"/>
-              <w:right w:val="none" w:color="FFFFFF" w:sz="0"/>
-            </w:tcBorders>
-            <w:tcMar>
-              <w:top w:type="dxa" w:w="40"/>
-              <w:left w:type="dxa" w:w="90"/>
-              <w:bottom w:type="dxa" w:w="40"/>
-              <w:right w:type="dxa" w:w="90"/>
-            </w:tcMar>
-            <w:vAlign w:val="center"/>
-          </w:tcPr>
-          <w:p>
-            <w:pPr>
-              <w:keepNext w:val="false"/>
+            <w:tcW w:type="dxa" w:w="2778"/>
+            <w:tcBorders>
+              <w:top w:val="single" w:color="BFBFBF" w:sz="4"/>
+              <w:left w:val="none" w:color="FFFFFF" w:sz="0"/>
+              <w:bottom w:val="single" w:color="BFBFBF" w:sz="4"/>
+              <w:right w:val="none" w:color="FFFFFF" w:sz="0"/>
+            </w:tcBorders>
+            <w:tcMar>
+              <w:top w:type="dxa" w:w="40"/>
+              <w:left w:type="dxa" w:w="90"/>
+              <w:bottom w:type="dxa" w:w="40"/>
+              <w:right w:type="dxa" w:w="90"/>
+            </w:tcMar>
+            <w:vAlign w:val="center"/>
+          </w:tcPr>
+          <w:p>
+            <w:pPr>
+              <w:keepNext/>
               <w:spacing w:after="0"/>
               <w:jc w:val="left"/>
             </w:pPr>
@@ -1143,24 +910,24 @@
         </w:tc>
         <w:tc>
           <w:tcPr>
-            <w:tcW w:type="dxa" w:w="6570"/>
-            <w:tcBorders>
-              <w:top w:val="single" w:color="BFBFBF" w:sz="4"/>
-              <w:left w:val="none" w:color="FFFFFF" w:sz="0"/>
-              <w:bottom w:val="single" w:color="BFBFBF" w:sz="4"/>
-              <w:right w:val="none" w:color="FFFFFF" w:sz="0"/>
-            </w:tcBorders>
-            <w:tcMar>
-              <w:top w:type="dxa" w:w="40"/>
-              <w:left w:type="dxa" w:w="90"/>
-              <w:bottom w:type="dxa" w:w="40"/>
-              <w:right w:type="dxa" w:w="90"/>
-            </w:tcMar>
-            <w:vAlign w:val="center"/>
-          </w:tcPr>
-          <w:p>
-            <w:pPr>
-              <w:keepNext w:val="false"/>
+            <w:tcW w:type="dxa" w:w="7302"/>
+            <w:tcBorders>
+              <w:top w:val="single" w:color="BFBFBF" w:sz="4"/>
+              <w:left w:val="none" w:color="FFFFFF" w:sz="0"/>
+              <w:bottom w:val="single" w:color="BFBFBF" w:sz="4"/>
+              <w:right w:val="none" w:color="FFFFFF" w:sz="0"/>
+            </w:tcBorders>
+            <w:tcMar>
+              <w:top w:type="dxa" w:w="40"/>
+              <w:left w:type="dxa" w:w="90"/>
+              <w:bottom w:type="dxa" w:w="40"/>
+              <w:right w:type="dxa" w:w="90"/>
+            </w:tcMar>
+            <w:vAlign w:val="center"/>
+          </w:tcPr>
+          <w:p>
+            <w:pPr>
+              <w:keepNext/>
               <w:spacing w:after="0"/>
               <w:jc w:val="left"/>
             </w:pPr>
@@ -1243,7 +1010,7 @@
     </w:p>
     <w:tbl>
       <w:tblPr>
-        <w:tblW w:type="dxa" w:w="9070"/>
+        <w:tblW w:type="dxa" w:w="10080"/>
         <w:jc w:val="center"/>
         <w:tblBorders>
           <w:top w:val="single" w:color="auto" w:sz="4"/>
@@ -1255,9 +1022,9 @@
         </w:tblBorders>
       </w:tblPr>
       <w:tblGrid>
-        <w:gridCol w:w="2150"/>
-        <w:gridCol w:w="6420"/>
-        <w:gridCol w:w="500"/>
+        <w:gridCol w:w="2389"/>
+        <w:gridCol w:w="7135"/>
+        <w:gridCol w:w="556"/>
       </w:tblGrid>
       <w:tr>
         <w:trPr>
@@ -1265,7 +1032,7 @@
         </w:trPr>
         <w:tc>
           <w:tcPr>
-            <w:tcW w:type="dxa" w:w="2150"/>
+            <w:tcW w:type="dxa" w:w="2389"/>
             <w:tcBorders>
               <w:top w:val="single" w:color="BFBFBF" w:sz="4"/>
               <w:left w:val="none" w:color="FFFFFF" w:sz="0"/>
@@ -1300,7 +1067,7 @@
         </w:tc>
         <w:tc>
           <w:tcPr>
-            <w:tcW w:type="dxa" w:w="6420"/>
+            <w:tcW w:type="dxa" w:w="7135"/>
             <w:tcBorders>
               <w:top w:val="single" w:color="BFBFBF" w:sz="4"/>
               <w:left w:val="none" w:color="FFFFFF" w:sz="0"/>
@@ -1335,7 +1102,7 @@
         </w:tc>
         <w:tc>
           <w:tcPr>
-            <w:tcW w:type="dxa" w:w="500"/>
+            <w:tcW w:type="dxa" w:w="556"/>
             <w:tcBorders>
               <w:top w:val="single" w:color="BFBFBF" w:sz="4"/>
               <w:left w:val="none" w:color="FFFFFF" w:sz="0"/>
@@ -1375,7 +1142,7 @@
         </w:trPr>
         <w:tc>
           <w:tcPr>
-            <w:tcW w:type="dxa" w:w="2150"/>
+            <w:tcW w:type="dxa" w:w="2389"/>
             <w:tcBorders>
               <w:top w:val="single" w:color="BFBFBF" w:sz="4"/>
               <w:left w:val="none" w:color="FFFFFF" w:sz="0"/>
@@ -1409,7 +1176,7 @@
         </w:tc>
         <w:tc>
           <w:tcPr>
-            <w:tcW w:type="dxa" w:w="6420"/>
+            <w:tcW w:type="dxa" w:w="7135"/>
             <w:tcBorders>
               <w:top w:val="single" w:color="BFBFBF" w:sz="4"/>
               <w:left w:val="none" w:color="FFFFFF" w:sz="0"/>
@@ -1470,7 +1237,7 @@
         </w:tc>
         <w:tc>
           <w:tcPr>
-            <w:tcW w:type="dxa" w:w="500"/>
+            <w:tcW w:type="dxa" w:w="556"/>
             <w:tcBorders>
               <w:top w:val="single" w:color="BFBFBF" w:sz="4"/>
               <w:left w:val="none" w:color="FFFFFF" w:sz="0"/>
@@ -1509,7 +1276,7 @@
         </w:trPr>
         <w:tc>
           <w:tcPr>
-            <w:tcW w:type="dxa" w:w="2150"/>
+            <w:tcW w:type="dxa" w:w="2389"/>
             <w:tcBorders>
               <w:top w:val="single" w:color="BFBFBF" w:sz="4"/>
               <w:left w:val="none" w:color="FFFFFF" w:sz="0"/>
@@ -1543,7 +1310,7 @@
         </w:tc>
         <w:tc>
           <w:tcPr>
-            <w:tcW w:type="dxa" w:w="6420"/>
+            <w:tcW w:type="dxa" w:w="7135"/>
             <w:tcBorders>
               <w:top w:val="single" w:color="BFBFBF" w:sz="4"/>
               <w:left w:val="none" w:color="FFFFFF" w:sz="0"/>
@@ -1586,7 +1353,7 @@
         </w:tc>
         <w:tc>
           <w:tcPr>
-            <w:tcW w:type="dxa" w:w="500"/>
+            <w:tcW w:type="dxa" w:w="556"/>
             <w:tcBorders>
               <w:top w:val="single" w:color="BFBFBF" w:sz="4"/>
               <w:left w:val="none" w:color="FFFFFF" w:sz="0"/>
@@ -1625,7 +1392,7 @@
         </w:trPr>
         <w:tc>
           <w:tcPr>
-            <w:tcW w:type="dxa" w:w="2150"/>
+            <w:tcW w:type="dxa" w:w="2389"/>
             <w:tcBorders>
               <w:top w:val="single" w:color="BFBFBF" w:sz="4"/>
               <w:left w:val="none" w:color="FFFFFF" w:sz="0"/>
@@ -1659,7 +1426,7 @@
         </w:tc>
         <w:tc>
           <w:tcPr>
-            <w:tcW w:type="dxa" w:w="6420"/>
+            <w:tcW w:type="dxa" w:w="7135"/>
             <w:tcBorders>
               <w:top w:val="single" w:color="BFBFBF" w:sz="4"/>
               <w:left w:val="none" w:color="FFFFFF" w:sz="0"/>
@@ -1693,7 +1460,7 @@
         </w:tc>
         <w:tc>
           <w:tcPr>
-            <w:tcW w:type="dxa" w:w="500"/>
+            <w:tcW w:type="dxa" w:w="556"/>
             <w:tcBorders>
               <w:top w:val="single" w:color="BFBFBF" w:sz="4"/>
               <w:left w:val="none" w:color="FFFFFF" w:sz="0"/>
@@ -1732,7 +1499,7 @@
         </w:trPr>
         <w:tc>
           <w:tcPr>
-            <w:tcW w:type="dxa" w:w="2150"/>
+            <w:tcW w:type="dxa" w:w="2389"/>
             <w:tcBorders>
               <w:top w:val="single" w:color="BFBFBF" w:sz="4"/>
               <w:left w:val="none" w:color="FFFFFF" w:sz="0"/>
@@ -1766,7 +1533,7 @@
         </w:tc>
         <w:tc>
           <w:tcPr>
-            <w:tcW w:type="dxa" w:w="6420"/>
+            <w:tcW w:type="dxa" w:w="7135"/>
             <w:tcBorders>
               <w:top w:val="single" w:color="BFBFBF" w:sz="4"/>
               <w:left w:val="none" w:color="FFFFFF" w:sz="0"/>
@@ -1827,7 +1594,7 @@
         </w:tc>
         <w:tc>
           <w:tcPr>
-            <w:tcW w:type="dxa" w:w="500"/>
+            <w:tcW w:type="dxa" w:w="556"/>
             <w:tcBorders>
               <w:top w:val="single" w:color="BFBFBF" w:sz="4"/>
               <w:left w:val="none" w:color="FFFFFF" w:sz="0"/>
@@ -1866,24 +1633,24 @@
         </w:trPr>
         <w:tc>
           <w:tcPr>
-            <w:tcW w:type="dxa" w:w="2150"/>
-            <w:tcBorders>
-              <w:top w:val="single" w:color="BFBFBF" w:sz="4"/>
-              <w:left w:val="none" w:color="FFFFFF" w:sz="0"/>
-              <w:bottom w:val="single" w:color="BFBFBF" w:sz="4"/>
-              <w:right w:val="none" w:color="FFFFFF" w:sz="0"/>
-            </w:tcBorders>
-            <w:tcMar>
-              <w:top w:type="dxa" w:w="40"/>
-              <w:left w:type="dxa" w:w="90"/>
-              <w:bottom w:type="dxa" w:w="40"/>
-              <w:right w:type="dxa" w:w="90"/>
-            </w:tcMar>
-            <w:vAlign w:val="center"/>
-          </w:tcPr>
-          <w:p>
-            <w:pPr>
-              <w:keepNext w:val="false"/>
+            <w:tcW w:type="dxa" w:w="2389"/>
+            <w:tcBorders>
+              <w:top w:val="single" w:color="BFBFBF" w:sz="4"/>
+              <w:left w:val="none" w:color="FFFFFF" w:sz="0"/>
+              <w:bottom w:val="single" w:color="BFBFBF" w:sz="4"/>
+              <w:right w:val="none" w:color="FFFFFF" w:sz="0"/>
+            </w:tcBorders>
+            <w:tcMar>
+              <w:top w:type="dxa" w:w="40"/>
+              <w:left w:type="dxa" w:w="90"/>
+              <w:bottom w:type="dxa" w:w="40"/>
+              <w:right w:type="dxa" w:w="90"/>
+            </w:tcMar>
+            <w:vAlign w:val="center"/>
+          </w:tcPr>
+          <w:p>
+            <w:pPr>
+              <w:keepNext/>
               <w:spacing w:after="0"/>
               <w:jc w:val="left"/>
             </w:pPr>
@@ -1900,24 +1667,24 @@
         </w:tc>
         <w:tc>
           <w:tcPr>
-            <w:tcW w:type="dxa" w:w="6420"/>
-            <w:tcBorders>
-              <w:top w:val="single" w:color="BFBFBF" w:sz="4"/>
-              <w:left w:val="none" w:color="FFFFFF" w:sz="0"/>
-              <w:bottom w:val="single" w:color="BFBFBF" w:sz="4"/>
-              <w:right w:val="none" w:color="FFFFFF" w:sz="0"/>
-            </w:tcBorders>
-            <w:tcMar>
-              <w:top w:type="dxa" w:w="40"/>
-              <w:left w:type="dxa" w:w="90"/>
-              <w:bottom w:type="dxa" w:w="40"/>
-              <w:right w:type="dxa" w:w="90"/>
-            </w:tcMar>
-            <w:vAlign w:val="center"/>
-          </w:tcPr>
-          <w:p>
-            <w:pPr>
-              <w:keepNext w:val="false"/>
+            <w:tcW w:type="dxa" w:w="7135"/>
+            <w:tcBorders>
+              <w:top w:val="single" w:color="BFBFBF" w:sz="4"/>
+              <w:left w:val="none" w:color="FFFFFF" w:sz="0"/>
+              <w:bottom w:val="single" w:color="BFBFBF" w:sz="4"/>
+              <w:right w:val="none" w:color="FFFFFF" w:sz="0"/>
+            </w:tcBorders>
+            <w:tcMar>
+              <w:top w:type="dxa" w:w="40"/>
+              <w:left w:type="dxa" w:w="90"/>
+              <w:bottom w:type="dxa" w:w="40"/>
+              <w:right w:type="dxa" w:w="90"/>
+            </w:tcMar>
+            <w:vAlign w:val="center"/>
+          </w:tcPr>
+          <w:p>
+            <w:pPr>
+              <w:keepNext/>
               <w:spacing w:after="0"/>
               <w:jc w:val="left"/>
             </w:pPr>
@@ -1934,24 +1701,24 @@
         </w:tc>
         <w:tc>
           <w:tcPr>
-            <w:tcW w:type="dxa" w:w="500"/>
-            <w:tcBorders>
-              <w:top w:val="single" w:color="BFBFBF" w:sz="4"/>
-              <w:left w:val="none" w:color="FFFFFF" w:sz="0"/>
-              <w:bottom w:val="single" w:color="BFBFBF" w:sz="4"/>
-              <w:right w:val="none" w:color="FFFFFF" w:sz="0"/>
-            </w:tcBorders>
-            <w:tcMar>
-              <w:top w:type="dxa" w:w="40"/>
-              <w:left w:type="dxa" w:w="90"/>
-              <w:bottom w:type="dxa" w:w="40"/>
-              <w:right w:type="dxa" w:w="90"/>
-            </w:tcMar>
-            <w:vAlign w:val="center"/>
-          </w:tcPr>
-          <w:p>
-            <w:pPr>
-              <w:keepNext w:val="false"/>
+            <w:tcW w:type="dxa" w:w="556"/>
+            <w:tcBorders>
+              <w:top w:val="single" w:color="BFBFBF" w:sz="4"/>
+              <w:left w:val="none" w:color="FFFFFF" w:sz="0"/>
+              <w:bottom w:val="single" w:color="BFBFBF" w:sz="4"/>
+              <w:right w:val="none" w:color="FFFFFF" w:sz="0"/>
+            </w:tcBorders>
+            <w:tcMar>
+              <w:top w:type="dxa" w:w="40"/>
+              <w:left w:type="dxa" w:w="90"/>
+              <w:bottom w:type="dxa" w:w="40"/>
+              <w:right w:type="dxa" w:w="90"/>
+            </w:tcMar>
+            <w:vAlign w:val="center"/>
+          </w:tcPr>
+          <w:p>
+            <w:pPr>
+              <w:keepNext/>
               <w:spacing w:after="0"/>
               <w:jc w:val="center"/>
             </w:pPr>
@@ -2058,7 +1825,7 @@
     </w:p>
     <w:tbl>
       <w:tblPr>
-        <w:tblW w:type="dxa" w:w="9070"/>
+        <w:tblW w:type="dxa" w:w="10080"/>
         <w:jc w:val="center"/>
         <w:tblBorders>
           <w:top w:val="single" w:color="auto" w:sz="4"/>
@@ -2070,14 +1837,14 @@
         </w:tblBorders>
       </w:tblPr>
       <w:tblGrid>
-        <w:gridCol w:w="2270"/>
-        <w:gridCol w:w="640"/>
-        <w:gridCol w:w="980"/>
-        <w:gridCol w:w="900"/>
-        <w:gridCol w:w="900"/>
-        <w:gridCol w:w="800"/>
-        <w:gridCol w:w="1580"/>
+        <w:gridCol w:w="2523"/>
+        <w:gridCol w:w="711"/>
+        <w:gridCol w:w="1089"/>
         <w:gridCol w:w="1000"/>
+        <w:gridCol w:w="1000"/>
+        <w:gridCol w:w="889"/>
+        <w:gridCol w:w="1756"/>
+        <w:gridCol w:w="1112"/>
       </w:tblGrid>
       <w:tr>
         <w:trPr>
@@ -2085,7 +1852,7 @@
         </w:trPr>
         <w:tc>
           <w:tcPr>
-            <w:tcW w:type="dxa" w:w="2270"/>
+            <w:tcW w:type="dxa" w:w="2523"/>
             <w:tcBorders>
               <w:top w:val="single" w:color="BFBFBF" w:sz="4"/>
               <w:left w:val="none" w:color="FFFFFF" w:sz="0"/>
@@ -2120,7 +1887,7 @@
         </w:tc>
         <w:tc>
           <w:tcPr>
-            <w:tcW w:type="dxa" w:w="640"/>
+            <w:tcW w:type="dxa" w:w="711"/>
             <w:tcBorders>
               <w:top w:val="single" w:color="BFBFBF" w:sz="4"/>
               <w:left w:val="none" w:color="FFFFFF" w:sz="0"/>
@@ -2155,7 +1922,7 @@
         </w:tc>
         <w:tc>
           <w:tcPr>
-            <w:tcW w:type="dxa" w:w="980"/>
+            <w:tcW w:type="dxa" w:w="1089"/>
             <w:tcBorders>
               <w:top w:val="single" w:color="BFBFBF" w:sz="4"/>
               <w:left w:val="none" w:color="FFFFFF" w:sz="0"/>
@@ -2190,7 +1957,7 @@
         </w:tc>
         <w:tc>
           <w:tcPr>
-            <w:tcW w:type="dxa" w:w="900"/>
+            <w:tcW w:type="dxa" w:w="1000"/>
             <w:tcBorders>
               <w:top w:val="single" w:color="BFBFBF" w:sz="4"/>
               <w:left w:val="none" w:color="FFFFFF" w:sz="0"/>
@@ -2225,7 +1992,7 @@
         </w:tc>
         <w:tc>
           <w:tcPr>
-            <w:tcW w:type="dxa" w:w="900"/>
+            <w:tcW w:type="dxa" w:w="1000"/>
             <w:tcBorders>
               <w:top w:val="single" w:color="BFBFBF" w:sz="4"/>
               <w:left w:val="none" w:color="FFFFFF" w:sz="0"/>
@@ -2260,7 +2027,7 @@
         </w:tc>
         <w:tc>
           <w:tcPr>
-            <w:tcW w:type="dxa" w:w="800"/>
+            <w:tcW w:type="dxa" w:w="889"/>
             <w:tcBorders>
               <w:top w:val="single" w:color="BFBFBF" w:sz="4"/>
               <w:left w:val="none" w:color="FFFFFF" w:sz="0"/>
@@ -2295,7 +2062,7 @@
         </w:tc>
         <w:tc>
           <w:tcPr>
-            <w:tcW w:type="dxa" w:w="1580"/>
+            <w:tcW w:type="dxa" w:w="1756"/>
             <w:tcBorders>
               <w:top w:val="single" w:color="BFBFBF" w:sz="4"/>
               <w:left w:val="none" w:color="FFFFFF" w:sz="0"/>
@@ -2330,7 +2097,7 @@
         </w:tc>
         <w:tc>
           <w:tcPr>
-            <w:tcW w:type="dxa" w:w="1000"/>
+            <w:tcW w:type="dxa" w:w="1112"/>
             <w:tcBorders>
               <w:top w:val="single" w:color="BFBFBF" w:sz="4"/>
               <w:left w:val="none" w:color="FFFFFF" w:sz="0"/>
@@ -2370,7 +2137,7 @@
         </w:trPr>
         <w:tc>
           <w:tcPr>
-            <w:tcW w:type="dxa" w:w="2270"/>
+            <w:tcW w:type="dxa" w:w="2523"/>
             <w:tcBorders>
               <w:top w:val="single" w:color="BFBFBF" w:sz="4"/>
               <w:left w:val="none" w:color="FFFFFF" w:sz="0"/>
@@ -2404,7 +2171,7 @@
         </w:tc>
         <w:tc>
           <w:tcPr>
-            <w:tcW w:type="dxa" w:w="640"/>
+            <w:tcW w:type="dxa" w:w="711"/>
             <w:tcBorders>
               <w:top w:val="single" w:color="BFBFBF" w:sz="4"/>
               <w:left w:val="none" w:color="FFFFFF" w:sz="0"/>
@@ -2438,7 +2205,7 @@
         </w:tc>
         <w:tc>
           <w:tcPr>
-            <w:tcW w:type="dxa" w:w="980"/>
+            <w:tcW w:type="dxa" w:w="1089"/>
             <w:tcBorders>
               <w:top w:val="single" w:color="BFBFBF" w:sz="4"/>
               <w:left w:val="none" w:color="FFFFFF" w:sz="0"/>
@@ -2472,7 +2239,7 @@
         </w:tc>
         <w:tc>
           <w:tcPr>
-            <w:tcW w:type="dxa" w:w="900"/>
+            <w:tcW w:type="dxa" w:w="1000"/>
             <w:tcBorders>
               <w:top w:val="single" w:color="BFBFBF" w:sz="4"/>
               <w:left w:val="none" w:color="FFFFFF" w:sz="0"/>
@@ -2506,7 +2273,7 @@
         </w:tc>
         <w:tc>
           <w:tcPr>
-            <w:tcW w:type="dxa" w:w="900"/>
+            <w:tcW w:type="dxa" w:w="1000"/>
             <w:tcBorders>
               <w:top w:val="single" w:color="BFBFBF" w:sz="4"/>
               <w:left w:val="none" w:color="FFFFFF" w:sz="0"/>
@@ -2540,7 +2307,7 @@
         </w:tc>
         <w:tc>
           <w:tcPr>
-            <w:tcW w:type="dxa" w:w="800"/>
+            <w:tcW w:type="dxa" w:w="889"/>
             <w:tcBorders>
               <w:top w:val="single" w:color="BFBFBF" w:sz="4"/>
               <w:left w:val="none" w:color="FFFFFF" w:sz="0"/>
@@ -2574,7 +2341,7 @@
         </w:tc>
         <w:tc>
           <w:tcPr>
-            <w:tcW w:type="dxa" w:w="1580"/>
+            <w:tcW w:type="dxa" w:w="1756"/>
             <w:tcBorders>
               <w:top w:val="single" w:color="BFBFBF" w:sz="4"/>
               <w:left w:val="none" w:color="FFFFFF" w:sz="0"/>
@@ -2608,7 +2375,7 @@
         </w:tc>
         <w:tc>
           <w:tcPr>
-            <w:tcW w:type="dxa" w:w="1000"/>
+            <w:tcW w:type="dxa" w:w="1112"/>
             <w:tcBorders>
               <w:top w:val="single" w:color="BFBFBF" w:sz="4"/>
               <w:left w:val="none" w:color="FFFFFF" w:sz="0"/>
@@ -2647,7 +2414,7 @@
         </w:trPr>
         <w:tc>
           <w:tcPr>
-            <w:tcW w:type="dxa" w:w="2270"/>
+            <w:tcW w:type="dxa" w:w="2523"/>
             <w:tcBorders>
               <w:top w:val="single" w:color="BFBFBF" w:sz="4"/>
               <w:left w:val="none" w:color="FFFFFF" w:sz="0"/>
@@ -2681,7 +2448,7 @@
         </w:tc>
         <w:tc>
           <w:tcPr>
-            <w:tcW w:type="dxa" w:w="640"/>
+            <w:tcW w:type="dxa" w:w="711"/>
             <w:tcBorders>
               <w:top w:val="single" w:color="BFBFBF" w:sz="4"/>
               <w:left w:val="none" w:color="FFFFFF" w:sz="0"/>
@@ -2715,7 +2482,7 @@
         </w:tc>
         <w:tc>
           <w:tcPr>
-            <w:tcW w:type="dxa" w:w="980"/>
+            <w:tcW w:type="dxa" w:w="1089"/>
             <w:tcBorders>
               <w:top w:val="single" w:color="BFBFBF" w:sz="4"/>
               <w:left w:val="none" w:color="FFFFFF" w:sz="0"/>
@@ -2749,7 +2516,7 @@
         </w:tc>
         <w:tc>
           <w:tcPr>
-            <w:tcW w:type="dxa" w:w="900"/>
+            <w:tcW w:type="dxa" w:w="1000"/>
             <w:tcBorders>
               <w:top w:val="single" w:color="BFBFBF" w:sz="4"/>
               <w:left w:val="none" w:color="FFFFFF" w:sz="0"/>
@@ -2783,7 +2550,7 @@
         </w:tc>
         <w:tc>
           <w:tcPr>
-            <w:tcW w:type="dxa" w:w="900"/>
+            <w:tcW w:type="dxa" w:w="1000"/>
             <w:tcBorders>
               <w:top w:val="single" w:color="BFBFBF" w:sz="4"/>
               <w:left w:val="none" w:color="FFFFFF" w:sz="0"/>
@@ -2817,7 +2584,7 @@
         </w:tc>
         <w:tc>
           <w:tcPr>
-            <w:tcW w:type="dxa" w:w="800"/>
+            <w:tcW w:type="dxa" w:w="889"/>
             <w:tcBorders>
               <w:top w:val="single" w:color="BFBFBF" w:sz="4"/>
               <w:left w:val="none" w:color="FFFFFF" w:sz="0"/>
@@ -2851,7 +2618,7 @@
         </w:tc>
         <w:tc>
           <w:tcPr>
-            <w:tcW w:type="dxa" w:w="1580"/>
+            <w:tcW w:type="dxa" w:w="1756"/>
             <w:tcBorders>
               <w:top w:val="single" w:color="BFBFBF" w:sz="4"/>
               <w:left w:val="none" w:color="FFFFFF" w:sz="0"/>
@@ -2885,7 +2652,7 @@
         </w:tc>
         <w:tc>
           <w:tcPr>
-            <w:tcW w:type="dxa" w:w="1000"/>
+            <w:tcW w:type="dxa" w:w="1112"/>
             <w:tcBorders>
               <w:top w:val="single" w:color="BFBFBF" w:sz="4"/>
               <w:left w:val="none" w:color="FFFFFF" w:sz="0"/>
@@ -2924,7 +2691,7 @@
         </w:trPr>
         <w:tc>
           <w:tcPr>
-            <w:tcW w:type="dxa" w:w="2270"/>
+            <w:tcW w:type="dxa" w:w="2523"/>
             <w:tcBorders>
               <w:top w:val="single" w:color="BFBFBF" w:sz="4"/>
               <w:left w:val="none" w:color="FFFFFF" w:sz="0"/>
@@ -2958,7 +2725,7 @@
         </w:tc>
         <w:tc>
           <w:tcPr>
-            <w:tcW w:type="dxa" w:w="640"/>
+            <w:tcW w:type="dxa" w:w="711"/>
             <w:tcBorders>
               <w:top w:val="single" w:color="BFBFBF" w:sz="4"/>
               <w:left w:val="none" w:color="FFFFFF" w:sz="0"/>
@@ -2992,7 +2759,7 @@
         </w:tc>
         <w:tc>
           <w:tcPr>
-            <w:tcW w:type="dxa" w:w="980"/>
+            <w:tcW w:type="dxa" w:w="1089"/>
             <w:tcBorders>
               <w:top w:val="single" w:color="BFBFBF" w:sz="4"/>
               <w:left w:val="none" w:color="FFFFFF" w:sz="0"/>
@@ -3026,7 +2793,7 @@
         </w:tc>
         <w:tc>
           <w:tcPr>
-            <w:tcW w:type="dxa" w:w="900"/>
+            <w:tcW w:type="dxa" w:w="1000"/>
             <w:tcBorders>
               <w:top w:val="single" w:color="BFBFBF" w:sz="4"/>
               <w:left w:val="none" w:color="FFFFFF" w:sz="0"/>
@@ -3060,7 +2827,7 @@
         </w:tc>
         <w:tc>
           <w:tcPr>
-            <w:tcW w:type="dxa" w:w="900"/>
+            <w:tcW w:type="dxa" w:w="1000"/>
             <w:tcBorders>
               <w:top w:val="single" w:color="BFBFBF" w:sz="4"/>
               <w:left w:val="none" w:color="FFFFFF" w:sz="0"/>
@@ -3094,7 +2861,7 @@
         </w:tc>
         <w:tc>
           <w:tcPr>
-            <w:tcW w:type="dxa" w:w="800"/>
+            <w:tcW w:type="dxa" w:w="889"/>
             <w:tcBorders>
               <w:top w:val="single" w:color="BFBFBF" w:sz="4"/>
               <w:left w:val="none" w:color="FFFFFF" w:sz="0"/>
@@ -3128,7 +2895,7 @@
         </w:tc>
         <w:tc>
           <w:tcPr>
-            <w:tcW w:type="dxa" w:w="1580"/>
+            <w:tcW w:type="dxa" w:w="1756"/>
             <w:tcBorders>
               <w:top w:val="single" w:color="BFBFBF" w:sz="4"/>
               <w:left w:val="none" w:color="FFFFFF" w:sz="0"/>
@@ -3162,7 +2929,7 @@
         </w:tc>
         <w:tc>
           <w:tcPr>
-            <w:tcW w:type="dxa" w:w="1000"/>
+            <w:tcW w:type="dxa" w:w="1112"/>
             <w:tcBorders>
               <w:top w:val="single" w:color="BFBFBF" w:sz="4"/>
               <w:left w:val="none" w:color="FFFFFF" w:sz="0"/>
@@ -3201,7 +2968,7 @@
         </w:trPr>
         <w:tc>
           <w:tcPr>
-            <w:tcW w:type="dxa" w:w="2270"/>
+            <w:tcW w:type="dxa" w:w="2523"/>
             <w:tcBorders>
               <w:top w:val="single" w:color="BFBFBF" w:sz="4"/>
               <w:left w:val="none" w:color="FFFFFF" w:sz="0"/>
@@ -3235,7 +3002,7 @@
         </w:tc>
         <w:tc>
           <w:tcPr>
-            <w:tcW w:type="dxa" w:w="640"/>
+            <w:tcW w:type="dxa" w:w="711"/>
             <w:tcBorders>
               <w:top w:val="single" w:color="BFBFBF" w:sz="4"/>
               <w:left w:val="none" w:color="FFFFFF" w:sz="0"/>
@@ -3269,7 +3036,7 @@
         </w:tc>
         <w:tc>
           <w:tcPr>
-            <w:tcW w:type="dxa" w:w="980"/>
+            <w:tcW w:type="dxa" w:w="1089"/>
             <w:tcBorders>
               <w:top w:val="single" w:color="BFBFBF" w:sz="4"/>
               <w:left w:val="none" w:color="FFFFFF" w:sz="0"/>
@@ -3303,7 +3070,7 @@
         </w:tc>
         <w:tc>
           <w:tcPr>
-            <w:tcW w:type="dxa" w:w="900"/>
+            <w:tcW w:type="dxa" w:w="1000"/>
             <w:tcBorders>
               <w:top w:val="single" w:color="BFBFBF" w:sz="4"/>
               <w:left w:val="none" w:color="FFFFFF" w:sz="0"/>
@@ -3337,7 +3104,7 @@
         </w:tc>
         <w:tc>
           <w:tcPr>
-            <w:tcW w:type="dxa" w:w="900"/>
+            <w:tcW w:type="dxa" w:w="1000"/>
             <w:tcBorders>
               <w:top w:val="single" w:color="BFBFBF" w:sz="4"/>
               <w:left w:val="none" w:color="FFFFFF" w:sz="0"/>
@@ -3371,7 +3138,7 @@
         </w:tc>
         <w:tc>
           <w:tcPr>
-            <w:tcW w:type="dxa" w:w="800"/>
+            <w:tcW w:type="dxa" w:w="889"/>
             <w:tcBorders>
               <w:top w:val="single" w:color="BFBFBF" w:sz="4"/>
               <w:left w:val="none" w:color="FFFFFF" w:sz="0"/>
@@ -3405,7 +3172,7 @@
         </w:tc>
         <w:tc>
           <w:tcPr>
-            <w:tcW w:type="dxa" w:w="1580"/>
+            <w:tcW w:type="dxa" w:w="1756"/>
             <w:tcBorders>
               <w:top w:val="single" w:color="BFBFBF" w:sz="4"/>
               <w:left w:val="none" w:color="FFFFFF" w:sz="0"/>
@@ -3439,7 +3206,7 @@
         </w:tc>
         <w:tc>
           <w:tcPr>
-            <w:tcW w:type="dxa" w:w="1000"/>
+            <w:tcW w:type="dxa" w:w="1112"/>
             <w:tcBorders>
               <w:top w:val="single" w:color="BFBFBF" w:sz="4"/>
               <w:left w:val="none" w:color="FFFFFF" w:sz="0"/>
@@ -3478,24 +3245,24 @@
         </w:trPr>
         <w:tc>
           <w:tcPr>
-            <w:tcW w:type="dxa" w:w="2270"/>
-            <w:tcBorders>
-              <w:top w:val="single" w:color="BFBFBF" w:sz="4"/>
-              <w:left w:val="none" w:color="FFFFFF" w:sz="0"/>
-              <w:bottom w:val="single" w:color="BFBFBF" w:sz="4"/>
-              <w:right w:val="none" w:color="FFFFFF" w:sz="0"/>
-            </w:tcBorders>
-            <w:tcMar>
-              <w:top w:type="dxa" w:w="40"/>
-              <w:left w:type="dxa" w:w="90"/>
-              <w:bottom w:type="dxa" w:w="40"/>
-              <w:right w:type="dxa" w:w="90"/>
-            </w:tcMar>
-            <w:vAlign w:val="center"/>
-          </w:tcPr>
-          <w:p>
-            <w:pPr>
-              <w:keepNext w:val="false"/>
+            <w:tcW w:type="dxa" w:w="2523"/>
+            <w:tcBorders>
+              <w:top w:val="single" w:color="BFBFBF" w:sz="4"/>
+              <w:left w:val="none" w:color="FFFFFF" w:sz="0"/>
+              <w:bottom w:val="single" w:color="BFBFBF" w:sz="4"/>
+              <w:right w:val="none" w:color="FFFFFF" w:sz="0"/>
+            </w:tcBorders>
+            <w:tcMar>
+              <w:top w:type="dxa" w:w="40"/>
+              <w:left w:type="dxa" w:w="90"/>
+              <w:bottom w:type="dxa" w:w="40"/>
+              <w:right w:type="dxa" w:w="90"/>
+            </w:tcMar>
+            <w:vAlign w:val="center"/>
+          </w:tcPr>
+          <w:p>
+            <w:pPr>
+              <w:keepNext/>
               <w:spacing w:after="0"/>
               <w:jc w:val="left"/>
             </w:pPr>
@@ -3512,24 +3279,24 @@
         </w:tc>
         <w:tc>
           <w:tcPr>
-            <w:tcW w:type="dxa" w:w="640"/>
-            <w:tcBorders>
-              <w:top w:val="single" w:color="BFBFBF" w:sz="4"/>
-              <w:left w:val="none" w:color="FFFFFF" w:sz="0"/>
-              <w:bottom w:val="single" w:color="BFBFBF" w:sz="4"/>
-              <w:right w:val="none" w:color="FFFFFF" w:sz="0"/>
-            </w:tcBorders>
-            <w:tcMar>
-              <w:top w:type="dxa" w:w="40"/>
-              <w:left w:type="dxa" w:w="90"/>
-              <w:bottom w:type="dxa" w:w="40"/>
-              <w:right w:type="dxa" w:w="90"/>
-            </w:tcMar>
-            <w:vAlign w:val="center"/>
-          </w:tcPr>
-          <w:p>
-            <w:pPr>
-              <w:keepNext w:val="false"/>
+            <w:tcW w:type="dxa" w:w="711"/>
+            <w:tcBorders>
+              <w:top w:val="single" w:color="BFBFBF" w:sz="4"/>
+              <w:left w:val="none" w:color="FFFFFF" w:sz="0"/>
+              <w:bottom w:val="single" w:color="BFBFBF" w:sz="4"/>
+              <w:right w:val="none" w:color="FFFFFF" w:sz="0"/>
+            </w:tcBorders>
+            <w:tcMar>
+              <w:top w:type="dxa" w:w="40"/>
+              <w:left w:type="dxa" w:w="90"/>
+              <w:bottom w:type="dxa" w:w="40"/>
+              <w:right w:type="dxa" w:w="90"/>
+            </w:tcMar>
+            <w:vAlign w:val="center"/>
+          </w:tcPr>
+          <w:p>
+            <w:pPr>
+              <w:keepNext/>
               <w:spacing w:after="0"/>
               <w:jc w:val="center"/>
             </w:pPr>
@@ -3546,24 +3313,24 @@
         </w:tc>
         <w:tc>
           <w:tcPr>
-            <w:tcW w:type="dxa" w:w="980"/>
-            <w:tcBorders>
-              <w:top w:val="single" w:color="BFBFBF" w:sz="4"/>
-              <w:left w:val="none" w:color="FFFFFF" w:sz="0"/>
-              <w:bottom w:val="single" w:color="BFBFBF" w:sz="4"/>
-              <w:right w:val="none" w:color="FFFFFF" w:sz="0"/>
-            </w:tcBorders>
-            <w:tcMar>
-              <w:top w:type="dxa" w:w="40"/>
-              <w:left w:type="dxa" w:w="90"/>
-              <w:bottom w:type="dxa" w:w="40"/>
-              <w:right w:type="dxa" w:w="90"/>
-            </w:tcMar>
-            <w:vAlign w:val="center"/>
-          </w:tcPr>
-          <w:p>
-            <w:pPr>
-              <w:keepNext w:val="false"/>
+            <w:tcW w:type="dxa" w:w="1089"/>
+            <w:tcBorders>
+              <w:top w:val="single" w:color="BFBFBF" w:sz="4"/>
+              <w:left w:val="none" w:color="FFFFFF" w:sz="0"/>
+              <w:bottom w:val="single" w:color="BFBFBF" w:sz="4"/>
+              <w:right w:val="none" w:color="FFFFFF" w:sz="0"/>
+            </w:tcBorders>
+            <w:tcMar>
+              <w:top w:type="dxa" w:w="40"/>
+              <w:left w:type="dxa" w:w="90"/>
+              <w:bottom w:type="dxa" w:w="40"/>
+              <w:right w:type="dxa" w:w="90"/>
+            </w:tcMar>
+            <w:vAlign w:val="center"/>
+          </w:tcPr>
+          <w:p>
+            <w:pPr>
+              <w:keepNext/>
               <w:spacing w:after="0"/>
               <w:jc w:val="center"/>
             </w:pPr>
@@ -3580,24 +3347,24 @@
         </w:tc>
         <w:tc>
           <w:tcPr>
-            <w:tcW w:type="dxa" w:w="900"/>
-            <w:tcBorders>
-              <w:top w:val="single" w:color="BFBFBF" w:sz="4"/>
-              <w:left w:val="none" w:color="FFFFFF" w:sz="0"/>
-              <w:bottom w:val="single" w:color="BFBFBF" w:sz="4"/>
-              <w:right w:val="none" w:color="FFFFFF" w:sz="0"/>
-            </w:tcBorders>
-            <w:tcMar>
-              <w:top w:type="dxa" w:w="40"/>
-              <w:left w:type="dxa" w:w="90"/>
-              <w:bottom w:type="dxa" w:w="40"/>
-              <w:right w:type="dxa" w:w="90"/>
-            </w:tcMar>
-            <w:vAlign w:val="center"/>
-          </w:tcPr>
-          <w:p>
-            <w:pPr>
-              <w:keepNext w:val="false"/>
+            <w:tcW w:type="dxa" w:w="1000"/>
+            <w:tcBorders>
+              <w:top w:val="single" w:color="BFBFBF" w:sz="4"/>
+              <w:left w:val="none" w:color="FFFFFF" w:sz="0"/>
+              <w:bottom w:val="single" w:color="BFBFBF" w:sz="4"/>
+              <w:right w:val="none" w:color="FFFFFF" w:sz="0"/>
+            </w:tcBorders>
+            <w:tcMar>
+              <w:top w:type="dxa" w:w="40"/>
+              <w:left w:type="dxa" w:w="90"/>
+              <w:bottom w:type="dxa" w:w="40"/>
+              <w:right w:type="dxa" w:w="90"/>
+            </w:tcMar>
+            <w:vAlign w:val="center"/>
+          </w:tcPr>
+          <w:p>
+            <w:pPr>
+              <w:keepNext/>
               <w:spacing w:after="0"/>
               <w:jc w:val="center"/>
             </w:pPr>
@@ -3614,24 +3381,24 @@
         </w:tc>
         <w:tc>
           <w:tcPr>
-            <w:tcW w:type="dxa" w:w="900"/>
-            <w:tcBorders>
-              <w:top w:val="single" w:color="BFBFBF" w:sz="4"/>
-              <w:left w:val="none" w:color="FFFFFF" w:sz="0"/>
-              <w:bottom w:val="single" w:color="BFBFBF" w:sz="4"/>
-              <w:right w:val="none" w:color="FFFFFF" w:sz="0"/>
-            </w:tcBorders>
-            <w:tcMar>
-              <w:top w:type="dxa" w:w="40"/>
-              <w:left w:type="dxa" w:w="90"/>
-              <w:bottom w:type="dxa" w:w="40"/>
-              <w:right w:type="dxa" w:w="90"/>
-            </w:tcMar>
-            <w:vAlign w:val="center"/>
-          </w:tcPr>
-          <w:p>
-            <w:pPr>
-              <w:keepNext w:val="false"/>
+            <w:tcW w:type="dxa" w:w="1000"/>
+            <w:tcBorders>
+              <w:top w:val="single" w:color="BFBFBF" w:sz="4"/>
+              <w:left w:val="none" w:color="FFFFFF" w:sz="0"/>
+              <w:bottom w:val="single" w:color="BFBFBF" w:sz="4"/>
+              <w:right w:val="none" w:color="FFFFFF" w:sz="0"/>
+            </w:tcBorders>
+            <w:tcMar>
+              <w:top w:type="dxa" w:w="40"/>
+              <w:left w:type="dxa" w:w="90"/>
+              <w:bottom w:type="dxa" w:w="40"/>
+              <w:right w:type="dxa" w:w="90"/>
+            </w:tcMar>
+            <w:vAlign w:val="center"/>
+          </w:tcPr>
+          <w:p>
+            <w:pPr>
+              <w:keepNext/>
               <w:spacing w:after="0"/>
               <w:jc w:val="center"/>
             </w:pPr>
@@ -3648,24 +3415,24 @@
         </w:tc>
         <w:tc>
           <w:tcPr>
-            <w:tcW w:type="dxa" w:w="800"/>
-            <w:tcBorders>
-              <w:top w:val="single" w:color="BFBFBF" w:sz="4"/>
-              <w:left w:val="none" w:color="FFFFFF" w:sz="0"/>
-              <w:bottom w:val="single" w:color="BFBFBF" w:sz="4"/>
-              <w:right w:val="none" w:color="FFFFFF" w:sz="0"/>
-            </w:tcBorders>
-            <w:tcMar>
-              <w:top w:type="dxa" w:w="40"/>
-              <w:left w:type="dxa" w:w="90"/>
-              <w:bottom w:type="dxa" w:w="40"/>
-              <w:right w:type="dxa" w:w="90"/>
-            </w:tcMar>
-            <w:vAlign w:val="center"/>
-          </w:tcPr>
-          <w:p>
-            <w:pPr>
-              <w:keepNext w:val="false"/>
+            <w:tcW w:type="dxa" w:w="889"/>
+            <w:tcBorders>
+              <w:top w:val="single" w:color="BFBFBF" w:sz="4"/>
+              <w:left w:val="none" w:color="FFFFFF" w:sz="0"/>
+              <w:bottom w:val="single" w:color="BFBFBF" w:sz="4"/>
+              <w:right w:val="none" w:color="FFFFFF" w:sz="0"/>
+            </w:tcBorders>
+            <w:tcMar>
+              <w:top w:type="dxa" w:w="40"/>
+              <w:left w:type="dxa" w:w="90"/>
+              <w:bottom w:type="dxa" w:w="40"/>
+              <w:right w:type="dxa" w:w="90"/>
+            </w:tcMar>
+            <w:vAlign w:val="center"/>
+          </w:tcPr>
+          <w:p>
+            <w:pPr>
+              <w:keepNext/>
               <w:spacing w:after="0"/>
               <w:jc w:val="center"/>
             </w:pPr>
@@ -3682,24 +3449,24 @@
         </w:tc>
         <w:tc>
           <w:tcPr>
-            <w:tcW w:type="dxa" w:w="1580"/>
-            <w:tcBorders>
-              <w:top w:val="single" w:color="BFBFBF" w:sz="4"/>
-              <w:left w:val="none" w:color="FFFFFF" w:sz="0"/>
-              <w:bottom w:val="single" w:color="BFBFBF" w:sz="4"/>
-              <w:right w:val="none" w:color="FFFFFF" w:sz="0"/>
-            </w:tcBorders>
-            <w:tcMar>
-              <w:top w:type="dxa" w:w="40"/>
-              <w:left w:type="dxa" w:w="90"/>
-              <w:bottom w:type="dxa" w:w="40"/>
-              <w:right w:type="dxa" w:w="90"/>
-            </w:tcMar>
-            <w:vAlign w:val="center"/>
-          </w:tcPr>
-          <w:p>
-            <w:pPr>
-              <w:keepNext w:val="false"/>
+            <w:tcW w:type="dxa" w:w="1756"/>
+            <w:tcBorders>
+              <w:top w:val="single" w:color="BFBFBF" w:sz="4"/>
+              <w:left w:val="none" w:color="FFFFFF" w:sz="0"/>
+              <w:bottom w:val="single" w:color="BFBFBF" w:sz="4"/>
+              <w:right w:val="none" w:color="FFFFFF" w:sz="0"/>
+            </w:tcBorders>
+            <w:tcMar>
+              <w:top w:type="dxa" w:w="40"/>
+              <w:left w:type="dxa" w:w="90"/>
+              <w:bottom w:type="dxa" w:w="40"/>
+              <w:right w:type="dxa" w:w="90"/>
+            </w:tcMar>
+            <w:vAlign w:val="center"/>
+          </w:tcPr>
+          <w:p>
+            <w:pPr>
+              <w:keepNext/>
               <w:spacing w:after="0"/>
               <w:jc w:val="center"/>
             </w:pPr>
@@ -3716,24 +3483,24 @@
         </w:tc>
         <w:tc>
           <w:tcPr>
-            <w:tcW w:type="dxa" w:w="1000"/>
-            <w:tcBorders>
-              <w:top w:val="single" w:color="BFBFBF" w:sz="4"/>
-              <w:left w:val="none" w:color="FFFFFF" w:sz="0"/>
-              <w:bottom w:val="single" w:color="BFBFBF" w:sz="4"/>
-              <w:right w:val="none" w:color="FFFFFF" w:sz="0"/>
-            </w:tcBorders>
-            <w:tcMar>
-              <w:top w:type="dxa" w:w="40"/>
-              <w:left w:type="dxa" w:w="90"/>
-              <w:bottom w:type="dxa" w:w="40"/>
-              <w:right w:type="dxa" w:w="90"/>
-            </w:tcMar>
-            <w:vAlign w:val="center"/>
-          </w:tcPr>
-          <w:p>
-            <w:pPr>
-              <w:keepNext w:val="false"/>
+            <w:tcW w:type="dxa" w:w="1112"/>
+            <w:tcBorders>
+              <w:top w:val="single" w:color="BFBFBF" w:sz="4"/>
+              <w:left w:val="none" w:color="FFFFFF" w:sz="0"/>
+              <w:bottom w:val="single" w:color="BFBFBF" w:sz="4"/>
+              <w:right w:val="none" w:color="FFFFFF" w:sz="0"/>
+            </w:tcBorders>
+            <w:tcMar>
+              <w:top w:type="dxa" w:w="40"/>
+              <w:left w:type="dxa" w:w="90"/>
+              <w:bottom w:type="dxa" w:w="40"/>
+              <w:right w:type="dxa" w:w="90"/>
+            </w:tcMar>
+            <w:vAlign w:val="center"/>
+          </w:tcPr>
+          <w:p>
+            <w:pPr>
+              <w:keepNext/>
               <w:spacing w:after="0"/>
               <w:jc w:val="center"/>
             </w:pPr>
@@ -3800,7 +3567,7 @@
     </w:p>
     <w:tbl>
       <w:tblPr>
-        <w:tblW w:type="dxa" w:w="9070"/>
+        <w:tblW w:type="dxa" w:w="10080"/>
         <w:jc w:val="center"/>
         <w:tblBorders>
           <w:top w:val="single" w:color="auto" w:sz="4"/>
@@ -3812,9 +3579,9 @@
         </w:tblBorders>
       </w:tblPr>
       <w:tblGrid>
-        <w:gridCol w:w="3070"/>
-        <w:gridCol w:w="3000"/>
-        <w:gridCol w:w="3000"/>
+        <w:gridCol w:w="3412"/>
+        <w:gridCol w:w="3334"/>
+        <w:gridCol w:w="3334"/>
       </w:tblGrid>
       <w:tr>
         <w:trPr>
@@ -3822,7 +3589,7 @@
         </w:trPr>
         <w:tc>
           <w:tcPr>
-            <w:tcW w:type="dxa" w:w="3070"/>
+            <w:tcW w:type="dxa" w:w="3412"/>
             <w:tcBorders>
               <w:top w:val="single" w:color="BFBFBF" w:sz="4"/>
               <w:left w:val="none" w:color="FFFFFF" w:sz="0"/>
@@ -3857,7 +3624,7 @@
         </w:tc>
         <w:tc>
           <w:tcPr>
-            <w:tcW w:type="dxa" w:w="3000"/>
+            <w:tcW w:type="dxa" w:w="3334"/>
             <w:tcBorders>
               <w:top w:val="single" w:color="BFBFBF" w:sz="4"/>
               <w:left w:val="none" w:color="FFFFFF" w:sz="0"/>
@@ -3892,7 +3659,7 @@
         </w:tc>
         <w:tc>
           <w:tcPr>
-            <w:tcW w:type="dxa" w:w="3000"/>
+            <w:tcW w:type="dxa" w:w="3334"/>
             <w:tcBorders>
               <w:top w:val="single" w:color="BFBFBF" w:sz="4"/>
               <w:left w:val="none" w:color="FFFFFF" w:sz="0"/>
@@ -3932,7 +3699,7 @@
         </w:trPr>
         <w:tc>
           <w:tcPr>
-            <w:tcW w:type="dxa" w:w="3070"/>
+            <w:tcW w:type="dxa" w:w="3412"/>
             <w:tcBorders>
               <w:top w:val="single" w:color="BFBFBF" w:sz="4"/>
               <w:left w:val="none" w:color="FFFFFF" w:sz="0"/>
@@ -3966,7 +3733,7 @@
         </w:tc>
         <w:tc>
           <w:tcPr>
-            <w:tcW w:type="dxa" w:w="3000"/>
+            <w:tcW w:type="dxa" w:w="3334"/>
             <w:tcBorders>
               <w:top w:val="single" w:color="BFBFBF" w:sz="4"/>
               <w:left w:val="none" w:color="FFFFFF" w:sz="0"/>
@@ -4000,7 +3767,7 @@
         </w:tc>
         <w:tc>
           <w:tcPr>
-            <w:tcW w:type="dxa" w:w="3000"/>
+            <w:tcW w:type="dxa" w:w="3334"/>
             <w:tcBorders>
               <w:top w:val="single" w:color="BFBFBF" w:sz="4"/>
               <w:left w:val="none" w:color="FFFFFF" w:sz="0"/>
@@ -4039,7 +3806,7 @@
         </w:trPr>
         <w:tc>
           <w:tcPr>
-            <w:tcW w:type="dxa" w:w="3070"/>
+            <w:tcW w:type="dxa" w:w="3412"/>
             <w:tcBorders>
               <w:top w:val="single" w:color="BFBFBF" w:sz="4"/>
               <w:left w:val="none" w:color="FFFFFF" w:sz="0"/>
@@ -4073,7 +3840,7 @@
         </w:tc>
         <w:tc>
           <w:tcPr>
-            <w:tcW w:type="dxa" w:w="3000"/>
+            <w:tcW w:type="dxa" w:w="3334"/>
             <w:tcBorders>
               <w:top w:val="single" w:color="BFBFBF" w:sz="4"/>
               <w:left w:val="none" w:color="FFFFFF" w:sz="0"/>
@@ -4107,7 +3874,7 @@
         </w:tc>
         <w:tc>
           <w:tcPr>
-            <w:tcW w:type="dxa" w:w="3000"/>
+            <w:tcW w:type="dxa" w:w="3334"/>
             <w:tcBorders>
               <w:top w:val="single" w:color="BFBFBF" w:sz="4"/>
               <w:left w:val="none" w:color="FFFFFF" w:sz="0"/>
@@ -4146,7 +3913,7 @@
         </w:trPr>
         <w:tc>
           <w:tcPr>
-            <w:tcW w:type="dxa" w:w="3070"/>
+            <w:tcW w:type="dxa" w:w="3412"/>
             <w:tcBorders>
               <w:top w:val="single" w:color="BFBFBF" w:sz="4"/>
               <w:left w:val="none" w:color="FFFFFF" w:sz="0"/>
@@ -4180,7 +3947,7 @@
         </w:tc>
         <w:tc>
           <w:tcPr>
-            <w:tcW w:type="dxa" w:w="3000"/>
+            <w:tcW w:type="dxa" w:w="3334"/>
             <w:tcBorders>
               <w:top w:val="single" w:color="BFBFBF" w:sz="4"/>
               <w:left w:val="none" w:color="FFFFFF" w:sz="0"/>
@@ -4214,7 +3981,7 @@
         </w:tc>
         <w:tc>
           <w:tcPr>
-            <w:tcW w:type="dxa" w:w="3000"/>
+            <w:tcW w:type="dxa" w:w="3334"/>
             <w:tcBorders>
               <w:top w:val="single" w:color="BFBFBF" w:sz="4"/>
               <w:left w:val="none" w:color="FFFFFF" w:sz="0"/>
@@ -4253,7 +4020,7 @@
         </w:trPr>
         <w:tc>
           <w:tcPr>
-            <w:tcW w:type="dxa" w:w="3070"/>
+            <w:tcW w:type="dxa" w:w="3412"/>
             <w:tcBorders>
               <w:top w:val="single" w:color="BFBFBF" w:sz="4"/>
               <w:left w:val="none" w:color="FFFFFF" w:sz="0"/>
@@ -4287,7 +4054,7 @@
         </w:tc>
         <w:tc>
           <w:tcPr>
-            <w:tcW w:type="dxa" w:w="3000"/>
+            <w:tcW w:type="dxa" w:w="3334"/>
             <w:tcBorders>
               <w:top w:val="single" w:color="BFBFBF" w:sz="4"/>
               <w:left w:val="none" w:color="FFFFFF" w:sz="0"/>
@@ -4321,7 +4088,7 @@
         </w:tc>
         <w:tc>
           <w:tcPr>
-            <w:tcW w:type="dxa" w:w="3000"/>
+            <w:tcW w:type="dxa" w:w="3334"/>
             <w:tcBorders>
               <w:top w:val="single" w:color="BFBFBF" w:sz="4"/>
               <w:left w:val="none" w:color="FFFFFF" w:sz="0"/>
@@ -4360,24 +4127,24 @@
         </w:trPr>
         <w:tc>
           <w:tcPr>
-            <w:tcW w:type="dxa" w:w="3070"/>
-            <w:tcBorders>
-              <w:top w:val="single" w:color="BFBFBF" w:sz="4"/>
-              <w:left w:val="none" w:color="FFFFFF" w:sz="0"/>
-              <w:bottom w:val="single" w:color="BFBFBF" w:sz="4"/>
-              <w:right w:val="none" w:color="FFFFFF" w:sz="0"/>
-            </w:tcBorders>
-            <w:tcMar>
-              <w:top w:type="dxa" w:w="40"/>
-              <w:left w:type="dxa" w:w="90"/>
-              <w:bottom w:type="dxa" w:w="40"/>
-              <w:right w:type="dxa" w:w="90"/>
-            </w:tcMar>
-            <w:vAlign w:val="center"/>
-          </w:tcPr>
-          <w:p>
-            <w:pPr>
-              <w:keepNext w:val="false"/>
+            <w:tcW w:type="dxa" w:w="3412"/>
+            <w:tcBorders>
+              <w:top w:val="single" w:color="BFBFBF" w:sz="4"/>
+              <w:left w:val="none" w:color="FFFFFF" w:sz="0"/>
+              <w:bottom w:val="single" w:color="BFBFBF" w:sz="4"/>
+              <w:right w:val="none" w:color="FFFFFF" w:sz="0"/>
+            </w:tcBorders>
+            <w:tcMar>
+              <w:top w:type="dxa" w:w="40"/>
+              <w:left w:type="dxa" w:w="90"/>
+              <w:bottom w:type="dxa" w:w="40"/>
+              <w:right w:type="dxa" w:w="90"/>
+            </w:tcMar>
+            <w:vAlign w:val="center"/>
+          </w:tcPr>
+          <w:p>
+            <w:pPr>
+              <w:keepNext/>
               <w:spacing w:after="0"/>
               <w:jc w:val="left"/>
             </w:pPr>
@@ -4394,24 +4161,24 @@
         </w:tc>
         <w:tc>
           <w:tcPr>
-            <w:tcW w:type="dxa" w:w="3000"/>
-            <w:tcBorders>
-              <w:top w:val="single" w:color="BFBFBF" w:sz="4"/>
-              <w:left w:val="none" w:color="FFFFFF" w:sz="0"/>
-              <w:bottom w:val="single" w:color="BFBFBF" w:sz="4"/>
-              <w:right w:val="none" w:color="FFFFFF" w:sz="0"/>
-            </w:tcBorders>
-            <w:tcMar>
-              <w:top w:type="dxa" w:w="40"/>
-              <w:left w:type="dxa" w:w="90"/>
-              <w:bottom w:type="dxa" w:w="40"/>
-              <w:right w:type="dxa" w:w="90"/>
-            </w:tcMar>
-            <w:vAlign w:val="center"/>
-          </w:tcPr>
-          <w:p>
-            <w:pPr>
-              <w:keepNext w:val="false"/>
+            <w:tcW w:type="dxa" w:w="3334"/>
+            <w:tcBorders>
+              <w:top w:val="single" w:color="BFBFBF" w:sz="4"/>
+              <w:left w:val="none" w:color="FFFFFF" w:sz="0"/>
+              <w:bottom w:val="single" w:color="BFBFBF" w:sz="4"/>
+              <w:right w:val="none" w:color="FFFFFF" w:sz="0"/>
+            </w:tcBorders>
+            <w:tcMar>
+              <w:top w:type="dxa" w:w="40"/>
+              <w:left w:type="dxa" w:w="90"/>
+              <w:bottom w:type="dxa" w:w="40"/>
+              <w:right w:type="dxa" w:w="90"/>
+            </w:tcMar>
+            <w:vAlign w:val="center"/>
+          </w:tcPr>
+          <w:p>
+            <w:pPr>
+              <w:keepNext/>
               <w:spacing w:after="0"/>
               <w:jc w:val="center"/>
             </w:pPr>
@@ -4428,24 +4195,24 @@
         </w:tc>
         <w:tc>
           <w:tcPr>
-            <w:tcW w:type="dxa" w:w="3000"/>
-            <w:tcBorders>
-              <w:top w:val="single" w:color="BFBFBF" w:sz="4"/>
-              <w:left w:val="none" w:color="FFFFFF" w:sz="0"/>
-              <w:bottom w:val="single" w:color="BFBFBF" w:sz="4"/>
-              <w:right w:val="none" w:color="FFFFFF" w:sz="0"/>
-            </w:tcBorders>
-            <w:tcMar>
-              <w:top w:type="dxa" w:w="40"/>
-              <w:left w:type="dxa" w:w="90"/>
-              <w:bottom w:type="dxa" w:w="40"/>
-              <w:right w:type="dxa" w:w="90"/>
-            </w:tcMar>
-            <w:vAlign w:val="center"/>
-          </w:tcPr>
-          <w:p>
-            <w:pPr>
-              <w:keepNext w:val="false"/>
+            <w:tcW w:type="dxa" w:w="3334"/>
+            <w:tcBorders>
+              <w:top w:val="single" w:color="BFBFBF" w:sz="4"/>
+              <w:left w:val="none" w:color="FFFFFF" w:sz="0"/>
+              <w:bottom w:val="single" w:color="BFBFBF" w:sz="4"/>
+              <w:right w:val="none" w:color="FFFFFF" w:sz="0"/>
+            </w:tcBorders>
+            <w:tcMar>
+              <w:top w:type="dxa" w:w="40"/>
+              <w:left w:type="dxa" w:w="90"/>
+              <w:bottom w:type="dxa" w:w="40"/>
+              <w:right w:type="dxa" w:w="90"/>
+            </w:tcMar>
+            <w:vAlign w:val="center"/>
+          </w:tcPr>
+          <w:p>
+            <w:pPr>
+              <w:keepNext/>
               <w:spacing w:after="0"/>
               <w:jc w:val="center"/>
             </w:pPr>
@@ -4486,7 +4253,7 @@
       <w:r>
         <w:drawing>
           <wp:inline distT="0" distB="0" distL="0" distR="0">
-            <wp:extent cx="5762625" cy="1762125"/>
+            <wp:extent cx="6286500" cy="1924050"/>
             <wp:effectExtent t="0" r="0" b="0" l="0"/>
             <wp:docPr id="1" name="" descr="" title=""/>
             <wp:cNvGraphicFramePr>
@@ -4502,7 +4269,7 @@
                     </pic:cNvPicPr>
                   </pic:nvPicPr>
                   <pic:blipFill>
-                    <a:blip r:embed="rId8" cstate="none"/>
+                    <a:blip r:embed="rId12" cstate="none"/>
                     <a:srcRect/>
                     <a:stretch>
                       <a:fillRect/>
@@ -4511,7 +4278,7 @@
                   <pic:spPr bwMode="auto">
                     <a:xfrm>
                       <a:off x="0" y="0"/>
-                      <a:ext cx="5762625" cy="1762125"/>
+                      <a:ext cx="6286500" cy="1924050"/>
                     </a:xfrm>
                     <a:prstGeom prst="rect">
                       <a:avLst/>
@@ -4548,7 +4315,7 @@
       <w:r>
         <w:drawing>
           <wp:inline distT="0" distB="0" distL="0" distR="0">
-            <wp:extent cx="5143500" cy="3543300"/>
+            <wp:extent cx="5334000" cy="3667125"/>
             <wp:effectExtent t="0" r="0" b="0" l="0"/>
             <wp:docPr id="1" name="" descr="" title=""/>
             <wp:cNvGraphicFramePr>
@@ -4564,7 +4331,7 @@
                     </pic:cNvPicPr>
                   </pic:nvPicPr>
                   <pic:blipFill>
-                    <a:blip r:embed="rId9" cstate="none"/>
+                    <a:blip r:embed="rId13" cstate="none"/>
                     <a:srcRect/>
                     <a:stretch>
                       <a:fillRect/>
@@ -4573,7 +4340,7 @@
                   <pic:spPr bwMode="auto">
                     <a:xfrm>
                       <a:off x="0" y="0"/>
-                      <a:ext cx="5143500" cy="3543300"/>
+                      <a:ext cx="5334000" cy="3667125"/>
                     </a:xfrm>
                     <a:prstGeom prst="rect">
                       <a:avLst/>
@@ -4682,7 +4449,7 @@
     </w:p>
     <w:tbl>
       <w:tblPr>
-        <w:tblW w:type="dxa" w:w="9070"/>
+        <w:tblW w:type="dxa" w:w="10080"/>
         <w:jc w:val="center"/>
         <w:tblBorders>
           <w:top w:val="single" w:color="auto" w:sz="4"/>
@@ -4694,11 +4461,11 @@
         </w:tblBorders>
       </w:tblPr>
       <w:tblGrid>
-        <w:gridCol w:w="3370"/>
-        <w:gridCol w:w="900"/>
-        <w:gridCol w:w="1300"/>
-        <w:gridCol w:w="2100"/>
-        <w:gridCol w:w="1400"/>
+        <w:gridCol w:w="3745"/>
+        <w:gridCol w:w="1000"/>
+        <w:gridCol w:w="1445"/>
+        <w:gridCol w:w="2334"/>
+        <w:gridCol w:w="1556"/>
       </w:tblGrid>
       <w:tr>
         <w:trPr>
@@ -4706,7 +4473,7 @@
         </w:trPr>
         <w:tc>
           <w:tcPr>
-            <w:tcW w:type="dxa" w:w="3370"/>
+            <w:tcW w:type="dxa" w:w="3745"/>
             <w:tcBorders>
               <w:top w:val="single" w:color="BFBFBF" w:sz="4"/>
               <w:left w:val="none" w:color="FFFFFF" w:sz="0"/>
@@ -4741,7 +4508,7 @@
         </w:tc>
         <w:tc>
           <w:tcPr>
-            <w:tcW w:type="dxa" w:w="900"/>
+            <w:tcW w:type="dxa" w:w="1000"/>
             <w:tcBorders>
               <w:top w:val="single" w:color="BFBFBF" w:sz="4"/>
               <w:left w:val="none" w:color="FFFFFF" w:sz="0"/>
@@ -4776,7 +4543,7 @@
         </w:tc>
         <w:tc>
           <w:tcPr>
-            <w:tcW w:type="dxa" w:w="1300"/>
+            <w:tcW w:type="dxa" w:w="1445"/>
             <w:tcBorders>
               <w:top w:val="single" w:color="BFBFBF" w:sz="4"/>
               <w:left w:val="none" w:color="FFFFFF" w:sz="0"/>
@@ -4811,7 +4578,7 @@
         </w:tc>
         <w:tc>
           <w:tcPr>
-            <w:tcW w:type="dxa" w:w="2100"/>
+            <w:tcW w:type="dxa" w:w="2334"/>
             <w:tcBorders>
               <w:top w:val="single" w:color="BFBFBF" w:sz="4"/>
               <w:left w:val="none" w:color="FFFFFF" w:sz="0"/>
@@ -4846,7 +4613,7 @@
         </w:tc>
         <w:tc>
           <w:tcPr>
-            <w:tcW w:type="dxa" w:w="1400"/>
+            <w:tcW w:type="dxa" w:w="1556"/>
             <w:tcBorders>
               <w:top w:val="single" w:color="BFBFBF" w:sz="4"/>
               <w:left w:val="none" w:color="FFFFFF" w:sz="0"/>
@@ -4886,7 +4653,7 @@
         </w:trPr>
         <w:tc>
           <w:tcPr>
-            <w:tcW w:type="dxa" w:w="3370"/>
+            <w:tcW w:type="dxa" w:w="3745"/>
             <w:tcBorders>
               <w:top w:val="single" w:color="BFBFBF" w:sz="4"/>
               <w:left w:val="none" w:color="FFFFFF" w:sz="0"/>
@@ -4920,7 +4687,7 @@
         </w:tc>
         <w:tc>
           <w:tcPr>
-            <w:tcW w:type="dxa" w:w="900"/>
+            <w:tcW w:type="dxa" w:w="1000"/>
             <w:tcBorders>
               <w:top w:val="single" w:color="BFBFBF" w:sz="4"/>
               <w:left w:val="none" w:color="FFFFFF" w:sz="0"/>
@@ -4954,7 +4721,7 @@
         </w:tc>
         <w:tc>
           <w:tcPr>
-            <w:tcW w:type="dxa" w:w="1300"/>
+            <w:tcW w:type="dxa" w:w="1445"/>
             <w:tcBorders>
               <w:top w:val="single" w:color="BFBFBF" w:sz="4"/>
               <w:left w:val="none" w:color="FFFFFF" w:sz="0"/>
@@ -4988,7 +4755,7 @@
         </w:tc>
         <w:tc>
           <w:tcPr>
-            <w:tcW w:type="dxa" w:w="2100"/>
+            <w:tcW w:type="dxa" w:w="2334"/>
             <w:tcBorders>
               <w:top w:val="single" w:color="BFBFBF" w:sz="4"/>
               <w:left w:val="none" w:color="FFFFFF" w:sz="0"/>
@@ -5022,7 +4789,7 @@
         </w:tc>
         <w:tc>
           <w:tcPr>
-            <w:tcW w:type="dxa" w:w="1400"/>
+            <w:tcW w:type="dxa" w:w="1556"/>
             <w:tcBorders>
               <w:top w:val="single" w:color="BFBFBF" w:sz="4"/>
               <w:left w:val="none" w:color="FFFFFF" w:sz="0"/>
@@ -5061,7 +4828,7 @@
         </w:trPr>
         <w:tc>
           <w:tcPr>
-            <w:tcW w:type="dxa" w:w="3370"/>
+            <w:tcW w:type="dxa" w:w="3745"/>
             <w:tcBorders>
               <w:top w:val="single" w:color="BFBFBF" w:sz="4"/>
               <w:left w:val="none" w:color="FFFFFF" w:sz="0"/>
@@ -5095,7 +4862,7 @@
         </w:tc>
         <w:tc>
           <w:tcPr>
-            <w:tcW w:type="dxa" w:w="900"/>
+            <w:tcW w:type="dxa" w:w="1000"/>
             <w:tcBorders>
               <w:top w:val="single" w:color="BFBFBF" w:sz="4"/>
               <w:left w:val="none" w:color="FFFFFF" w:sz="0"/>
@@ -5129,7 +4896,7 @@
         </w:tc>
         <w:tc>
           <w:tcPr>
-            <w:tcW w:type="dxa" w:w="1300"/>
+            <w:tcW w:type="dxa" w:w="1445"/>
             <w:tcBorders>
               <w:top w:val="single" w:color="BFBFBF" w:sz="4"/>
               <w:left w:val="none" w:color="FFFFFF" w:sz="0"/>
@@ -5163,7 +4930,7 @@
         </w:tc>
         <w:tc>
           <w:tcPr>
-            <w:tcW w:type="dxa" w:w="2100"/>
+            <w:tcW w:type="dxa" w:w="2334"/>
             <w:tcBorders>
               <w:top w:val="single" w:color="BFBFBF" w:sz="4"/>
               <w:left w:val="none" w:color="FFFFFF" w:sz="0"/>
@@ -5197,7 +4964,7 @@
         </w:tc>
         <w:tc>
           <w:tcPr>
-            <w:tcW w:type="dxa" w:w="1400"/>
+            <w:tcW w:type="dxa" w:w="1556"/>
             <w:tcBorders>
               <w:top w:val="single" w:color="BFBFBF" w:sz="4"/>
               <w:left w:val="none" w:color="FFFFFF" w:sz="0"/>
@@ -5236,7 +5003,7 @@
         </w:trPr>
         <w:tc>
           <w:tcPr>
-            <w:tcW w:type="dxa" w:w="3370"/>
+            <w:tcW w:type="dxa" w:w="3745"/>
             <w:tcBorders>
               <w:top w:val="single" w:color="BFBFBF" w:sz="4"/>
               <w:left w:val="none" w:color="FFFFFF" w:sz="0"/>
@@ -5270,7 +5037,7 @@
         </w:tc>
         <w:tc>
           <w:tcPr>
-            <w:tcW w:type="dxa" w:w="900"/>
+            <w:tcW w:type="dxa" w:w="1000"/>
             <w:tcBorders>
               <w:top w:val="single" w:color="BFBFBF" w:sz="4"/>
               <w:left w:val="none" w:color="FFFFFF" w:sz="0"/>
@@ -5304,7 +5071,7 @@
         </w:tc>
         <w:tc>
           <w:tcPr>
-            <w:tcW w:type="dxa" w:w="1300"/>
+            <w:tcW w:type="dxa" w:w="1445"/>
             <w:tcBorders>
               <w:top w:val="single" w:color="BFBFBF" w:sz="4"/>
               <w:left w:val="none" w:color="FFFFFF" w:sz="0"/>
@@ -5338,7 +5105,7 @@
         </w:tc>
         <w:tc>
           <w:tcPr>
-            <w:tcW w:type="dxa" w:w="2100"/>
+            <w:tcW w:type="dxa" w:w="2334"/>
             <w:tcBorders>
               <w:top w:val="single" w:color="BFBFBF" w:sz="4"/>
               <w:left w:val="none" w:color="FFFFFF" w:sz="0"/>
@@ -5372,7 +5139,7 @@
         </w:tc>
         <w:tc>
           <w:tcPr>
-            <w:tcW w:type="dxa" w:w="1400"/>
+            <w:tcW w:type="dxa" w:w="1556"/>
             <w:tcBorders>
               <w:top w:val="single" w:color="BFBFBF" w:sz="4"/>
               <w:left w:val="none" w:color="FFFFFF" w:sz="0"/>
@@ -5411,24 +5178,24 @@
         </w:trPr>
         <w:tc>
           <w:tcPr>
-            <w:tcW w:type="dxa" w:w="3370"/>
-            <w:tcBorders>
-              <w:top w:val="single" w:color="BFBFBF" w:sz="4"/>
-              <w:left w:val="none" w:color="FFFFFF" w:sz="0"/>
-              <w:bottom w:val="single" w:color="BFBFBF" w:sz="4"/>
-              <w:right w:val="none" w:color="FFFFFF" w:sz="0"/>
-            </w:tcBorders>
-            <w:tcMar>
-              <w:top w:type="dxa" w:w="40"/>
-              <w:left w:type="dxa" w:w="90"/>
-              <w:bottom w:type="dxa" w:w="40"/>
-              <w:right w:type="dxa" w:w="90"/>
-            </w:tcMar>
-            <w:vAlign w:val="center"/>
-          </w:tcPr>
-          <w:p>
-            <w:pPr>
-              <w:keepNext w:val="false"/>
+            <w:tcW w:type="dxa" w:w="3745"/>
+            <w:tcBorders>
+              <w:top w:val="single" w:color="BFBFBF" w:sz="4"/>
+              <w:left w:val="none" w:color="FFFFFF" w:sz="0"/>
+              <w:bottom w:val="single" w:color="BFBFBF" w:sz="4"/>
+              <w:right w:val="none" w:color="FFFFFF" w:sz="0"/>
+            </w:tcBorders>
+            <w:tcMar>
+              <w:top w:type="dxa" w:w="40"/>
+              <w:left w:type="dxa" w:w="90"/>
+              <w:bottom w:type="dxa" w:w="40"/>
+              <w:right w:type="dxa" w:w="90"/>
+            </w:tcMar>
+            <w:vAlign w:val="center"/>
+          </w:tcPr>
+          <w:p>
+            <w:pPr>
+              <w:keepNext/>
               <w:spacing w:after="0"/>
               <w:jc w:val="left"/>
             </w:pPr>
@@ -5445,24 +5212,24 @@
         </w:tc>
         <w:tc>
           <w:tcPr>
-            <w:tcW w:type="dxa" w:w="900"/>
-            <w:tcBorders>
-              <w:top w:val="single" w:color="BFBFBF" w:sz="4"/>
-              <w:left w:val="none" w:color="FFFFFF" w:sz="0"/>
-              <w:bottom w:val="single" w:color="BFBFBF" w:sz="4"/>
-              <w:right w:val="none" w:color="FFFFFF" w:sz="0"/>
-            </w:tcBorders>
-            <w:tcMar>
-              <w:top w:type="dxa" w:w="40"/>
-              <w:left w:type="dxa" w:w="90"/>
-              <w:bottom w:type="dxa" w:w="40"/>
-              <w:right w:type="dxa" w:w="90"/>
-            </w:tcMar>
-            <w:vAlign w:val="center"/>
-          </w:tcPr>
-          <w:p>
-            <w:pPr>
-              <w:keepNext w:val="false"/>
+            <w:tcW w:type="dxa" w:w="1000"/>
+            <w:tcBorders>
+              <w:top w:val="single" w:color="BFBFBF" w:sz="4"/>
+              <w:left w:val="none" w:color="FFFFFF" w:sz="0"/>
+              <w:bottom w:val="single" w:color="BFBFBF" w:sz="4"/>
+              <w:right w:val="none" w:color="FFFFFF" w:sz="0"/>
+            </w:tcBorders>
+            <w:tcMar>
+              <w:top w:type="dxa" w:w="40"/>
+              <w:left w:type="dxa" w:w="90"/>
+              <w:bottom w:type="dxa" w:w="40"/>
+              <w:right w:type="dxa" w:w="90"/>
+            </w:tcMar>
+            <w:vAlign w:val="center"/>
+          </w:tcPr>
+          <w:p>
+            <w:pPr>
+              <w:keepNext/>
               <w:spacing w:after="0"/>
               <w:jc w:val="center"/>
             </w:pPr>
@@ -5479,24 +5246,24 @@
         </w:tc>
         <w:tc>
           <w:tcPr>
-            <w:tcW w:type="dxa" w:w="1300"/>
-            <w:tcBorders>
-              <w:top w:val="single" w:color="BFBFBF" w:sz="4"/>
-              <w:left w:val="none" w:color="FFFFFF" w:sz="0"/>
-              <w:bottom w:val="single" w:color="BFBFBF" w:sz="4"/>
-              <w:right w:val="none" w:color="FFFFFF" w:sz="0"/>
-            </w:tcBorders>
-            <w:tcMar>
-              <w:top w:type="dxa" w:w="40"/>
-              <w:left w:type="dxa" w:w="90"/>
-              <w:bottom w:type="dxa" w:w="40"/>
-              <w:right w:type="dxa" w:w="90"/>
-            </w:tcMar>
-            <w:vAlign w:val="center"/>
-          </w:tcPr>
-          <w:p>
-            <w:pPr>
-              <w:keepNext w:val="false"/>
+            <w:tcW w:type="dxa" w:w="1445"/>
+            <w:tcBorders>
+              <w:top w:val="single" w:color="BFBFBF" w:sz="4"/>
+              <w:left w:val="none" w:color="FFFFFF" w:sz="0"/>
+              <w:bottom w:val="single" w:color="BFBFBF" w:sz="4"/>
+              <w:right w:val="none" w:color="FFFFFF" w:sz="0"/>
+            </w:tcBorders>
+            <w:tcMar>
+              <w:top w:type="dxa" w:w="40"/>
+              <w:left w:type="dxa" w:w="90"/>
+              <w:bottom w:type="dxa" w:w="40"/>
+              <w:right w:type="dxa" w:w="90"/>
+            </w:tcMar>
+            <w:vAlign w:val="center"/>
+          </w:tcPr>
+          <w:p>
+            <w:pPr>
+              <w:keepNext/>
               <w:spacing w:after="0"/>
               <w:jc w:val="center"/>
             </w:pPr>
@@ -5513,24 +5280,24 @@
         </w:tc>
         <w:tc>
           <w:tcPr>
-            <w:tcW w:type="dxa" w:w="2100"/>
-            <w:tcBorders>
-              <w:top w:val="single" w:color="BFBFBF" w:sz="4"/>
-              <w:left w:val="none" w:color="FFFFFF" w:sz="0"/>
-              <w:bottom w:val="single" w:color="BFBFBF" w:sz="4"/>
-              <w:right w:val="none" w:color="FFFFFF" w:sz="0"/>
-            </w:tcBorders>
-            <w:tcMar>
-              <w:top w:type="dxa" w:w="40"/>
-              <w:left w:type="dxa" w:w="90"/>
-              <w:bottom w:type="dxa" w:w="40"/>
-              <w:right w:type="dxa" w:w="90"/>
-            </w:tcMar>
-            <w:vAlign w:val="center"/>
-          </w:tcPr>
-          <w:p>
-            <w:pPr>
-              <w:keepNext w:val="false"/>
+            <w:tcW w:type="dxa" w:w="2334"/>
+            <w:tcBorders>
+              <w:top w:val="single" w:color="BFBFBF" w:sz="4"/>
+              <w:left w:val="none" w:color="FFFFFF" w:sz="0"/>
+              <w:bottom w:val="single" w:color="BFBFBF" w:sz="4"/>
+              <w:right w:val="none" w:color="FFFFFF" w:sz="0"/>
+            </w:tcBorders>
+            <w:tcMar>
+              <w:top w:type="dxa" w:w="40"/>
+              <w:left w:type="dxa" w:w="90"/>
+              <w:bottom w:type="dxa" w:w="40"/>
+              <w:right w:type="dxa" w:w="90"/>
+            </w:tcMar>
+            <w:vAlign w:val="center"/>
+          </w:tcPr>
+          <w:p>
+            <w:pPr>
+              <w:keepNext/>
               <w:spacing w:after="0"/>
               <w:jc w:val="center"/>
             </w:pPr>
@@ -5547,24 +5314,24 @@
         </w:tc>
         <w:tc>
           <w:tcPr>
-            <w:tcW w:type="dxa" w:w="1400"/>
-            <w:tcBorders>
-              <w:top w:val="single" w:color="BFBFBF" w:sz="4"/>
-              <w:left w:val="none" w:color="FFFFFF" w:sz="0"/>
-              <w:bottom w:val="single" w:color="BFBFBF" w:sz="4"/>
-              <w:right w:val="none" w:color="FFFFFF" w:sz="0"/>
-            </w:tcBorders>
-            <w:tcMar>
-              <w:top w:type="dxa" w:w="40"/>
-              <w:left w:type="dxa" w:w="90"/>
-              <w:bottom w:type="dxa" w:w="40"/>
-              <w:right w:type="dxa" w:w="90"/>
-            </w:tcMar>
-            <w:vAlign w:val="center"/>
-          </w:tcPr>
-          <w:p>
-            <w:pPr>
-              <w:keepNext w:val="false"/>
+            <w:tcW w:type="dxa" w:w="1556"/>
+            <w:tcBorders>
+              <w:top w:val="single" w:color="BFBFBF" w:sz="4"/>
+              <w:left w:val="none" w:color="FFFFFF" w:sz="0"/>
+              <w:bottom w:val="single" w:color="BFBFBF" w:sz="4"/>
+              <w:right w:val="none" w:color="FFFFFF" w:sz="0"/>
+            </w:tcBorders>
+            <w:tcMar>
+              <w:top w:type="dxa" w:w="40"/>
+              <w:left w:type="dxa" w:w="90"/>
+              <w:bottom w:type="dxa" w:w="40"/>
+              <w:right w:type="dxa" w:w="90"/>
+            </w:tcMar>
+            <w:vAlign w:val="center"/>
+          </w:tcPr>
+          <w:p>
+            <w:pPr>
+              <w:keepNext/>
               <w:spacing w:after="0"/>
               <w:jc w:val="center"/>
             </w:pPr>
@@ -5692,7 +5459,7 @@
     </w:p>
     <w:tbl>
       <w:tblPr>
-        <w:tblW w:type="dxa" w:w="9070"/>
+        <w:tblW w:type="dxa" w:w="10080"/>
         <w:jc w:val="center"/>
         <w:tblBorders>
           <w:top w:val="single" w:color="auto" w:sz="4"/>
@@ -5704,11 +5471,11 @@
         </w:tblBorders>
       </w:tblPr>
       <w:tblGrid>
-        <w:gridCol w:w="2370"/>
-        <w:gridCol w:w="2050"/>
-        <w:gridCol w:w="1500"/>
-        <w:gridCol w:w="1250"/>
-        <w:gridCol w:w="1900"/>
+        <w:gridCol w:w="2634"/>
+        <w:gridCol w:w="2278"/>
+        <w:gridCol w:w="1667"/>
+        <w:gridCol w:w="1389"/>
+        <w:gridCol w:w="2112"/>
       </w:tblGrid>
       <w:tr>
         <w:trPr>
@@ -5716,7 +5483,7 @@
         </w:trPr>
         <w:tc>
           <w:tcPr>
-            <w:tcW w:type="dxa" w:w="2370"/>
+            <w:tcW w:type="dxa" w:w="2634"/>
             <w:tcBorders>
               <w:top w:val="single" w:color="BFBFBF" w:sz="4"/>
               <w:left w:val="none" w:color="FFFFFF" w:sz="0"/>
@@ -5751,7 +5518,7 @@
         </w:tc>
         <w:tc>
           <w:tcPr>
-            <w:tcW w:type="dxa" w:w="2050"/>
+            <w:tcW w:type="dxa" w:w="2278"/>
             <w:tcBorders>
               <w:top w:val="single" w:color="BFBFBF" w:sz="4"/>
               <w:left w:val="none" w:color="FFFFFF" w:sz="0"/>
@@ -5786,7 +5553,7 @@
         </w:tc>
         <w:tc>
           <w:tcPr>
-            <w:tcW w:type="dxa" w:w="1500"/>
+            <w:tcW w:type="dxa" w:w="1667"/>
             <w:tcBorders>
               <w:top w:val="single" w:color="BFBFBF" w:sz="4"/>
               <w:left w:val="none" w:color="FFFFFF" w:sz="0"/>
@@ -5821,7 +5588,7 @@
         </w:tc>
         <w:tc>
           <w:tcPr>
-            <w:tcW w:type="dxa" w:w="1250"/>
+            <w:tcW w:type="dxa" w:w="1389"/>
             <w:tcBorders>
               <w:top w:val="single" w:color="BFBFBF" w:sz="4"/>
               <w:left w:val="none" w:color="FFFFFF" w:sz="0"/>
@@ -5856,7 +5623,7 @@
         </w:tc>
         <w:tc>
           <w:tcPr>
-            <w:tcW w:type="dxa" w:w="1900"/>
+            <w:tcW w:type="dxa" w:w="2112"/>
             <w:tcBorders>
               <w:top w:val="single" w:color="BFBFBF" w:sz="4"/>
               <w:left w:val="none" w:color="FFFFFF" w:sz="0"/>
@@ -5896,7 +5663,7 @@
         </w:trPr>
         <w:tc>
           <w:tcPr>
-            <w:tcW w:type="dxa" w:w="2370"/>
+            <w:tcW w:type="dxa" w:w="2634"/>
             <w:tcBorders>
               <w:top w:val="single" w:color="BFBFBF" w:sz="4"/>
               <w:left w:val="none" w:color="FFFFFF" w:sz="0"/>
@@ -5930,7 +5697,7 @@
         </w:tc>
         <w:tc>
           <w:tcPr>
-            <w:tcW w:type="dxa" w:w="2050"/>
+            <w:tcW w:type="dxa" w:w="2278"/>
             <w:tcBorders>
               <w:top w:val="single" w:color="BFBFBF" w:sz="4"/>
               <w:left w:val="none" w:color="FFFFFF" w:sz="0"/>
@@ -5964,7 +5731,7 @@
         </w:tc>
         <w:tc>
           <w:tcPr>
-            <w:tcW w:type="dxa" w:w="1500"/>
+            <w:tcW w:type="dxa" w:w="1667"/>
             <w:tcBorders>
               <w:top w:val="single" w:color="BFBFBF" w:sz="4"/>
               <w:left w:val="none" w:color="FFFFFF" w:sz="0"/>
@@ -5998,7 +5765,7 @@
         </w:tc>
         <w:tc>
           <w:tcPr>
-            <w:tcW w:type="dxa" w:w="1250"/>
+            <w:tcW w:type="dxa" w:w="1389"/>
             <w:tcBorders>
               <w:top w:val="single" w:color="BFBFBF" w:sz="4"/>
               <w:left w:val="none" w:color="FFFFFF" w:sz="0"/>
@@ -6032,7 +5799,7 @@
         </w:tc>
         <w:tc>
           <w:tcPr>
-            <w:tcW w:type="dxa" w:w="1900"/>
+            <w:tcW w:type="dxa" w:w="2112"/>
             <w:tcBorders>
               <w:top w:val="single" w:color="BFBFBF" w:sz="4"/>
               <w:left w:val="none" w:color="FFFFFF" w:sz="0"/>
@@ -6071,7 +5838,7 @@
         </w:trPr>
         <w:tc>
           <w:tcPr>
-            <w:tcW w:type="dxa" w:w="2370"/>
+            <w:tcW w:type="dxa" w:w="2634"/>
             <w:tcBorders>
               <w:top w:val="single" w:color="BFBFBF" w:sz="4"/>
               <w:left w:val="none" w:color="FFFFFF" w:sz="0"/>
@@ -6105,7 +5872,7 @@
         </w:tc>
         <w:tc>
           <w:tcPr>
-            <w:tcW w:type="dxa" w:w="2050"/>
+            <w:tcW w:type="dxa" w:w="2278"/>
             <w:tcBorders>
               <w:top w:val="single" w:color="BFBFBF" w:sz="4"/>
               <w:left w:val="none" w:color="FFFFFF" w:sz="0"/>
@@ -6139,7 +5906,7 @@
         </w:tc>
         <w:tc>
           <w:tcPr>
-            <w:tcW w:type="dxa" w:w="1500"/>
+            <w:tcW w:type="dxa" w:w="1667"/>
             <w:tcBorders>
               <w:top w:val="single" w:color="BFBFBF" w:sz="4"/>
               <w:left w:val="none" w:color="FFFFFF" w:sz="0"/>
@@ -6173,7 +5940,7 @@
         </w:tc>
         <w:tc>
           <w:tcPr>
-            <w:tcW w:type="dxa" w:w="1250"/>
+            <w:tcW w:type="dxa" w:w="1389"/>
             <w:tcBorders>
               <w:top w:val="single" w:color="BFBFBF" w:sz="4"/>
               <w:left w:val="none" w:color="FFFFFF" w:sz="0"/>
@@ -6207,7 +5974,7 @@
         </w:tc>
         <w:tc>
           <w:tcPr>
-            <w:tcW w:type="dxa" w:w="1900"/>
+            <w:tcW w:type="dxa" w:w="2112"/>
             <w:tcBorders>
               <w:top w:val="single" w:color="BFBFBF" w:sz="4"/>
               <w:left w:val="none" w:color="FFFFFF" w:sz="0"/>
@@ -6246,7 +6013,7 @@
         </w:trPr>
         <w:tc>
           <w:tcPr>
-            <w:tcW w:type="dxa" w:w="2370"/>
+            <w:tcW w:type="dxa" w:w="2634"/>
             <w:tcBorders>
               <w:top w:val="single" w:color="BFBFBF" w:sz="4"/>
               <w:left w:val="none" w:color="FFFFFF" w:sz="0"/>
@@ -6280,7 +6047,7 @@
         </w:tc>
         <w:tc>
           <w:tcPr>
-            <w:tcW w:type="dxa" w:w="2050"/>
+            <w:tcW w:type="dxa" w:w="2278"/>
             <w:tcBorders>
               <w:top w:val="single" w:color="BFBFBF" w:sz="4"/>
               <w:left w:val="none" w:color="FFFFFF" w:sz="0"/>
@@ -6314,7 +6081,7 @@
         </w:tc>
         <w:tc>
           <w:tcPr>
-            <w:tcW w:type="dxa" w:w="1500"/>
+            <w:tcW w:type="dxa" w:w="1667"/>
             <w:tcBorders>
               <w:top w:val="single" w:color="BFBFBF" w:sz="4"/>
               <w:left w:val="none" w:color="FFFFFF" w:sz="0"/>
@@ -6348,7 +6115,7 @@
         </w:tc>
         <w:tc>
           <w:tcPr>
-            <w:tcW w:type="dxa" w:w="1250"/>
+            <w:tcW w:type="dxa" w:w="1389"/>
             <w:tcBorders>
               <w:top w:val="single" w:color="BFBFBF" w:sz="4"/>
               <w:left w:val="none" w:color="FFFFFF" w:sz="0"/>
@@ -6382,7 +6149,7 @@
         </w:tc>
         <w:tc>
           <w:tcPr>
-            <w:tcW w:type="dxa" w:w="1900"/>
+            <w:tcW w:type="dxa" w:w="2112"/>
             <w:tcBorders>
               <w:top w:val="single" w:color="BFBFBF" w:sz="4"/>
               <w:left w:val="none" w:color="FFFFFF" w:sz="0"/>
@@ -6421,24 +6188,24 @@
         </w:trPr>
         <w:tc>
           <w:tcPr>
-            <w:tcW w:type="dxa" w:w="2370"/>
-            <w:tcBorders>
-              <w:top w:val="single" w:color="BFBFBF" w:sz="4"/>
-              <w:left w:val="none" w:color="FFFFFF" w:sz="0"/>
-              <w:bottom w:val="single" w:color="BFBFBF" w:sz="4"/>
-              <w:right w:val="none" w:color="FFFFFF" w:sz="0"/>
-            </w:tcBorders>
-            <w:tcMar>
-              <w:top w:type="dxa" w:w="40"/>
-              <w:left w:type="dxa" w:w="90"/>
-              <w:bottom w:type="dxa" w:w="40"/>
-              <w:right w:type="dxa" w:w="90"/>
-            </w:tcMar>
-            <w:vAlign w:val="center"/>
-          </w:tcPr>
-          <w:p>
-            <w:pPr>
-              <w:keepNext w:val="false"/>
+            <w:tcW w:type="dxa" w:w="2634"/>
+            <w:tcBorders>
+              <w:top w:val="single" w:color="BFBFBF" w:sz="4"/>
+              <w:left w:val="none" w:color="FFFFFF" w:sz="0"/>
+              <w:bottom w:val="single" w:color="BFBFBF" w:sz="4"/>
+              <w:right w:val="none" w:color="FFFFFF" w:sz="0"/>
+            </w:tcBorders>
+            <w:tcMar>
+              <w:top w:type="dxa" w:w="40"/>
+              <w:left w:type="dxa" w:w="90"/>
+              <w:bottom w:type="dxa" w:w="40"/>
+              <w:right w:type="dxa" w:w="90"/>
+            </w:tcMar>
+            <w:vAlign w:val="center"/>
+          </w:tcPr>
+          <w:p>
+            <w:pPr>
+              <w:keepNext/>
               <w:spacing w:after="0"/>
               <w:jc w:val="left"/>
             </w:pPr>
@@ -6455,24 +6222,24 @@
         </w:tc>
         <w:tc>
           <w:tcPr>
-            <w:tcW w:type="dxa" w:w="2050"/>
-            <w:tcBorders>
-              <w:top w:val="single" w:color="BFBFBF" w:sz="4"/>
-              <w:left w:val="none" w:color="FFFFFF" w:sz="0"/>
-              <w:bottom w:val="single" w:color="BFBFBF" w:sz="4"/>
-              <w:right w:val="none" w:color="FFFFFF" w:sz="0"/>
-            </w:tcBorders>
-            <w:tcMar>
-              <w:top w:type="dxa" w:w="40"/>
-              <w:left w:type="dxa" w:w="90"/>
-              <w:bottom w:type="dxa" w:w="40"/>
-              <w:right w:type="dxa" w:w="90"/>
-            </w:tcMar>
-            <w:vAlign w:val="center"/>
-          </w:tcPr>
-          <w:p>
-            <w:pPr>
-              <w:keepNext w:val="false"/>
+            <w:tcW w:type="dxa" w:w="2278"/>
+            <w:tcBorders>
+              <w:top w:val="single" w:color="BFBFBF" w:sz="4"/>
+              <w:left w:val="none" w:color="FFFFFF" w:sz="0"/>
+              <w:bottom w:val="single" w:color="BFBFBF" w:sz="4"/>
+              <w:right w:val="none" w:color="FFFFFF" w:sz="0"/>
+            </w:tcBorders>
+            <w:tcMar>
+              <w:top w:type="dxa" w:w="40"/>
+              <w:left w:type="dxa" w:w="90"/>
+              <w:bottom w:type="dxa" w:w="40"/>
+              <w:right w:type="dxa" w:w="90"/>
+            </w:tcMar>
+            <w:vAlign w:val="center"/>
+          </w:tcPr>
+          <w:p>
+            <w:pPr>
+              <w:keepNext/>
               <w:spacing w:after="0"/>
               <w:jc w:val="center"/>
             </w:pPr>
@@ -6489,24 +6256,24 @@
         </w:tc>
         <w:tc>
           <w:tcPr>
-            <w:tcW w:type="dxa" w:w="1500"/>
-            <w:tcBorders>
-              <w:top w:val="single" w:color="BFBFBF" w:sz="4"/>
-              <w:left w:val="none" w:color="FFFFFF" w:sz="0"/>
-              <w:bottom w:val="single" w:color="BFBFBF" w:sz="4"/>
-              <w:right w:val="none" w:color="FFFFFF" w:sz="0"/>
-            </w:tcBorders>
-            <w:tcMar>
-              <w:top w:type="dxa" w:w="40"/>
-              <w:left w:type="dxa" w:w="90"/>
-              <w:bottom w:type="dxa" w:w="40"/>
-              <w:right w:type="dxa" w:w="90"/>
-            </w:tcMar>
-            <w:vAlign w:val="center"/>
-          </w:tcPr>
-          <w:p>
-            <w:pPr>
-              <w:keepNext w:val="false"/>
+            <w:tcW w:type="dxa" w:w="1667"/>
+            <w:tcBorders>
+              <w:top w:val="single" w:color="BFBFBF" w:sz="4"/>
+              <w:left w:val="none" w:color="FFFFFF" w:sz="0"/>
+              <w:bottom w:val="single" w:color="BFBFBF" w:sz="4"/>
+              <w:right w:val="none" w:color="FFFFFF" w:sz="0"/>
+            </w:tcBorders>
+            <w:tcMar>
+              <w:top w:type="dxa" w:w="40"/>
+              <w:left w:type="dxa" w:w="90"/>
+              <w:bottom w:type="dxa" w:w="40"/>
+              <w:right w:type="dxa" w:w="90"/>
+            </w:tcMar>
+            <w:vAlign w:val="center"/>
+          </w:tcPr>
+          <w:p>
+            <w:pPr>
+              <w:keepNext/>
               <w:spacing w:after="0"/>
               <w:jc w:val="center"/>
             </w:pPr>
@@ -6523,24 +6290,24 @@
         </w:tc>
         <w:tc>
           <w:tcPr>
-            <w:tcW w:type="dxa" w:w="1250"/>
-            <w:tcBorders>
-              <w:top w:val="single" w:color="BFBFBF" w:sz="4"/>
-              <w:left w:val="none" w:color="FFFFFF" w:sz="0"/>
-              <w:bottom w:val="single" w:color="BFBFBF" w:sz="4"/>
-              <w:right w:val="none" w:color="FFFFFF" w:sz="0"/>
-            </w:tcBorders>
-            <w:tcMar>
-              <w:top w:type="dxa" w:w="40"/>
-              <w:left w:type="dxa" w:w="90"/>
-              <w:bottom w:type="dxa" w:w="40"/>
-              <w:right w:type="dxa" w:w="90"/>
-            </w:tcMar>
-            <w:vAlign w:val="center"/>
-          </w:tcPr>
-          <w:p>
-            <w:pPr>
-              <w:keepNext w:val="false"/>
+            <w:tcW w:type="dxa" w:w="1389"/>
+            <w:tcBorders>
+              <w:top w:val="single" w:color="BFBFBF" w:sz="4"/>
+              <w:left w:val="none" w:color="FFFFFF" w:sz="0"/>
+              <w:bottom w:val="single" w:color="BFBFBF" w:sz="4"/>
+              <w:right w:val="none" w:color="FFFFFF" w:sz="0"/>
+            </w:tcBorders>
+            <w:tcMar>
+              <w:top w:type="dxa" w:w="40"/>
+              <w:left w:type="dxa" w:w="90"/>
+              <w:bottom w:type="dxa" w:w="40"/>
+              <w:right w:type="dxa" w:w="90"/>
+            </w:tcMar>
+            <w:vAlign w:val="center"/>
+          </w:tcPr>
+          <w:p>
+            <w:pPr>
+              <w:keepNext/>
               <w:spacing w:after="0"/>
               <w:jc w:val="center"/>
             </w:pPr>
@@ -6557,24 +6324,24 @@
         </w:tc>
         <w:tc>
           <w:tcPr>
-            <w:tcW w:type="dxa" w:w="1900"/>
-            <w:tcBorders>
-              <w:top w:val="single" w:color="BFBFBF" w:sz="4"/>
-              <w:left w:val="none" w:color="FFFFFF" w:sz="0"/>
-              <w:bottom w:val="single" w:color="BFBFBF" w:sz="4"/>
-              <w:right w:val="none" w:color="FFFFFF" w:sz="0"/>
-            </w:tcBorders>
-            <w:tcMar>
-              <w:top w:type="dxa" w:w="40"/>
-              <w:left w:type="dxa" w:w="90"/>
-              <w:bottom w:type="dxa" w:w="40"/>
-              <w:right w:type="dxa" w:w="90"/>
-            </w:tcMar>
-            <w:vAlign w:val="center"/>
-          </w:tcPr>
-          <w:p>
-            <w:pPr>
-              <w:keepNext w:val="false"/>
+            <w:tcW w:type="dxa" w:w="2112"/>
+            <w:tcBorders>
+              <w:top w:val="single" w:color="BFBFBF" w:sz="4"/>
+              <w:left w:val="none" w:color="FFFFFF" w:sz="0"/>
+              <w:bottom w:val="single" w:color="BFBFBF" w:sz="4"/>
+              <w:right w:val="none" w:color="FFFFFF" w:sz="0"/>
+            </w:tcBorders>
+            <w:tcMar>
+              <w:top w:type="dxa" w:w="40"/>
+              <w:left w:type="dxa" w:w="90"/>
+              <w:bottom w:type="dxa" w:w="40"/>
+              <w:right w:type="dxa" w:w="90"/>
+            </w:tcMar>
+            <w:vAlign w:val="center"/>
+          </w:tcPr>
+          <w:p>
+            <w:pPr>
+              <w:keepNext/>
               <w:spacing w:after="0"/>
               <w:jc w:val="center"/>
             </w:pPr>
@@ -6792,7 +6559,7 @@
     </w:p>
     <w:tbl>
       <w:tblPr>
-        <w:tblW w:type="dxa" w:w="9070"/>
+        <w:tblW w:type="dxa" w:w="10080"/>
         <w:jc w:val="center"/>
         <w:tblBorders>
           <w:top w:val="single" w:color="auto" w:sz="4"/>
@@ -6804,9 +6571,9 @@
         </w:tblBorders>
       </w:tblPr>
       <w:tblGrid>
-        <w:gridCol w:w="1700"/>
-        <w:gridCol w:w="4870"/>
-        <w:gridCol w:w="2500"/>
+        <w:gridCol w:w="1889"/>
+        <w:gridCol w:w="5412"/>
+        <w:gridCol w:w="2779"/>
       </w:tblGrid>
       <w:tr>
         <w:trPr>
@@ -6814,7 +6581,7 @@
         </w:trPr>
         <w:tc>
           <w:tcPr>
-            <w:tcW w:type="dxa" w:w="1700"/>
+            <w:tcW w:type="dxa" w:w="1889"/>
             <w:tcBorders>
               <w:top w:val="single" w:color="BFBFBF" w:sz="4"/>
               <w:left w:val="none" w:color="FFFFFF" w:sz="0"/>
@@ -6849,7 +6616,7 @@
         </w:tc>
         <w:tc>
           <w:tcPr>
-            <w:tcW w:type="dxa" w:w="4870"/>
+            <w:tcW w:type="dxa" w:w="5412"/>
             <w:tcBorders>
               <w:top w:val="single" w:color="BFBFBF" w:sz="4"/>
               <w:left w:val="none" w:color="FFFFFF" w:sz="0"/>
@@ -6884,7 +6651,7 @@
         </w:tc>
         <w:tc>
           <w:tcPr>
-            <w:tcW w:type="dxa" w:w="2500"/>
+            <w:tcW w:type="dxa" w:w="2779"/>
             <w:tcBorders>
               <w:top w:val="single" w:color="BFBFBF" w:sz="4"/>
               <w:left w:val="none" w:color="FFFFFF" w:sz="0"/>
@@ -6924,7 +6691,7 @@
         </w:trPr>
         <w:tc>
           <w:tcPr>
-            <w:tcW w:type="dxa" w:w="1700"/>
+            <w:tcW w:type="dxa" w:w="1889"/>
             <w:tcBorders>
               <w:top w:val="single" w:color="BFBFBF" w:sz="4"/>
               <w:left w:val="none" w:color="FFFFFF" w:sz="0"/>
@@ -6958,7 +6725,7 @@
         </w:tc>
         <w:tc>
           <w:tcPr>
-            <w:tcW w:type="dxa" w:w="4870"/>
+            <w:tcW w:type="dxa" w:w="5412"/>
             <w:tcBorders>
               <w:top w:val="single" w:color="BFBFBF" w:sz="4"/>
               <w:left w:val="none" w:color="FFFFFF" w:sz="0"/>
@@ -6992,7 +6759,7 @@
         </w:tc>
         <w:tc>
           <w:tcPr>
-            <w:tcW w:type="dxa" w:w="2500"/>
+            <w:tcW w:type="dxa" w:w="2779"/>
             <w:tcBorders>
               <w:top w:val="single" w:color="BFBFBF" w:sz="4"/>
               <w:left w:val="none" w:color="FFFFFF" w:sz="0"/>
@@ -7031,7 +6798,7 @@
         </w:trPr>
         <w:tc>
           <w:tcPr>
-            <w:tcW w:type="dxa" w:w="1700"/>
+            <w:tcW w:type="dxa" w:w="1889"/>
             <w:tcBorders>
               <w:top w:val="single" w:color="BFBFBF" w:sz="4"/>
               <w:left w:val="none" w:color="FFFFFF" w:sz="0"/>
@@ -7065,7 +6832,7 @@
         </w:tc>
         <w:tc>
           <w:tcPr>
-            <w:tcW w:type="dxa" w:w="4870"/>
+            <w:tcW w:type="dxa" w:w="5412"/>
             <w:tcBorders>
               <w:top w:val="single" w:color="BFBFBF" w:sz="4"/>
               <w:left w:val="none" w:color="FFFFFF" w:sz="0"/>
@@ -7099,7 +6866,7 @@
         </w:tc>
         <w:tc>
           <w:tcPr>
-            <w:tcW w:type="dxa" w:w="2500"/>
+            <w:tcW w:type="dxa" w:w="2779"/>
             <w:tcBorders>
               <w:top w:val="single" w:color="BFBFBF" w:sz="4"/>
               <w:left w:val="none" w:color="FFFFFF" w:sz="0"/>
@@ -7138,7 +6905,7 @@
         </w:trPr>
         <w:tc>
           <w:tcPr>
-            <w:tcW w:type="dxa" w:w="1700"/>
+            <w:tcW w:type="dxa" w:w="1889"/>
             <w:tcBorders>
               <w:top w:val="single" w:color="BFBFBF" w:sz="4"/>
               <w:left w:val="none" w:color="FFFFFF" w:sz="0"/>
@@ -7172,7 +6939,7 @@
         </w:tc>
         <w:tc>
           <w:tcPr>
-            <w:tcW w:type="dxa" w:w="4870"/>
+            <w:tcW w:type="dxa" w:w="5412"/>
             <w:tcBorders>
               <w:top w:val="single" w:color="BFBFBF" w:sz="4"/>
               <w:left w:val="none" w:color="FFFFFF" w:sz="0"/>
@@ -7206,7 +6973,7 @@
         </w:tc>
         <w:tc>
           <w:tcPr>
-            <w:tcW w:type="dxa" w:w="2500"/>
+            <w:tcW w:type="dxa" w:w="2779"/>
             <w:tcBorders>
               <w:top w:val="single" w:color="BFBFBF" w:sz="4"/>
               <w:left w:val="none" w:color="FFFFFF" w:sz="0"/>
@@ -7245,7 +7012,7 @@
         </w:trPr>
         <w:tc>
           <w:tcPr>
-            <w:tcW w:type="dxa" w:w="1700"/>
+            <w:tcW w:type="dxa" w:w="1889"/>
             <w:tcBorders>
               <w:top w:val="single" w:color="BFBFBF" w:sz="4"/>
               <w:left w:val="none" w:color="FFFFFF" w:sz="0"/>
@@ -7279,7 +7046,7 @@
         </w:tc>
         <w:tc>
           <w:tcPr>
-            <w:tcW w:type="dxa" w:w="4870"/>
+            <w:tcW w:type="dxa" w:w="5412"/>
             <w:tcBorders>
               <w:top w:val="single" w:color="BFBFBF" w:sz="4"/>
               <w:left w:val="none" w:color="FFFFFF" w:sz="0"/>
@@ -7313,7 +7080,7 @@
         </w:tc>
         <w:tc>
           <w:tcPr>
-            <w:tcW w:type="dxa" w:w="2500"/>
+            <w:tcW w:type="dxa" w:w="2779"/>
             <w:tcBorders>
               <w:top w:val="single" w:color="BFBFBF" w:sz="4"/>
               <w:left w:val="none" w:color="FFFFFF" w:sz="0"/>
@@ -7352,7 +7119,7 @@
         </w:trPr>
         <w:tc>
           <w:tcPr>
-            <w:tcW w:type="dxa" w:w="1700"/>
+            <w:tcW w:type="dxa" w:w="1889"/>
             <w:tcBorders>
               <w:top w:val="single" w:color="BFBFBF" w:sz="4"/>
               <w:left w:val="none" w:color="FFFFFF" w:sz="0"/>
@@ -7386,7 +7153,7 @@
         </w:tc>
         <w:tc>
           <w:tcPr>
-            <w:tcW w:type="dxa" w:w="4870"/>
+            <w:tcW w:type="dxa" w:w="5412"/>
             <w:tcBorders>
               <w:top w:val="single" w:color="BFBFBF" w:sz="4"/>
               <w:left w:val="none" w:color="FFFFFF" w:sz="0"/>
@@ -7420,7 +7187,7 @@
         </w:tc>
         <w:tc>
           <w:tcPr>
-            <w:tcW w:type="dxa" w:w="2500"/>
+            <w:tcW w:type="dxa" w:w="2779"/>
             <w:tcBorders>
               <w:top w:val="single" w:color="BFBFBF" w:sz="4"/>
               <w:left w:val="none" w:color="FFFFFF" w:sz="0"/>
@@ -7459,24 +7226,24 @@
         </w:trPr>
         <w:tc>
           <w:tcPr>
-            <w:tcW w:type="dxa" w:w="1700"/>
-            <w:tcBorders>
-              <w:top w:val="single" w:color="BFBFBF" w:sz="4"/>
-              <w:left w:val="none" w:color="FFFFFF" w:sz="0"/>
-              <w:bottom w:val="single" w:color="BFBFBF" w:sz="4"/>
-              <w:right w:val="none" w:color="FFFFFF" w:sz="0"/>
-            </w:tcBorders>
-            <w:tcMar>
-              <w:top w:type="dxa" w:w="40"/>
-              <w:left w:type="dxa" w:w="90"/>
-              <w:bottom w:type="dxa" w:w="40"/>
-              <w:right w:type="dxa" w:w="90"/>
-            </w:tcMar>
-            <w:vAlign w:val="center"/>
-          </w:tcPr>
-          <w:p>
-            <w:pPr>
-              <w:keepNext w:val="false"/>
+            <w:tcW w:type="dxa" w:w="1889"/>
+            <w:tcBorders>
+              <w:top w:val="single" w:color="BFBFBF" w:sz="4"/>
+              <w:left w:val="none" w:color="FFFFFF" w:sz="0"/>
+              <w:bottom w:val="single" w:color="BFBFBF" w:sz="4"/>
+              <w:right w:val="none" w:color="FFFFFF" w:sz="0"/>
+            </w:tcBorders>
+            <w:tcMar>
+              <w:top w:type="dxa" w:w="40"/>
+              <w:left w:type="dxa" w:w="90"/>
+              <w:bottom w:type="dxa" w:w="40"/>
+              <w:right w:type="dxa" w:w="90"/>
+            </w:tcMar>
+            <w:vAlign w:val="center"/>
+          </w:tcPr>
+          <w:p>
+            <w:pPr>
+              <w:keepNext/>
               <w:spacing w:after="0"/>
               <w:jc w:val="left"/>
             </w:pPr>
@@ -7493,24 +7260,24 @@
         </w:tc>
         <w:tc>
           <w:tcPr>
-            <w:tcW w:type="dxa" w:w="4870"/>
-            <w:tcBorders>
-              <w:top w:val="single" w:color="BFBFBF" w:sz="4"/>
-              <w:left w:val="none" w:color="FFFFFF" w:sz="0"/>
-              <w:bottom w:val="single" w:color="BFBFBF" w:sz="4"/>
-              <w:right w:val="none" w:color="FFFFFF" w:sz="0"/>
-            </w:tcBorders>
-            <w:tcMar>
-              <w:top w:type="dxa" w:w="40"/>
-              <w:left w:type="dxa" w:w="90"/>
-              <w:bottom w:type="dxa" w:w="40"/>
-              <w:right w:type="dxa" w:w="90"/>
-            </w:tcMar>
-            <w:vAlign w:val="center"/>
-          </w:tcPr>
-          <w:p>
-            <w:pPr>
-              <w:keepNext w:val="false"/>
+            <w:tcW w:type="dxa" w:w="5412"/>
+            <w:tcBorders>
+              <w:top w:val="single" w:color="BFBFBF" w:sz="4"/>
+              <w:left w:val="none" w:color="FFFFFF" w:sz="0"/>
+              <w:bottom w:val="single" w:color="BFBFBF" w:sz="4"/>
+              <w:right w:val="none" w:color="FFFFFF" w:sz="0"/>
+            </w:tcBorders>
+            <w:tcMar>
+              <w:top w:type="dxa" w:w="40"/>
+              <w:left w:type="dxa" w:w="90"/>
+              <w:bottom w:type="dxa" w:w="40"/>
+              <w:right w:type="dxa" w:w="90"/>
+            </w:tcMar>
+            <w:vAlign w:val="center"/>
+          </w:tcPr>
+          <w:p>
+            <w:pPr>
+              <w:keepNext/>
               <w:spacing w:after="0"/>
               <w:jc w:val="left"/>
             </w:pPr>
@@ -7527,24 +7294,24 @@
         </w:tc>
         <w:tc>
           <w:tcPr>
-            <w:tcW w:type="dxa" w:w="2500"/>
-            <w:tcBorders>
-              <w:top w:val="single" w:color="BFBFBF" w:sz="4"/>
-              <w:left w:val="none" w:color="FFFFFF" w:sz="0"/>
-              <w:bottom w:val="single" w:color="BFBFBF" w:sz="4"/>
-              <w:right w:val="none" w:color="FFFFFF" w:sz="0"/>
-            </w:tcBorders>
-            <w:tcMar>
-              <w:top w:type="dxa" w:w="40"/>
-              <w:left w:type="dxa" w:w="90"/>
-              <w:bottom w:type="dxa" w:w="40"/>
-              <w:right w:type="dxa" w:w="90"/>
-            </w:tcMar>
-            <w:vAlign w:val="center"/>
-          </w:tcPr>
-          <w:p>
-            <w:pPr>
-              <w:keepNext w:val="false"/>
+            <w:tcW w:type="dxa" w:w="2779"/>
+            <w:tcBorders>
+              <w:top w:val="single" w:color="BFBFBF" w:sz="4"/>
+              <w:left w:val="none" w:color="FFFFFF" w:sz="0"/>
+              <w:bottom w:val="single" w:color="BFBFBF" w:sz="4"/>
+              <w:right w:val="none" w:color="FFFFFF" w:sz="0"/>
+            </w:tcBorders>
+            <w:tcMar>
+              <w:top w:type="dxa" w:w="40"/>
+              <w:left w:type="dxa" w:w="90"/>
+              <w:bottom w:type="dxa" w:w="40"/>
+              <w:right w:type="dxa" w:w="90"/>
+            </w:tcMar>
+            <w:vAlign w:val="center"/>
+          </w:tcPr>
+          <w:p>
+            <w:pPr>
+              <w:keepNext/>
               <w:spacing w:after="0"/>
               <w:jc w:val="left"/>
             </w:pPr>
@@ -7745,20 +7512,13 @@
     </w:p>
     <w:p>
       <w:pPr>
-        <w:pStyle w:val="Heading2"/>
-        <w:keepNext/>
-        <w:spacing w:after="80" w:before="140"/>
-      </w:pPr>
-      <w:r>
-        <w:t xml:space="preserve">8.1 Aporte inicial</w:t>
-      </w:r>
-    </w:p>
-    <w:p>
-      <w:pPr>
         <w:spacing w:after="120" w:before="0" w:line="264"/>
         <w:jc w:val="both"/>
       </w:pPr>
       <w:r>
+        <w:t xml:space="preserve">Aporte inicial publicado en el foro de la semana. </w:t>
+      </w:r>
+      <w:r>
         <w:rPr>
           <w:i/>
           <w:iCs/>
@@ -7767,31 +7527,6 @@
       </w:r>
       <w:r>
         <w:t xml:space="preserve"> Trabajamos con 1.470 registros sintéticos de empleados (16 % de salida) para ver qué se asocia con la rotación. Lo que encontramos: (1) quienes hacen horas extra salen casi tres veces más (30,5 % frente a 10,4 %); (2) la salida se concentra en los dos primeros años (29,8 %); (3) ingreso y antigüedad son muy asimétricos, así que usamos la mediana para describirlos y Welch, con Mann-Whitney como respaldo, para compararlos. Dejamos una pregunta: ingreso, edad y antigüedad se mueven juntos. ¿Cómo lo están abordando en sus datasets antes de llegar a la regresión?</w:t>
-      </w:r>
-    </w:p>
-    <w:p>
-      <w:pPr>
-        <w:pStyle w:val="Heading2"/>
-        <w:keepNext/>
-        <w:spacing w:after="80" w:before="140"/>
-      </w:pPr>
-      <w:r>
-        <w:t xml:space="preserve">8.2 Comentarios a otros grupos</w:t>
-      </w:r>
-    </w:p>
-    <w:p>
-      <w:pPr>
-        <w:spacing w:after="120" w:before="0" w:line="264"/>
-        <w:jc w:val="both"/>
-      </w:pPr>
-      <w:r>
-        <w:rPr>
-          <w:i/>
-          <w:iCs/>
-          <w:highlight w:val="yellow"/>
-          <w:highlightCs w:val="yellow"/>
-        </w:rPr>
-        <w:t xml:space="preserve">[Completar con los dos comentarios publicados en el foro a otros grupos.]</w:t>
       </w:r>
     </w:p>
     <w:p>
@@ -8015,10 +7750,14 @@
       </w:r>
     </w:p>
     <w:sectPr>
-      <w:footerReference w:type="default" r:id="rId7"/>
-      <w:pgSz w:w="11906" w:h="16838" w:orient="portrait"/>
-      <w:pgMar w:top="1300" w:right="1418" w:bottom="1300" w:left="1418" w:header="708" w:footer="600" w:gutter="0"/>
-      <w:pgNumType/>
+      <w:headerReference w:type="default" r:id="rId7"/>
+      <w:headerReference w:type="first" r:id="rId8"/>
+      <w:footerReference w:type="default" r:id="rId9"/>
+      <w:footerReference w:type="first" r:id="rId10"/>
+      <w:pgSz w:w="12240" w:h="15840" w:orient="portrait"/>
+      <w:pgMar w:top="936" w:right="1080" w:bottom="1300" w:left="1080" w:header="720" w:footer="720" w:gutter="0"/>
+      <w:pgNumType w:start="0"/>
+      <w:titlePg/>
       <w:docGrid w:linePitch="360"/>
     </w:sectPr>
   </w:body>
@@ -8069,35 +7808,61 @@
 <file path=word/footer1.xml><?xml version="1.0" encoding="utf-8"?>
 <w:ftr xmlns:wpc="http://schemas.microsoft.com/office/word/2010/wordprocessingCanvas" xmlns:mc="http://schemas.openxmlformats.org/markup-compatibility/2006" xmlns:o="urn:schemas-microsoft-com:office:office" xmlns:r="http://schemas.openxmlformats.org/officeDocument/2006/relationships" xmlns:m="http://schemas.openxmlformats.org/officeDocument/2006/math" xmlns:v="urn:schemas-microsoft-com:vml" xmlns:wp14="http://schemas.microsoft.com/office/word/2010/wordprocessingDrawing" xmlns:wp="http://schemas.openxmlformats.org/drawingml/2006/wordprocessingDrawing" xmlns:w10="urn:schemas-microsoft-com:office:word" xmlns:w="http://schemas.openxmlformats.org/wordprocessingml/2006/main" xmlns:w14="http://schemas.microsoft.com/office/word/2010/wordml" xmlns:w15="http://schemas.microsoft.com/office/word/2012/wordml" xmlns:wpg="http://schemas.microsoft.com/office/word/2010/wordprocessingGroup" xmlns:wpi="http://schemas.microsoft.com/office/word/2010/wordprocessingInk" xmlns:wne="http://schemas.microsoft.com/office/word/2006/wordml" xmlns:wps="http://schemas.microsoft.com/office/word/2010/wordprocessingShape">
   <w:p>
-    <w:pPr>
-      <w:pBdr>
-        <w:top w:val="single" w:color="BFBFBF" w:sz="4" w:space="4"/>
-      </w:pBdr>
-      <w:tabs>
-        <w:tab w:val="right" w:pos="9070"/>
-      </w:tabs>
-    </w:pPr>
     <w:r>
-      <w:rPr>
-        <w:color w:val="7F7F7F"/>
-        <w:sz w:val="17"/>
-        <w:szCs w:val="17"/>
-      </w:rPr>
-      <w:t xml:space="preserve">Magíster en Ciencia de Datos e Inteligencia Artificial · MCDI501</w:t>
-    </w:r>
-    <w:r>
-      <w:rPr>
-        <w:color w:val="7F7F7F"/>
-        <w:sz w:val="17"/>
-        <w:szCs w:val="17"/>
-      </w:rPr>
-      <w:t xml:space="preserve">	</w:t>
-      <w:fldChar w:fldCharType="begin"/>
-      <w:instrText xml:space="preserve">PAGE</w:instrText>
-      <w:fldChar w:fldCharType="separate"/>
-      <w:fldChar w:fldCharType="end"/>
+      <w:drawing>
+        <wp:anchor distT="0" distB="0" distL="0" distR="0" simplePos="0" allowOverlap="1" behindDoc="1" locked="0" layoutInCell="1" relativeHeight="428625">
+          <wp:simplePos x="0" y="0"/>
+          <wp:positionH relativeFrom="page">
+            <wp:posOffset>518160</wp:posOffset>
+          </wp:positionH>
+          <wp:positionV relativeFrom="page">
+            <wp:posOffset>9174480</wp:posOffset>
+          </wp:positionV>
+          <wp:extent cx="6734175" cy="428625"/>
+          <wp:effectExtent t="0" r="0" b="0" l="0"/>
+          <wp:wrapNone/>
+          <wp:docPr id="1" name="" descr="" title=""/>
+          <wp:cNvGraphicFramePr>
+            <a:graphicFrameLocks xmlns:a="http://schemas.openxmlformats.org/drawingml/2006/main" noChangeAspect="1"/>
+          </wp:cNvGraphicFramePr>
+          <a:graphic xmlns:a="http://schemas.openxmlformats.org/drawingml/2006/main">
+            <a:graphicData uri="http://schemas.openxmlformats.org/drawingml/2006/picture">
+              <pic:pic xmlns:pic="http://schemas.openxmlformats.org/drawingml/2006/picture">
+                <pic:nvPicPr>
+                  <pic:cNvPr id="0" name="" descr=""/>
+                  <pic:cNvPicPr>
+                    <a:picLocks noChangeAspect="1" noChangeArrowheads="1"/>
+                  </pic:cNvPicPr>
+                </pic:nvPicPr>
+                <pic:blipFill>
+                  <a:blip r:embed="rId0" cstate="none"/>
+                  <a:srcRect/>
+                  <a:stretch>
+                    <a:fillRect/>
+                  </a:stretch>
+                </pic:blipFill>
+                <pic:spPr bwMode="auto">
+                  <a:xfrm>
+                    <a:off x="0" y="0"/>
+                    <a:ext cx="6734175" cy="428625"/>
+                  </a:xfrm>
+                  <a:prstGeom prst="rect">
+                    <a:avLst/>
+                  </a:prstGeom>
+                </pic:spPr>
+              </pic:pic>
+            </a:graphicData>
+          </a:graphic>
+        </wp:anchor>
+      </w:drawing>
     </w:r>
   </w:p>
+</w:ftr>
+</file>
+
+<file path=word/footer2.xml><?xml version="1.0" encoding="utf-8"?>
+<w:ftr xmlns:wpc="http://schemas.microsoft.com/office/word/2010/wordprocessingCanvas" xmlns:mc="http://schemas.openxmlformats.org/markup-compatibility/2006" xmlns:o="urn:schemas-microsoft-com:office:office" xmlns:r="http://schemas.openxmlformats.org/officeDocument/2006/relationships" xmlns:m="http://schemas.openxmlformats.org/officeDocument/2006/math" xmlns:v="urn:schemas-microsoft-com:vml" xmlns:wp14="http://schemas.microsoft.com/office/word/2010/wordprocessingDrawing" xmlns:wp="http://schemas.openxmlformats.org/drawingml/2006/wordprocessingDrawing" xmlns:w10="urn:schemas-microsoft-com:office:word" xmlns:w="http://schemas.openxmlformats.org/wordprocessingml/2006/main" xmlns:w14="http://schemas.microsoft.com/office/word/2010/wordml" xmlns:w15="http://schemas.microsoft.com/office/word/2012/wordml" xmlns:wpg="http://schemas.microsoft.com/office/word/2010/wordprocessingGroup" xmlns:wpi="http://schemas.microsoft.com/office/word/2010/wordprocessingInk" xmlns:wne="http://schemas.microsoft.com/office/word/2006/wordml" xmlns:wps="http://schemas.microsoft.com/office/word/2010/wordprocessingShape">
+  <w:p/>
 </w:ftr>
 </file>
 
@@ -8136,6 +7901,82 @@
     </w:p>
   </w:footnote>
 </w:footnotes>
+</file>
+
+<file path=word/header1.xml><?xml version="1.0" encoding="utf-8"?>
+<w:hdr xmlns:wpc="http://schemas.microsoft.com/office/word/2010/wordprocessingCanvas" xmlns:mc="http://schemas.openxmlformats.org/markup-compatibility/2006" xmlns:o="urn:schemas-microsoft-com:office:office" xmlns:r="http://schemas.openxmlformats.org/officeDocument/2006/relationships" xmlns:m="http://schemas.openxmlformats.org/officeDocument/2006/math" xmlns:v="urn:schemas-microsoft-com:vml" xmlns:wp14="http://schemas.microsoft.com/office/word/2010/wordprocessingDrawing" xmlns:wp="http://schemas.openxmlformats.org/drawingml/2006/wordprocessingDrawing" xmlns:w10="urn:schemas-microsoft-com:office:word" xmlns:w="http://schemas.openxmlformats.org/wordprocessingml/2006/main" xmlns:w14="http://schemas.microsoft.com/office/word/2010/wordml" xmlns:w15="http://schemas.microsoft.com/office/word/2012/wordml" xmlns:wpg="http://schemas.microsoft.com/office/word/2010/wordprocessingGroup" xmlns:wpi="http://schemas.microsoft.com/office/word/2010/wordprocessingInk" xmlns:wne="http://schemas.microsoft.com/office/word/2006/wordml" xmlns:wps="http://schemas.microsoft.com/office/word/2010/wordprocessingShape" xmlns:cx="http://schemas.microsoft.com/office/drawing/2014/chartex" xmlns:cx1="http://schemas.microsoft.com/office/drawing/2015/9/8/chartex" xmlns:cx2="http://schemas.microsoft.com/office/drawing/2015/10/21/chartex" xmlns:cx3="http://schemas.microsoft.com/office/drawing/2016/5/9/chartex" xmlns:cx4="http://schemas.microsoft.com/office/drawing/2016/5/10/chartex" xmlns:cx5="http://schemas.microsoft.com/office/drawing/2016/5/11/chartex" xmlns:cx6="http://schemas.microsoft.com/office/drawing/2016/5/12/chartex" xmlns:cx7="http://schemas.microsoft.com/office/drawing/2016/5/13/chartex" xmlns:cx8="http://schemas.microsoft.com/office/drawing/2016/5/14/chartex" xmlns:w16cid="http://schemas.microsoft.com/office/word/2016/wordml/cid" xmlns:w16se="http://schemas.microsoft.com/office/word/2015/wordml/symex">
+  <w:p>
+    <w:pPr>
+      <w:jc w:val="right"/>
+    </w:pPr>
+    <w:r>
+      <w:rPr>
+        <w:rFonts w:ascii="Calibri" w:cs="Calibri" w:eastAsia="Calibri" w:hAnsi="Calibri"/>
+        <w:sz w:val="22"/>
+        <w:szCs w:val="22"/>
+      </w:rPr>
+      <w:fldChar w:fldCharType="begin"/>
+      <w:instrText xml:space="preserve">PAGE</w:instrText>
+      <w:fldChar w:fldCharType="separate"/>
+      <w:fldChar w:fldCharType="end"/>
+    </w:r>
+  </w:p>
+</w:hdr>
+</file>
+
+<file path=word/header2.xml><?xml version="1.0" encoding="utf-8"?>
+<w:hdr xmlns:wpc="http://schemas.microsoft.com/office/word/2010/wordprocessingCanvas" xmlns:mc="http://schemas.openxmlformats.org/markup-compatibility/2006" xmlns:o="urn:schemas-microsoft-com:office:office" xmlns:r="http://schemas.openxmlformats.org/officeDocument/2006/relationships" xmlns:m="http://schemas.openxmlformats.org/officeDocument/2006/math" xmlns:v="urn:schemas-microsoft-com:vml" xmlns:wp14="http://schemas.microsoft.com/office/word/2010/wordprocessingDrawing" xmlns:wp="http://schemas.openxmlformats.org/drawingml/2006/wordprocessingDrawing" xmlns:w10="urn:schemas-microsoft-com:office:word" xmlns:w="http://schemas.openxmlformats.org/wordprocessingml/2006/main" xmlns:w14="http://schemas.microsoft.com/office/word/2010/wordml" xmlns:w15="http://schemas.microsoft.com/office/word/2012/wordml" xmlns:wpg="http://schemas.microsoft.com/office/word/2010/wordprocessingGroup" xmlns:wpi="http://schemas.microsoft.com/office/word/2010/wordprocessingInk" xmlns:wne="http://schemas.microsoft.com/office/word/2006/wordml" xmlns:wps="http://schemas.microsoft.com/office/word/2010/wordprocessingShape" xmlns:cx="http://schemas.microsoft.com/office/drawing/2014/chartex" xmlns:cx1="http://schemas.microsoft.com/office/drawing/2015/9/8/chartex" xmlns:cx2="http://schemas.microsoft.com/office/drawing/2015/10/21/chartex" xmlns:cx3="http://schemas.microsoft.com/office/drawing/2016/5/9/chartex" xmlns:cx4="http://schemas.microsoft.com/office/drawing/2016/5/10/chartex" xmlns:cx5="http://schemas.microsoft.com/office/drawing/2016/5/11/chartex" xmlns:cx6="http://schemas.microsoft.com/office/drawing/2016/5/12/chartex" xmlns:cx7="http://schemas.microsoft.com/office/drawing/2016/5/13/chartex" xmlns:cx8="http://schemas.microsoft.com/office/drawing/2016/5/14/chartex" xmlns:w16cid="http://schemas.microsoft.com/office/word/2016/wordml/cid" xmlns:w16se="http://schemas.microsoft.com/office/word/2015/wordml/symex">
+  <w:p>
+    <w:r>
+      <w:drawing>
+        <wp:anchor distT="0" distB="0" distL="0" distR="0" simplePos="0" allowOverlap="1" behindDoc="1" locked="0" layoutInCell="1" relativeHeight="171450">
+          <wp:simplePos x="0" y="0"/>
+          <wp:positionH relativeFrom="page">
+            <wp:posOffset>655320</wp:posOffset>
+          </wp:positionH>
+          <wp:positionV relativeFrom="page">
+            <wp:posOffset>426720</wp:posOffset>
+          </wp:positionV>
+          <wp:extent cx="6753225" cy="171450"/>
+          <wp:effectExtent t="0" r="0" b="0" l="0"/>
+          <wp:wrapNone/>
+          <wp:docPr id="1" name="" descr="" title=""/>
+          <wp:cNvGraphicFramePr>
+            <a:graphicFrameLocks xmlns:a="http://schemas.openxmlformats.org/drawingml/2006/main" noChangeAspect="1"/>
+          </wp:cNvGraphicFramePr>
+          <a:graphic xmlns:a="http://schemas.openxmlformats.org/drawingml/2006/main">
+            <a:graphicData uri="http://schemas.openxmlformats.org/drawingml/2006/picture">
+              <pic:pic xmlns:pic="http://schemas.openxmlformats.org/drawingml/2006/picture">
+                <pic:nvPicPr>
+                  <pic:cNvPr id="0" name="" descr=""/>
+                  <pic:cNvPicPr>
+                    <a:picLocks noChangeAspect="1" noChangeArrowheads="1"/>
+                  </pic:cNvPicPr>
+                </pic:nvPicPr>
+                <pic:blipFill>
+                  <a:blip r:embed="rId0" cstate="none"/>
+                  <a:srcRect/>
+                  <a:stretch>
+                    <a:fillRect/>
+                  </a:stretch>
+                </pic:blipFill>
+                <pic:spPr bwMode="auto">
+                  <a:xfrm>
+                    <a:off x="0" y="0"/>
+                    <a:ext cx="6753225" cy="171450"/>
+                  </a:xfrm>
+                  <a:prstGeom prst="rect">
+                    <a:avLst/>
+                  </a:prstGeom>
+                </pic:spPr>
+              </pic:pic>
+            </a:graphicData>
+          </a:graphic>
+        </wp:anchor>
+      </w:drawing>
+    </w:r>
+  </w:p>
+</w:hdr>
 </file>
 
 <file path=word/numbering.xml><?xml version="1.0" encoding="utf-8"?>
@@ -8256,9 +8097,9 @@
   <w:docDefaults>
     <w:rPrDefault>
       <w:rPr>
-        <w:rFonts w:ascii="Calibri" w:cs="Calibri" w:eastAsia="Calibri" w:hAnsi="Calibri"/>
-        <w:sz w:val="21"/>
-        <w:szCs w:val="21"/>
+        <w:rFonts w:ascii="Arial" w:cs="Arial" w:eastAsia="Arial" w:hAnsi="Arial"/>
+        <w:sz w:val="20"/>
+        <w:szCs w:val="20"/>
       </w:rPr>
     </w:rPrDefault>
     <w:pPrDefault/>
@@ -8447,8 +8288,8 @@
       <w:b/>
       <w:bCs/>
       <w:color w:val="1F4E79"/>
-      <w:sz w:val="28"/>
-      <w:szCs w:val="28"/>
+      <w:sz w:val="30"/>
+      <w:szCs w:val="30"/>
     </w:rPr>
   </w:style>
   <w:style w:type="paragraph" w:styleId="Heading2">
@@ -8463,9 +8304,9 @@
       <w:rFonts w:ascii="Calibri" w:cs="Calibri" w:eastAsia="Calibri" w:hAnsi="Calibri"/>
       <w:b/>
       <w:bCs/>
-      <w:color w:val="2E2E2E"/>
-      <w:sz w:val="23"/>
-      <w:szCs w:val="23"/>
+      <w:color w:val="A61C2D"/>
+      <w:sz w:val="24"/>
+      <w:szCs w:val="24"/>
     </w:rPr>
   </w:style>
 </w:styles>

</xml_diff>

<commit_message>
Portada con el formato de la plantilla del curso (logo UNAB)
Co-Authored-By: Claude Opus 5.5 <noreply@anthropic.com>
Claude-Session: https://claude.ai/code/session_016SZyvyW7ARQ2pwvZFzr2GZ
</commit_message>
<xml_diff>
--- a/docs/Informe_Formativa1_IBM_HR.docx
+++ b/docs/Informe_Formativa1_IBM_HR.docx
@@ -4,18 +4,13 @@
   <w:body>
     <w:p>
       <w:pPr>
-        <w:spacing w:after="200"/>
-      </w:pPr>
-    </w:p>
-    <w:p>
-      <w:pPr>
-        <w:spacing w:after="1300"/>
+        <w:spacing w:after="480" w:before="900"/>
         <w:jc w:val="center"/>
       </w:pPr>
       <w:r>
         <w:drawing>
           <wp:inline distT="0" distB="0" distL="0" distR="0">
-            <wp:extent cx="2000250" cy="704850"/>
+            <wp:extent cx="1238250" cy="1028700"/>
             <wp:effectExtent t="0" r="0" b="0" l="0"/>
             <wp:docPr id="1" name="" descr="" title=""/>
             <wp:cNvGraphicFramePr>
@@ -31,7 +26,7 @@
                     </pic:cNvPicPr>
                   </pic:nvPicPr>
                   <pic:blipFill>
-                    <a:blip r:embed="rId11" cstate="none"/>
+                    <a:blip r:embed="rId8" cstate="none"/>
                     <a:srcRect/>
                     <a:stretch>
                       <a:fillRect/>
@@ -40,7 +35,7 @@
                   <pic:spPr bwMode="auto">
                     <a:xfrm>
                       <a:off x="0" y="0"/>
-                      <a:ext cx="2000250" cy="704850"/>
+                      <a:ext cx="1238250" cy="1028700"/>
                     </a:xfrm>
                     <a:prstGeom prst="rect">
                       <a:avLst/>
@@ -55,188 +50,434 @@
     </w:p>
     <w:p>
       <w:pPr>
-        <w:spacing w:after="160" w:line="252" w:lineRule="auto"/>
-        <w:jc w:val="left"/>
+        <w:spacing w:after="60" w:before="0"/>
+        <w:jc w:val="center"/>
       </w:pPr>
       <w:r>
         <w:rPr>
-          <w:rFonts w:ascii="Arial" w:cs="Arial" w:eastAsia="Arial" w:hAnsi="Arial"/>
           <w:b/>
           <w:bCs/>
-          <w:sz w:val="60"/>
-          <w:szCs w:val="60"/>
-        </w:rPr>
-        <w:t xml:space="preserve">MCDI501</w:t>
+          <w:sz w:val="22"/>
+          <w:szCs w:val="22"/>
+        </w:rPr>
+        <w:t xml:space="preserve">MAGÍSTER EN CIENCIA DE DATOS E INTELIGENCIA ARTIFICIAL</w:t>
       </w:r>
     </w:p>
     <w:p>
       <w:pPr>
-        <w:spacing w:after="480" w:line="252" w:lineRule="auto"/>
-        <w:jc w:val="left"/>
+        <w:spacing w:after="900" w:before="0"/>
+        <w:jc w:val="center"/>
       </w:pPr>
       <w:r>
         <w:rPr>
-          <w:rFonts w:ascii="Arial" w:cs="Arial" w:eastAsia="Arial" w:hAnsi="Arial"/>
-          <w:b/>
-          <w:bCs/>
-          <w:sz w:val="54"/>
-          <w:szCs w:val="54"/>
-        </w:rPr>
-        <w:t xml:space="preserve">ESTADÍSTICA COMPUTACIONAL</w:t>
-      </w:r>
-      <w:r>
-        <w:rPr>
-          <w:rFonts w:ascii="Arial" w:cs="Arial" w:eastAsia="Arial" w:hAnsi="Arial"/>
-          <w:b/>
-          <w:bCs/>
-          <w:sz w:val="54"/>
-          <w:szCs w:val="54"/>
-        </w:rPr>
-        <w:br/>
-        <w:t xml:space="preserve">PARA LA TOMA DE DECISIONES</w:t>
+          <w:i/>
+          <w:iCs/>
+          <w:sz w:val="22"/>
+          <w:szCs w:val="22"/>
+        </w:rPr>
+        <w:t xml:space="preserve">MCDI501: Estadística Computacional para la Toma de Decisiones</w:t>
       </w:r>
     </w:p>
     <w:p>
       <w:pPr>
-        <w:spacing w:after="480" w:line="252" w:lineRule="auto"/>
-        <w:jc w:val="left"/>
+        <w:spacing w:after="240" w:before="0"/>
+        <w:jc w:val="center"/>
       </w:pPr>
       <w:r>
         <w:rPr>
-          <w:rFonts w:ascii="Arial" w:cs="Arial" w:eastAsia="Arial" w:hAnsi="Arial"/>
           <w:b/>
           <w:bCs/>
-          <w:sz w:val="50"/>
-          <w:szCs w:val="50"/>
-        </w:rPr>
-        <w:t xml:space="preserve">EVALUACIÓN FORMATIVA 1</w:t>
-      </w:r>
-      <w:r>
-        <w:rPr>
-          <w:rFonts w:ascii="Arial" w:cs="Arial" w:eastAsia="Arial" w:hAnsi="Arial"/>
-          <w:b/>
-          <w:bCs/>
-          <w:sz w:val="50"/>
-          <w:szCs w:val="50"/>
-        </w:rPr>
-        <w:br/>
-        <w:t xml:space="preserve">FASES 1 Y 2</w:t>
+          <w:sz w:val="36"/>
+          <w:szCs w:val="36"/>
+        </w:rPr>
+        <w:t xml:space="preserve">Evaluación Formativa 1</w:t>
       </w:r>
     </w:p>
     <w:p>
       <w:pPr>
-        <w:spacing w:after="480" w:line="252" w:lineRule="auto"/>
-        <w:jc w:val="left"/>
+        <w:spacing w:after="1000" w:before="0"/>
+        <w:jc w:val="center"/>
       </w:pPr>
       <w:r>
         <w:rPr>
-          <w:rFonts w:ascii="Arial" w:cs="Arial" w:eastAsia="Arial" w:hAnsi="Arial"/>
-          <w:b/>
-          <w:bCs/>
-          <w:sz w:val="32"/>
-          <w:szCs w:val="32"/>
-        </w:rPr>
-        <w:t xml:space="preserve">Factores asociados a la salida de empleados</w:t>
-      </w:r>
-      <w:r>
-        <w:rPr>
-          <w:rFonts w:ascii="Arial" w:cs="Arial" w:eastAsia="Arial" w:hAnsi="Arial"/>
-          <w:b/>
-          <w:bCs/>
-          <w:sz w:val="32"/>
-          <w:szCs w:val="32"/>
-        </w:rPr>
-        <w:br/>
-        <w:t xml:space="preserve">en el conjunto IBM HR Employee Attrition</w:t>
+          <w:sz w:val="28"/>
+          <w:szCs w:val="28"/>
+        </w:rPr>
+        <w:t xml:space="preserve">Análisis Exploratorio e Inferencial (práctica)</w:t>
+      </w:r>
+    </w:p>
+    <w:p>
+      <w:pPr>
+        <w:spacing w:after="1300" w:before="0"/>
+        <w:jc w:val="center"/>
+      </w:pPr>
+      <w:r>
+        <w:rPr>
+          <w:i/>
+          <w:iCs/>
+          <w:sz w:val="22"/>
+          <w:szCs w:val="22"/>
+        </w:rPr>
+        <w:t xml:space="preserve">Informe grupal · 0 % (formativa)</w:t>
+      </w:r>
+    </w:p>
+    <w:tbl>
+      <w:tblPr>
+        <w:tblW w:type="dxa" w:w="9070"/>
+        <w:tblBorders>
+          <w:top w:val="single" w:color="auto" w:sz="4"/>
+          <w:left w:val="single" w:color="auto" w:sz="4"/>
+          <w:bottom w:val="single" w:color="auto" w:sz="4"/>
+          <w:right w:val="single" w:color="auto" w:sz="4"/>
+          <w:insideH w:val="single" w:color="auto" w:sz="4"/>
+          <w:insideV w:val="single" w:color="auto" w:sz="4"/>
+        </w:tblBorders>
+      </w:tblPr>
+      <w:tblGrid>
+        <w:gridCol w:w="2700"/>
+        <w:gridCol w:w="6370"/>
+      </w:tblGrid>
+      <w:tr>
+        <w:tc>
+          <w:tcPr>
+            <w:tcW w:type="dxa" w:w="2700"/>
+            <w:tcBorders>
+              <w:top w:val="none" w:color="FFFFFF" w:sz="0"/>
+              <w:left w:val="none" w:color="FFFFFF" w:sz="0"/>
+              <w:bottom w:val="none" w:color="FFFFFF" w:sz="0"/>
+              <w:right w:val="none" w:color="FFFFFF" w:sz="0"/>
+            </w:tcBorders>
+          </w:tcPr>
+          <w:p>
+            <w:pPr>
+              <w:spacing w:after="80"/>
+            </w:pPr>
+            <w:r>
+              <w:rPr>
+                <w:b/>
+                <w:bCs/>
+                <w:sz w:val="22"/>
+                <w:szCs w:val="22"/>
+              </w:rPr>
+              <w:t xml:space="preserve">Título del proyecto:</w:t>
+            </w:r>
+          </w:p>
+        </w:tc>
+        <w:tc>
+          <w:tcPr>
+            <w:tcW w:type="dxa" w:w="6370"/>
+            <w:tcBorders>
+              <w:top w:val="none" w:color="FFFFFF" w:sz="0"/>
+              <w:left w:val="none" w:color="FFFFFF" w:sz="0"/>
+              <w:bottom w:val="none" w:color="FFFFFF" w:sz="0"/>
+              <w:right w:val="none" w:color="FFFFFF" w:sz="0"/>
+            </w:tcBorders>
+          </w:tcPr>
+          <w:p>
+            <w:pPr>
+              <w:spacing w:after="80"/>
+            </w:pPr>
+            <w:r>
+              <w:rPr>
+                <w:sz w:val="24"/>
+                <w:szCs w:val="24"/>
+              </w:rPr>
+              <w:t xml:space="preserve">Factores asociados a la salida de empleados</w:t>
+            </w:r>
+          </w:p>
+        </w:tc>
+      </w:tr>
+      <w:tr>
+        <w:tc>
+          <w:tcPr>
+            <w:tcW w:type="dxa" w:w="2700"/>
+            <w:tcBorders>
+              <w:top w:val="none" w:color="FFFFFF" w:sz="0"/>
+              <w:left w:val="none" w:color="FFFFFF" w:sz="0"/>
+              <w:bottom w:val="none" w:color="FFFFFF" w:sz="0"/>
+              <w:right w:val="none" w:color="FFFFFF" w:sz="0"/>
+            </w:tcBorders>
+          </w:tcPr>
+          <w:p>
+            <w:pPr>
+              <w:spacing w:after="80"/>
+            </w:pPr>
+            <w:r>
+              <w:rPr>
+                <w:b/>
+                <w:bCs/>
+                <w:sz w:val="22"/>
+                <w:szCs w:val="22"/>
+              </w:rPr>
+              <w:t xml:space="preserve">Integrantes:</w:t>
+            </w:r>
+          </w:p>
+        </w:tc>
+        <w:tc>
+          <w:tcPr>
+            <w:tcW w:type="dxa" w:w="6370"/>
+            <w:tcBorders>
+              <w:top w:val="none" w:color="FFFFFF" w:sz="0"/>
+              <w:left w:val="none" w:color="FFFFFF" w:sz="0"/>
+              <w:bottom w:val="none" w:color="FFFFFF" w:sz="0"/>
+              <w:right w:val="none" w:color="FFFFFF" w:sz="0"/>
+            </w:tcBorders>
+          </w:tcPr>
+          <w:p>
+            <w:pPr>
+              <w:spacing w:after="0"/>
+            </w:pPr>
+            <w:r>
+              <w:rPr>
+                <w:sz w:val="24"/>
+                <w:szCs w:val="24"/>
+              </w:rPr>
+              <w:t xml:space="preserve">Hernán Saavedra González</w:t>
+            </w:r>
+          </w:p>
+          <w:p>
+            <w:pPr>
+              <w:spacing w:after="0"/>
+            </w:pPr>
+            <w:r>
+              <w:rPr>
+                <w:sz w:val="24"/>
+                <w:szCs w:val="24"/>
+              </w:rPr>
+              <w:t xml:space="preserve">Lenin Morales Salas</w:t>
+            </w:r>
+          </w:p>
+          <w:p>
+            <w:pPr>
+              <w:spacing w:after="80"/>
+            </w:pPr>
+            <w:r>
+              <w:rPr>
+                <w:sz w:val="24"/>
+                <w:szCs w:val="24"/>
+              </w:rPr>
+              <w:t xml:space="preserve">Rodrigo Gómez Indellicati</w:t>
+            </w:r>
+          </w:p>
+        </w:tc>
+      </w:tr>
+      <w:tr>
+        <w:tc>
+          <w:tcPr>
+            <w:tcW w:type="dxa" w:w="2700"/>
+            <w:tcBorders>
+              <w:top w:val="none" w:color="FFFFFF" w:sz="0"/>
+              <w:left w:val="none" w:color="FFFFFF" w:sz="0"/>
+              <w:bottom w:val="none" w:color="FFFFFF" w:sz="0"/>
+              <w:right w:val="none" w:color="FFFFFF" w:sz="0"/>
+            </w:tcBorders>
+          </w:tcPr>
+          <w:p>
+            <w:pPr>
+              <w:spacing w:after="80"/>
+            </w:pPr>
+            <w:r>
+              <w:rPr>
+                <w:b/>
+                <w:bCs/>
+                <w:sz w:val="22"/>
+                <w:szCs w:val="22"/>
+              </w:rPr>
+              <w:t xml:space="preserve">Dataset:</w:t>
+            </w:r>
+          </w:p>
+        </w:tc>
+        <w:tc>
+          <w:tcPr>
+            <w:tcW w:type="dxa" w:w="6370"/>
+            <w:tcBorders>
+              <w:top w:val="none" w:color="FFFFFF" w:sz="0"/>
+              <w:left w:val="none" w:color="FFFFFF" w:sz="0"/>
+              <w:bottom w:val="none" w:color="FFFFFF" w:sz="0"/>
+              <w:right w:val="none" w:color="FFFFFF" w:sz="0"/>
+            </w:tcBorders>
+          </w:tcPr>
+          <w:p>
+            <w:pPr>
+              <w:spacing w:after="80"/>
+            </w:pPr>
+            <w:r>
+              <w:rPr>
+                <w:sz w:val="24"/>
+                <w:szCs w:val="24"/>
+              </w:rPr>
+              <w:t xml:space="preserve">IBM HR Employee Attrition</w:t>
+            </w:r>
+          </w:p>
+        </w:tc>
+      </w:tr>
+      <w:tr>
+        <w:tc>
+          <w:tcPr>
+            <w:tcW w:type="dxa" w:w="2700"/>
+            <w:tcBorders>
+              <w:top w:val="none" w:color="FFFFFF" w:sz="0"/>
+              <w:left w:val="none" w:color="FFFFFF" w:sz="0"/>
+              <w:bottom w:val="none" w:color="FFFFFF" w:sz="0"/>
+              <w:right w:val="none" w:color="FFFFFF" w:sz="0"/>
+            </w:tcBorders>
+          </w:tcPr>
+          <w:p>
+            <w:pPr>
+              <w:spacing w:after="80"/>
+            </w:pPr>
+            <w:r>
+              <w:rPr>
+                <w:b/>
+                <w:bCs/>
+                <w:sz w:val="22"/>
+                <w:szCs w:val="22"/>
+              </w:rPr>
+              <w:t xml:space="preserve">Docente:</w:t>
+            </w:r>
+          </w:p>
+        </w:tc>
+        <w:tc>
+          <w:tcPr>
+            <w:tcW w:type="dxa" w:w="6370"/>
+            <w:tcBorders>
+              <w:top w:val="none" w:color="FFFFFF" w:sz="0"/>
+              <w:left w:val="none" w:color="FFFFFF" w:sz="0"/>
+              <w:bottom w:val="none" w:color="FFFFFF" w:sz="0"/>
+              <w:right w:val="none" w:color="FFFFFF" w:sz="0"/>
+            </w:tcBorders>
+          </w:tcPr>
+          <w:p>
+            <w:pPr>
+              <w:spacing w:after="80"/>
+            </w:pPr>
+            <w:r>
+              <w:rPr>
+                <w:sz w:val="24"/>
+                <w:szCs w:val="24"/>
+              </w:rPr>
+              <w:t xml:space="preserve">Jean Paul Maidana</w:t>
+            </w:r>
+          </w:p>
+        </w:tc>
+      </w:tr>
+      <w:tr>
+        <w:tc>
+          <w:tcPr>
+            <w:tcW w:type="dxa" w:w="2700"/>
+            <w:tcBorders>
+              <w:top w:val="none" w:color="FFFFFF" w:sz="0"/>
+              <w:left w:val="none" w:color="FFFFFF" w:sz="0"/>
+              <w:bottom w:val="none" w:color="FFFFFF" w:sz="0"/>
+              <w:right w:val="none" w:color="FFFFFF" w:sz="0"/>
+            </w:tcBorders>
+          </w:tcPr>
+          <w:p>
+            <w:pPr>
+              <w:spacing w:after="80"/>
+            </w:pPr>
+            <w:r>
+              <w:rPr>
+                <w:b/>
+                <w:bCs/>
+                <w:sz w:val="22"/>
+                <w:szCs w:val="22"/>
+              </w:rPr>
+              <w:t xml:space="preserve">Fecha:</w:t>
+            </w:r>
+          </w:p>
+        </w:tc>
+        <w:tc>
+          <w:tcPr>
+            <w:tcW w:type="dxa" w:w="6370"/>
+            <w:tcBorders>
+              <w:top w:val="none" w:color="FFFFFF" w:sz="0"/>
+              <w:left w:val="none" w:color="FFFFFF" w:sz="0"/>
+              <w:bottom w:val="none" w:color="FFFFFF" w:sz="0"/>
+              <w:right w:val="none" w:color="FFFFFF" w:sz="0"/>
+            </w:tcBorders>
+          </w:tcPr>
+          <w:p>
+            <w:pPr>
+              <w:spacing w:after="80"/>
+            </w:pPr>
+            <w:r>
+              <w:rPr>
+                <w:sz w:val="24"/>
+                <w:szCs w:val="24"/>
+              </w:rPr>
+              <w:t xml:space="preserve">8 de octubre de 2026</w:t>
+            </w:r>
+          </w:p>
+        </w:tc>
+      </w:tr>
+      <w:tr>
+        <w:tc>
+          <w:tcPr>
+            <w:tcW w:type="dxa" w:w="2700"/>
+            <w:tcBorders>
+              <w:top w:val="none" w:color="FFFFFF" w:sz="0"/>
+              <w:left w:val="none" w:color="FFFFFF" w:sz="0"/>
+              <w:bottom w:val="none" w:color="FFFFFF" w:sz="0"/>
+              <w:right w:val="none" w:color="FFFFFF" w:sz="0"/>
+            </w:tcBorders>
+          </w:tcPr>
+          <w:p>
+            <w:pPr>
+              <w:spacing w:after="80"/>
+            </w:pPr>
+            <w:r>
+              <w:rPr>
+                <w:b/>
+                <w:bCs/>
+                <w:sz w:val="22"/>
+                <w:szCs w:val="22"/>
+              </w:rPr>
+              <w:t xml:space="preserve">Repositorio GitHub:</w:t>
+            </w:r>
+          </w:p>
+        </w:tc>
+        <w:tc>
+          <w:tcPr>
+            <w:tcW w:type="dxa" w:w="6370"/>
+            <w:tcBorders>
+              <w:top w:val="none" w:color="FFFFFF" w:sz="0"/>
+              <w:left w:val="none" w:color="FFFFFF" w:sz="0"/>
+              <w:bottom w:val="none" w:color="FFFFFF" w:sz="0"/>
+              <w:right w:val="none" w:color="FFFFFF" w:sz="0"/>
+            </w:tcBorders>
+          </w:tcPr>
+          <w:p>
+            <w:pPr>
+              <w:spacing w:after="80"/>
+            </w:pPr>
+            <w:r>
+              <w:rPr>
+                <w:sz w:val="24"/>
+                <w:szCs w:val="24"/>
+              </w:rPr>
+              <w:t xml:space="preserve">https://github.com/lmoralessalas-dot/MCDI501-IBM-HR-Attrition</w:t>
+            </w:r>
+          </w:p>
+        </w:tc>
+      </w:tr>
+    </w:tbl>
+    <w:p>
+      <w:r>
+        <w:br w:type="page"/>
       </w:r>
     </w:p>
     <w:p>
       <w:pPr>
         <w:spacing w:after="120"/>
-        <w:jc w:val="left"/>
       </w:pPr>
       <w:r>
         <w:rPr>
-          <w:rFonts w:ascii="Arial" w:cs="Arial" w:eastAsia="Arial" w:hAnsi="Arial"/>
-          <w:sz w:val="18"/>
-          <w:szCs w:val="18"/>
-        </w:rPr>
-        <w:t xml:space="preserve">Integrantes: Hernán Saavedra González · Lenin Morales Salas · Rodrigo Gómez Indellicati</w:t>
-      </w:r>
-    </w:p>
-    <w:p>
-      <w:pPr>
-        <w:spacing w:after="120"/>
-        <w:jc w:val="left"/>
-      </w:pPr>
-      <w:r>
-        <w:rPr>
-          <w:rFonts w:ascii="Arial" w:cs="Arial" w:eastAsia="Arial" w:hAnsi="Arial"/>
-          <w:sz w:val="18"/>
-          <w:szCs w:val="18"/>
-        </w:rPr>
-        <w:t xml:space="preserve">Docente: Jean Paul Maidana</w:t>
-      </w:r>
-    </w:p>
-    <w:p>
-      <w:pPr>
-        <w:spacing w:after="120"/>
-        <w:jc w:val="left"/>
-      </w:pPr>
-      <w:r>
-        <w:rPr>
-          <w:rFonts w:ascii="Arial" w:cs="Arial" w:eastAsia="Arial" w:hAnsi="Arial"/>
-          <w:sz w:val="18"/>
-          <w:szCs w:val="18"/>
-        </w:rPr>
-        <w:t xml:space="preserve">Curso: MCDI501 · Estadística Computacional para la Toma de Decisiones</w:t>
-      </w:r>
-    </w:p>
-    <w:p>
-      <w:pPr>
-        <w:spacing w:after="120"/>
-        <w:jc w:val="left"/>
-      </w:pPr>
-      <w:r>
-        <w:rPr>
-          <w:rFonts w:ascii="Arial" w:cs="Arial" w:eastAsia="Arial" w:hAnsi="Arial"/>
-          <w:sz w:val="18"/>
-          <w:szCs w:val="18"/>
-        </w:rPr>
-        <w:t xml:space="preserve">Fecha: octubre de 2026</w:t>
-      </w:r>
-    </w:p>
-    <w:p>
-      <w:pPr>
-        <w:spacing w:after="120"/>
-        <w:jc w:val="left"/>
-      </w:pPr>
-      <w:r>
-        <w:rPr>
-          <w:rFonts w:ascii="Arial" w:cs="Arial" w:eastAsia="Arial" w:hAnsi="Arial"/>
-          <w:sz w:val="18"/>
-          <w:szCs w:val="18"/>
-        </w:rPr>
-        <w:t xml:space="preserve">Repositorio: https://github.com/lmoralessalas-dot/MCDI501-IBM-HR-Attrition</w:t>
-      </w:r>
-    </w:p>
-    <w:p>
-      <w:r>
-        <w:br w:type="page"/>
-      </w:r>
-    </w:p>
-    <w:p>
-      <w:pPr>
-        <w:spacing w:after="160" w:before="200"/>
-      </w:pPr>
-      <w:r>
-        <w:rPr>
-          <w:rFonts w:ascii="Calibri" w:cs="Calibri" w:eastAsia="Calibri" w:hAnsi="Calibri"/>
           <w:b/>
           <w:bCs/>
           <w:color w:val="1F4E79"/>
-          <w:sz w:val="30"/>
-          <w:szCs w:val="30"/>
+          <w:sz w:val="28"/>
+          <w:szCs w:val="28"/>
         </w:rPr>
         <w:t xml:space="preserve">Índice</w:t>
       </w:r>
@@ -306,7 +547,7 @@
     </w:p>
     <w:tbl>
       <w:tblPr>
-        <w:tblW w:type="dxa" w:w="10080"/>
+        <w:tblW w:type="dxa" w:w="9070"/>
         <w:tblBorders>
           <w:top w:val="single" w:color="auto" w:sz="4"/>
           <w:left w:val="single" w:color="auto" w:sz="4"/>
@@ -317,12 +558,12 @@
         </w:tblBorders>
       </w:tblPr>
       <w:tblGrid>
-        <w:gridCol w:w="10080"/>
+        <w:gridCol w:w="9070"/>
       </w:tblGrid>
       <w:tr>
         <w:tc>
           <w:tcPr>
-            <w:tcW w:type="dxa" w:w="10080"/>
+            <w:tcW w:type="dxa" w:w="9070"/>
             <w:tcBorders>
               <w:top w:val="none" w:color="FFFFFF" w:sz="0"/>
               <w:left w:val="single" w:color="1F4E79" w:sz="24"/>
@@ -373,7 +614,7 @@
     </w:p>
     <w:tbl>
       <w:tblPr>
-        <w:tblW w:type="dxa" w:w="10080"/>
+        <w:tblW w:type="dxa" w:w="9070"/>
         <w:jc w:val="center"/>
         <w:tblBorders>
           <w:top w:val="single" w:color="auto" w:sz="4"/>
@@ -385,8 +626,8 @@
         </w:tblBorders>
       </w:tblPr>
       <w:tblGrid>
-        <w:gridCol w:w="2778"/>
-        <w:gridCol w:w="7302"/>
+        <w:gridCol w:w="2500"/>
+        <w:gridCol w:w="6570"/>
       </w:tblGrid>
       <w:tr>
         <w:trPr>
@@ -394,7 +635,7 @@
         </w:trPr>
         <w:tc>
           <w:tcPr>
-            <w:tcW w:type="dxa" w:w="2778"/>
+            <w:tcW w:type="dxa" w:w="2500"/>
             <w:tcBorders>
               <w:top w:val="single" w:color="BFBFBF" w:sz="4"/>
               <w:left w:val="none" w:color="FFFFFF" w:sz="0"/>
@@ -429,7 +670,7 @@
         </w:tc>
         <w:tc>
           <w:tcPr>
-            <w:tcW w:type="dxa" w:w="7302"/>
+            <w:tcW w:type="dxa" w:w="6570"/>
             <w:tcBorders>
               <w:top w:val="single" w:color="BFBFBF" w:sz="4"/>
               <w:left w:val="none" w:color="FFFFFF" w:sz="0"/>
@@ -469,7 +710,7 @@
         </w:trPr>
         <w:tc>
           <w:tcPr>
-            <w:tcW w:type="dxa" w:w="2778"/>
+            <w:tcW w:type="dxa" w:w="2500"/>
             <w:tcBorders>
               <w:top w:val="single" w:color="BFBFBF" w:sz="4"/>
               <w:left w:val="none" w:color="FFFFFF" w:sz="0"/>
@@ -503,7 +744,7 @@
         </w:tc>
         <w:tc>
           <w:tcPr>
-            <w:tcW w:type="dxa" w:w="7302"/>
+            <w:tcW w:type="dxa" w:w="6570"/>
             <w:tcBorders>
               <w:top w:val="single" w:color="BFBFBF" w:sz="4"/>
               <w:left w:val="none" w:color="FFFFFF" w:sz="0"/>
@@ -553,7 +794,7 @@
         </w:trPr>
         <w:tc>
           <w:tcPr>
-            <w:tcW w:type="dxa" w:w="2778"/>
+            <w:tcW w:type="dxa" w:w="2500"/>
             <w:tcBorders>
               <w:top w:val="single" w:color="BFBFBF" w:sz="4"/>
               <w:left w:val="none" w:color="FFFFFF" w:sz="0"/>
@@ -587,7 +828,7 @@
         </w:tc>
         <w:tc>
           <w:tcPr>
-            <w:tcW w:type="dxa" w:w="7302"/>
+            <w:tcW w:type="dxa" w:w="6570"/>
             <w:tcBorders>
               <w:top w:val="single" w:color="BFBFBF" w:sz="4"/>
               <w:left w:val="none" w:color="FFFFFF" w:sz="0"/>
@@ -626,7 +867,7 @@
         </w:trPr>
         <w:tc>
           <w:tcPr>
-            <w:tcW w:type="dxa" w:w="2778"/>
+            <w:tcW w:type="dxa" w:w="2500"/>
             <w:tcBorders>
               <w:top w:val="single" w:color="BFBFBF" w:sz="4"/>
               <w:left w:val="none" w:color="FFFFFF" w:sz="0"/>
@@ -660,7 +901,7 @@
         </w:tc>
         <w:tc>
           <w:tcPr>
-            <w:tcW w:type="dxa" w:w="7302"/>
+            <w:tcW w:type="dxa" w:w="6570"/>
             <w:tcBorders>
               <w:top w:val="single" w:color="BFBFBF" w:sz="4"/>
               <w:left w:val="none" w:color="FFFFFF" w:sz="0"/>
@@ -699,7 +940,7 @@
         </w:trPr>
         <w:tc>
           <w:tcPr>
-            <w:tcW w:type="dxa" w:w="2778"/>
+            <w:tcW w:type="dxa" w:w="2500"/>
             <w:tcBorders>
               <w:top w:val="single" w:color="BFBFBF" w:sz="4"/>
               <w:left w:val="none" w:color="FFFFFF" w:sz="0"/>
@@ -733,7 +974,7 @@
         </w:tc>
         <w:tc>
           <w:tcPr>
-            <w:tcW w:type="dxa" w:w="7302"/>
+            <w:tcW w:type="dxa" w:w="6570"/>
             <w:tcBorders>
               <w:top w:val="single" w:color="BFBFBF" w:sz="4"/>
               <w:left w:val="none" w:color="FFFFFF" w:sz="0"/>
@@ -783,7 +1024,7 @@
         </w:trPr>
         <w:tc>
           <w:tcPr>
-            <w:tcW w:type="dxa" w:w="2778"/>
+            <w:tcW w:type="dxa" w:w="2500"/>
             <w:tcBorders>
               <w:top w:val="single" w:color="BFBFBF" w:sz="4"/>
               <w:left w:val="none" w:color="FFFFFF" w:sz="0"/>
@@ -817,7 +1058,7 @@
         </w:tc>
         <w:tc>
           <w:tcPr>
-            <w:tcW w:type="dxa" w:w="7302"/>
+            <w:tcW w:type="dxa" w:w="6570"/>
             <w:tcBorders>
               <w:top w:val="single" w:color="BFBFBF" w:sz="4"/>
               <w:left w:val="none" w:color="FFFFFF" w:sz="0"/>
@@ -876,7 +1117,7 @@
         </w:trPr>
         <w:tc>
           <w:tcPr>
-            <w:tcW w:type="dxa" w:w="2778"/>
+            <w:tcW w:type="dxa" w:w="2500"/>
             <w:tcBorders>
               <w:top w:val="single" w:color="BFBFBF" w:sz="4"/>
               <w:left w:val="none" w:color="FFFFFF" w:sz="0"/>
@@ -910,7 +1151,7 @@
         </w:tc>
         <w:tc>
           <w:tcPr>
-            <w:tcW w:type="dxa" w:w="7302"/>
+            <w:tcW w:type="dxa" w:w="6570"/>
             <w:tcBorders>
               <w:top w:val="single" w:color="BFBFBF" w:sz="4"/>
               <w:left w:val="none" w:color="FFFFFF" w:sz="0"/>
@@ -1010,7 +1251,7 @@
     </w:p>
     <w:tbl>
       <w:tblPr>
-        <w:tblW w:type="dxa" w:w="10080"/>
+        <w:tblW w:type="dxa" w:w="9070"/>
         <w:jc w:val="center"/>
         <w:tblBorders>
           <w:top w:val="single" w:color="auto" w:sz="4"/>
@@ -1022,9 +1263,9 @@
         </w:tblBorders>
       </w:tblPr>
       <w:tblGrid>
-        <w:gridCol w:w="2389"/>
-        <w:gridCol w:w="7135"/>
-        <w:gridCol w:w="556"/>
+        <w:gridCol w:w="2150"/>
+        <w:gridCol w:w="6420"/>
+        <w:gridCol w:w="500"/>
       </w:tblGrid>
       <w:tr>
         <w:trPr>
@@ -1032,7 +1273,7 @@
         </w:trPr>
         <w:tc>
           <w:tcPr>
-            <w:tcW w:type="dxa" w:w="2389"/>
+            <w:tcW w:type="dxa" w:w="2150"/>
             <w:tcBorders>
               <w:top w:val="single" w:color="BFBFBF" w:sz="4"/>
               <w:left w:val="none" w:color="FFFFFF" w:sz="0"/>
@@ -1067,7 +1308,7 @@
         </w:tc>
         <w:tc>
           <w:tcPr>
-            <w:tcW w:type="dxa" w:w="7135"/>
+            <w:tcW w:type="dxa" w:w="6420"/>
             <w:tcBorders>
               <w:top w:val="single" w:color="BFBFBF" w:sz="4"/>
               <w:left w:val="none" w:color="FFFFFF" w:sz="0"/>
@@ -1102,7 +1343,7 @@
         </w:tc>
         <w:tc>
           <w:tcPr>
-            <w:tcW w:type="dxa" w:w="556"/>
+            <w:tcW w:type="dxa" w:w="500"/>
             <w:tcBorders>
               <w:top w:val="single" w:color="BFBFBF" w:sz="4"/>
               <w:left w:val="none" w:color="FFFFFF" w:sz="0"/>
@@ -1142,7 +1383,7 @@
         </w:trPr>
         <w:tc>
           <w:tcPr>
-            <w:tcW w:type="dxa" w:w="2389"/>
+            <w:tcW w:type="dxa" w:w="2150"/>
             <w:tcBorders>
               <w:top w:val="single" w:color="BFBFBF" w:sz="4"/>
               <w:left w:val="none" w:color="FFFFFF" w:sz="0"/>
@@ -1176,7 +1417,7 @@
         </w:tc>
         <w:tc>
           <w:tcPr>
-            <w:tcW w:type="dxa" w:w="7135"/>
+            <w:tcW w:type="dxa" w:w="6420"/>
             <w:tcBorders>
               <w:top w:val="single" w:color="BFBFBF" w:sz="4"/>
               <w:left w:val="none" w:color="FFFFFF" w:sz="0"/>
@@ -1237,7 +1478,7 @@
         </w:tc>
         <w:tc>
           <w:tcPr>
-            <w:tcW w:type="dxa" w:w="556"/>
+            <w:tcW w:type="dxa" w:w="500"/>
             <w:tcBorders>
               <w:top w:val="single" w:color="BFBFBF" w:sz="4"/>
               <w:left w:val="none" w:color="FFFFFF" w:sz="0"/>
@@ -1276,7 +1517,7 @@
         </w:trPr>
         <w:tc>
           <w:tcPr>
-            <w:tcW w:type="dxa" w:w="2389"/>
+            <w:tcW w:type="dxa" w:w="2150"/>
             <w:tcBorders>
               <w:top w:val="single" w:color="BFBFBF" w:sz="4"/>
               <w:left w:val="none" w:color="FFFFFF" w:sz="0"/>
@@ -1310,7 +1551,7 @@
         </w:tc>
         <w:tc>
           <w:tcPr>
-            <w:tcW w:type="dxa" w:w="7135"/>
+            <w:tcW w:type="dxa" w:w="6420"/>
             <w:tcBorders>
               <w:top w:val="single" w:color="BFBFBF" w:sz="4"/>
               <w:left w:val="none" w:color="FFFFFF" w:sz="0"/>
@@ -1353,7 +1594,7 @@
         </w:tc>
         <w:tc>
           <w:tcPr>
-            <w:tcW w:type="dxa" w:w="556"/>
+            <w:tcW w:type="dxa" w:w="500"/>
             <w:tcBorders>
               <w:top w:val="single" w:color="BFBFBF" w:sz="4"/>
               <w:left w:val="none" w:color="FFFFFF" w:sz="0"/>
@@ -1392,7 +1633,7 @@
         </w:trPr>
         <w:tc>
           <w:tcPr>
-            <w:tcW w:type="dxa" w:w="2389"/>
+            <w:tcW w:type="dxa" w:w="2150"/>
             <w:tcBorders>
               <w:top w:val="single" w:color="BFBFBF" w:sz="4"/>
               <w:left w:val="none" w:color="FFFFFF" w:sz="0"/>
@@ -1426,7 +1667,7 @@
         </w:tc>
         <w:tc>
           <w:tcPr>
-            <w:tcW w:type="dxa" w:w="7135"/>
+            <w:tcW w:type="dxa" w:w="6420"/>
             <w:tcBorders>
               <w:top w:val="single" w:color="BFBFBF" w:sz="4"/>
               <w:left w:val="none" w:color="FFFFFF" w:sz="0"/>
@@ -1460,7 +1701,7 @@
         </w:tc>
         <w:tc>
           <w:tcPr>
-            <w:tcW w:type="dxa" w:w="556"/>
+            <w:tcW w:type="dxa" w:w="500"/>
             <w:tcBorders>
               <w:top w:val="single" w:color="BFBFBF" w:sz="4"/>
               <w:left w:val="none" w:color="FFFFFF" w:sz="0"/>
@@ -1499,7 +1740,7 @@
         </w:trPr>
         <w:tc>
           <w:tcPr>
-            <w:tcW w:type="dxa" w:w="2389"/>
+            <w:tcW w:type="dxa" w:w="2150"/>
             <w:tcBorders>
               <w:top w:val="single" w:color="BFBFBF" w:sz="4"/>
               <w:left w:val="none" w:color="FFFFFF" w:sz="0"/>
@@ -1533,7 +1774,7 @@
         </w:tc>
         <w:tc>
           <w:tcPr>
-            <w:tcW w:type="dxa" w:w="7135"/>
+            <w:tcW w:type="dxa" w:w="6420"/>
             <w:tcBorders>
               <w:top w:val="single" w:color="BFBFBF" w:sz="4"/>
               <w:left w:val="none" w:color="FFFFFF" w:sz="0"/>
@@ -1594,7 +1835,7 @@
         </w:tc>
         <w:tc>
           <w:tcPr>
-            <w:tcW w:type="dxa" w:w="556"/>
+            <w:tcW w:type="dxa" w:w="500"/>
             <w:tcBorders>
               <w:top w:val="single" w:color="BFBFBF" w:sz="4"/>
               <w:left w:val="none" w:color="FFFFFF" w:sz="0"/>
@@ -1633,7 +1874,7 @@
         </w:trPr>
         <w:tc>
           <w:tcPr>
-            <w:tcW w:type="dxa" w:w="2389"/>
+            <w:tcW w:type="dxa" w:w="2150"/>
             <w:tcBorders>
               <w:top w:val="single" w:color="BFBFBF" w:sz="4"/>
               <w:left w:val="none" w:color="FFFFFF" w:sz="0"/>
@@ -1667,7 +1908,7 @@
         </w:tc>
         <w:tc>
           <w:tcPr>
-            <w:tcW w:type="dxa" w:w="7135"/>
+            <w:tcW w:type="dxa" w:w="6420"/>
             <w:tcBorders>
               <w:top w:val="single" w:color="BFBFBF" w:sz="4"/>
               <w:left w:val="none" w:color="FFFFFF" w:sz="0"/>
@@ -1701,7 +1942,7 @@
         </w:tc>
         <w:tc>
           <w:tcPr>
-            <w:tcW w:type="dxa" w:w="556"/>
+            <w:tcW w:type="dxa" w:w="500"/>
             <w:tcBorders>
               <w:top w:val="single" w:color="BFBFBF" w:sz="4"/>
               <w:left w:val="none" w:color="FFFFFF" w:sz="0"/>
@@ -1825,7 +2066,7 @@
     </w:p>
     <w:tbl>
       <w:tblPr>
-        <w:tblW w:type="dxa" w:w="10080"/>
+        <w:tblW w:type="dxa" w:w="9070"/>
         <w:jc w:val="center"/>
         <w:tblBorders>
           <w:top w:val="single" w:color="auto" w:sz="4"/>
@@ -1837,14 +2078,14 @@
         </w:tblBorders>
       </w:tblPr>
       <w:tblGrid>
-        <w:gridCol w:w="2523"/>
-        <w:gridCol w:w="711"/>
-        <w:gridCol w:w="1089"/>
+        <w:gridCol w:w="2270"/>
+        <w:gridCol w:w="640"/>
+        <w:gridCol w:w="980"/>
+        <w:gridCol w:w="900"/>
+        <w:gridCol w:w="900"/>
+        <w:gridCol w:w="800"/>
+        <w:gridCol w:w="1580"/>
         <w:gridCol w:w="1000"/>
-        <w:gridCol w:w="1000"/>
-        <w:gridCol w:w="889"/>
-        <w:gridCol w:w="1756"/>
-        <w:gridCol w:w="1112"/>
       </w:tblGrid>
       <w:tr>
         <w:trPr>
@@ -1852,7 +2093,7 @@
         </w:trPr>
         <w:tc>
           <w:tcPr>
-            <w:tcW w:type="dxa" w:w="2523"/>
+            <w:tcW w:type="dxa" w:w="2270"/>
             <w:tcBorders>
               <w:top w:val="single" w:color="BFBFBF" w:sz="4"/>
               <w:left w:val="none" w:color="FFFFFF" w:sz="0"/>
@@ -1887,7 +2128,7 @@
         </w:tc>
         <w:tc>
           <w:tcPr>
-            <w:tcW w:type="dxa" w:w="711"/>
+            <w:tcW w:type="dxa" w:w="640"/>
             <w:tcBorders>
               <w:top w:val="single" w:color="BFBFBF" w:sz="4"/>
               <w:left w:val="none" w:color="FFFFFF" w:sz="0"/>
@@ -1922,7 +2163,7 @@
         </w:tc>
         <w:tc>
           <w:tcPr>
-            <w:tcW w:type="dxa" w:w="1089"/>
+            <w:tcW w:type="dxa" w:w="980"/>
             <w:tcBorders>
               <w:top w:val="single" w:color="BFBFBF" w:sz="4"/>
               <w:left w:val="none" w:color="FFFFFF" w:sz="0"/>
@@ -1957,7 +2198,7 @@
         </w:tc>
         <w:tc>
           <w:tcPr>
-            <w:tcW w:type="dxa" w:w="1000"/>
+            <w:tcW w:type="dxa" w:w="900"/>
             <w:tcBorders>
               <w:top w:val="single" w:color="BFBFBF" w:sz="4"/>
               <w:left w:val="none" w:color="FFFFFF" w:sz="0"/>
@@ -1992,7 +2233,7 @@
         </w:tc>
         <w:tc>
           <w:tcPr>
-            <w:tcW w:type="dxa" w:w="1000"/>
+            <w:tcW w:type="dxa" w:w="900"/>
             <w:tcBorders>
               <w:top w:val="single" w:color="BFBFBF" w:sz="4"/>
               <w:left w:val="none" w:color="FFFFFF" w:sz="0"/>
@@ -2027,7 +2268,7 @@
         </w:tc>
         <w:tc>
           <w:tcPr>
-            <w:tcW w:type="dxa" w:w="889"/>
+            <w:tcW w:type="dxa" w:w="800"/>
             <w:tcBorders>
               <w:top w:val="single" w:color="BFBFBF" w:sz="4"/>
               <w:left w:val="none" w:color="FFFFFF" w:sz="0"/>
@@ -2062,7 +2303,7 @@
         </w:tc>
         <w:tc>
           <w:tcPr>
-            <w:tcW w:type="dxa" w:w="1756"/>
+            <w:tcW w:type="dxa" w:w="1580"/>
             <w:tcBorders>
               <w:top w:val="single" w:color="BFBFBF" w:sz="4"/>
               <w:left w:val="none" w:color="FFFFFF" w:sz="0"/>
@@ -2097,7 +2338,7 @@
         </w:tc>
         <w:tc>
           <w:tcPr>
-            <w:tcW w:type="dxa" w:w="1112"/>
+            <w:tcW w:type="dxa" w:w="1000"/>
             <w:tcBorders>
               <w:top w:val="single" w:color="BFBFBF" w:sz="4"/>
               <w:left w:val="none" w:color="FFFFFF" w:sz="0"/>
@@ -2137,7 +2378,7 @@
         </w:trPr>
         <w:tc>
           <w:tcPr>
-            <w:tcW w:type="dxa" w:w="2523"/>
+            <w:tcW w:type="dxa" w:w="2270"/>
             <w:tcBorders>
               <w:top w:val="single" w:color="BFBFBF" w:sz="4"/>
               <w:left w:val="none" w:color="FFFFFF" w:sz="0"/>
@@ -2171,7 +2412,7 @@
         </w:tc>
         <w:tc>
           <w:tcPr>
-            <w:tcW w:type="dxa" w:w="711"/>
+            <w:tcW w:type="dxa" w:w="640"/>
             <w:tcBorders>
               <w:top w:val="single" w:color="BFBFBF" w:sz="4"/>
               <w:left w:val="none" w:color="FFFFFF" w:sz="0"/>
@@ -2205,7 +2446,7 @@
         </w:tc>
         <w:tc>
           <w:tcPr>
-            <w:tcW w:type="dxa" w:w="1089"/>
+            <w:tcW w:type="dxa" w:w="980"/>
             <w:tcBorders>
               <w:top w:val="single" w:color="BFBFBF" w:sz="4"/>
               <w:left w:val="none" w:color="FFFFFF" w:sz="0"/>
@@ -2239,143 +2480,143 @@
         </w:tc>
         <w:tc>
           <w:tcPr>
+            <w:tcW w:type="dxa" w:w="900"/>
+            <w:tcBorders>
+              <w:top w:val="single" w:color="BFBFBF" w:sz="4"/>
+              <w:left w:val="none" w:color="FFFFFF" w:sz="0"/>
+              <w:bottom w:val="single" w:color="BFBFBF" w:sz="4"/>
+              <w:right w:val="none" w:color="FFFFFF" w:sz="0"/>
+            </w:tcBorders>
+            <w:tcMar>
+              <w:top w:type="dxa" w:w="40"/>
+              <w:left w:type="dxa" w:w="90"/>
+              <w:bottom w:type="dxa" w:w="40"/>
+              <w:right w:type="dxa" w:w="90"/>
+            </w:tcMar>
+            <w:vAlign w:val="center"/>
+          </w:tcPr>
+          <w:p>
+            <w:pPr>
+              <w:keepNext/>
+              <w:spacing w:after="0"/>
+              <w:jc w:val="center"/>
+            </w:pPr>
+            <w:r>
+              <w:rPr>
+                <w:b w:val="false"/>
+                <w:bCs w:val="false"/>
+                <w:sz w:val="18"/>
+                <w:szCs w:val="18"/>
+              </w:rPr>
+              <w:t xml:space="preserve">36</w:t>
+            </w:r>
+          </w:p>
+        </w:tc>
+        <w:tc>
+          <w:tcPr>
+            <w:tcW w:type="dxa" w:w="900"/>
+            <w:tcBorders>
+              <w:top w:val="single" w:color="BFBFBF" w:sz="4"/>
+              <w:left w:val="none" w:color="FFFFFF" w:sz="0"/>
+              <w:bottom w:val="single" w:color="BFBFBF" w:sz="4"/>
+              <w:right w:val="none" w:color="FFFFFF" w:sz="0"/>
+            </w:tcBorders>
+            <w:tcMar>
+              <w:top w:type="dxa" w:w="40"/>
+              <w:left w:type="dxa" w:w="90"/>
+              <w:bottom w:type="dxa" w:w="40"/>
+              <w:right w:type="dxa" w:w="90"/>
+            </w:tcMar>
+            <w:vAlign w:val="center"/>
+          </w:tcPr>
+          <w:p>
+            <w:pPr>
+              <w:keepNext/>
+              <w:spacing w:after="0"/>
+              <w:jc w:val="center"/>
+            </w:pPr>
+            <w:r>
+              <w:rPr>
+                <w:b w:val="false"/>
+                <w:bCs w:val="false"/>
+                <w:sz w:val="18"/>
+                <w:szCs w:val="18"/>
+              </w:rPr>
+              <w:t xml:space="preserve">9,14</w:t>
+            </w:r>
+          </w:p>
+        </w:tc>
+        <w:tc>
+          <w:tcPr>
+            <w:tcW w:type="dxa" w:w="800"/>
+            <w:tcBorders>
+              <w:top w:val="single" w:color="BFBFBF" w:sz="4"/>
+              <w:left w:val="none" w:color="FFFFFF" w:sz="0"/>
+              <w:bottom w:val="single" w:color="BFBFBF" w:sz="4"/>
+              <w:right w:val="none" w:color="FFFFFF" w:sz="0"/>
+            </w:tcBorders>
+            <w:tcMar>
+              <w:top w:type="dxa" w:w="40"/>
+              <w:left w:type="dxa" w:w="90"/>
+              <w:bottom w:type="dxa" w:w="40"/>
+              <w:right w:type="dxa" w:w="90"/>
+            </w:tcMar>
+            <w:vAlign w:val="center"/>
+          </w:tcPr>
+          <w:p>
+            <w:pPr>
+              <w:keepNext/>
+              <w:spacing w:after="0"/>
+              <w:jc w:val="center"/>
+            </w:pPr>
+            <w:r>
+              <w:rPr>
+                <w:b w:val="false"/>
+                <w:bCs w:val="false"/>
+                <w:sz w:val="18"/>
+                <w:szCs w:val="18"/>
+              </w:rPr>
+              <w:t xml:space="preserve">24,7</w:t>
+            </w:r>
+          </w:p>
+        </w:tc>
+        <w:tc>
+          <w:tcPr>
+            <w:tcW w:type="dxa" w:w="1580"/>
+            <w:tcBorders>
+              <w:top w:val="single" w:color="BFBFBF" w:sz="4"/>
+              <w:left w:val="none" w:color="FFFFFF" w:sz="0"/>
+              <w:bottom w:val="single" w:color="BFBFBF" w:sz="4"/>
+              <w:right w:val="none" w:color="FFFFFF" w:sz="0"/>
+            </w:tcBorders>
+            <w:tcMar>
+              <w:top w:type="dxa" w:w="40"/>
+              <w:left w:type="dxa" w:w="90"/>
+              <w:bottom w:type="dxa" w:w="40"/>
+              <w:right w:type="dxa" w:w="90"/>
+            </w:tcMar>
+            <w:vAlign w:val="center"/>
+          </w:tcPr>
+          <w:p>
+            <w:pPr>
+              <w:keepNext/>
+              <w:spacing w:after="0"/>
+              <w:jc w:val="center"/>
+            </w:pPr>
+            <w:r>
+              <w:rPr>
+                <w:b w:val="false"/>
+                <w:bCs w:val="false"/>
+                <w:sz w:val="18"/>
+                <w:szCs w:val="18"/>
+              </w:rPr>
+              <w:t xml:space="preserve">18 – 60</w:t>
+            </w:r>
+          </w:p>
+        </w:tc>
+        <w:tc>
+          <w:tcPr>
             <w:tcW w:type="dxa" w:w="1000"/>
-            <w:tcBorders>
-              <w:top w:val="single" w:color="BFBFBF" w:sz="4"/>
-              <w:left w:val="none" w:color="FFFFFF" w:sz="0"/>
-              <w:bottom w:val="single" w:color="BFBFBF" w:sz="4"/>
-              <w:right w:val="none" w:color="FFFFFF" w:sz="0"/>
-            </w:tcBorders>
-            <w:tcMar>
-              <w:top w:type="dxa" w:w="40"/>
-              <w:left w:type="dxa" w:w="90"/>
-              <w:bottom w:type="dxa" w:w="40"/>
-              <w:right w:type="dxa" w:w="90"/>
-            </w:tcMar>
-            <w:vAlign w:val="center"/>
-          </w:tcPr>
-          <w:p>
-            <w:pPr>
-              <w:keepNext/>
-              <w:spacing w:after="0"/>
-              <w:jc w:val="center"/>
-            </w:pPr>
-            <w:r>
-              <w:rPr>
-                <w:b w:val="false"/>
-                <w:bCs w:val="false"/>
-                <w:sz w:val="18"/>
-                <w:szCs w:val="18"/>
-              </w:rPr>
-              <w:t xml:space="preserve">36</w:t>
-            </w:r>
-          </w:p>
-        </w:tc>
-        <w:tc>
-          <w:tcPr>
-            <w:tcW w:type="dxa" w:w="1000"/>
-            <w:tcBorders>
-              <w:top w:val="single" w:color="BFBFBF" w:sz="4"/>
-              <w:left w:val="none" w:color="FFFFFF" w:sz="0"/>
-              <w:bottom w:val="single" w:color="BFBFBF" w:sz="4"/>
-              <w:right w:val="none" w:color="FFFFFF" w:sz="0"/>
-            </w:tcBorders>
-            <w:tcMar>
-              <w:top w:type="dxa" w:w="40"/>
-              <w:left w:type="dxa" w:w="90"/>
-              <w:bottom w:type="dxa" w:w="40"/>
-              <w:right w:type="dxa" w:w="90"/>
-            </w:tcMar>
-            <w:vAlign w:val="center"/>
-          </w:tcPr>
-          <w:p>
-            <w:pPr>
-              <w:keepNext/>
-              <w:spacing w:after="0"/>
-              <w:jc w:val="center"/>
-            </w:pPr>
-            <w:r>
-              <w:rPr>
-                <w:b w:val="false"/>
-                <w:bCs w:val="false"/>
-                <w:sz w:val="18"/>
-                <w:szCs w:val="18"/>
-              </w:rPr>
-              <w:t xml:space="preserve">9,14</w:t>
-            </w:r>
-          </w:p>
-        </w:tc>
-        <w:tc>
-          <w:tcPr>
-            <w:tcW w:type="dxa" w:w="889"/>
-            <w:tcBorders>
-              <w:top w:val="single" w:color="BFBFBF" w:sz="4"/>
-              <w:left w:val="none" w:color="FFFFFF" w:sz="0"/>
-              <w:bottom w:val="single" w:color="BFBFBF" w:sz="4"/>
-              <w:right w:val="none" w:color="FFFFFF" w:sz="0"/>
-            </w:tcBorders>
-            <w:tcMar>
-              <w:top w:type="dxa" w:w="40"/>
-              <w:left w:type="dxa" w:w="90"/>
-              <w:bottom w:type="dxa" w:w="40"/>
-              <w:right w:type="dxa" w:w="90"/>
-            </w:tcMar>
-            <w:vAlign w:val="center"/>
-          </w:tcPr>
-          <w:p>
-            <w:pPr>
-              <w:keepNext/>
-              <w:spacing w:after="0"/>
-              <w:jc w:val="center"/>
-            </w:pPr>
-            <w:r>
-              <w:rPr>
-                <w:b w:val="false"/>
-                <w:bCs w:val="false"/>
-                <w:sz w:val="18"/>
-                <w:szCs w:val="18"/>
-              </w:rPr>
-              <w:t xml:space="preserve">24,7</w:t>
-            </w:r>
-          </w:p>
-        </w:tc>
-        <w:tc>
-          <w:tcPr>
-            <w:tcW w:type="dxa" w:w="1756"/>
-            <w:tcBorders>
-              <w:top w:val="single" w:color="BFBFBF" w:sz="4"/>
-              <w:left w:val="none" w:color="FFFFFF" w:sz="0"/>
-              <w:bottom w:val="single" w:color="BFBFBF" w:sz="4"/>
-              <w:right w:val="none" w:color="FFFFFF" w:sz="0"/>
-            </w:tcBorders>
-            <w:tcMar>
-              <w:top w:type="dxa" w:w="40"/>
-              <w:left w:type="dxa" w:w="90"/>
-              <w:bottom w:type="dxa" w:w="40"/>
-              <w:right w:type="dxa" w:w="90"/>
-            </w:tcMar>
-            <w:vAlign w:val="center"/>
-          </w:tcPr>
-          <w:p>
-            <w:pPr>
-              <w:keepNext/>
-              <w:spacing w:after="0"/>
-              <w:jc w:val="center"/>
-            </w:pPr>
-            <w:r>
-              <w:rPr>
-                <w:b w:val="false"/>
-                <w:bCs w:val="false"/>
-                <w:sz w:val="18"/>
-                <w:szCs w:val="18"/>
-              </w:rPr>
-              <w:t xml:space="preserve">18 – 60</w:t>
-            </w:r>
-          </w:p>
-        </w:tc>
-        <w:tc>
-          <w:tcPr>
-            <w:tcW w:type="dxa" w:w="1112"/>
             <w:tcBorders>
               <w:top w:val="single" w:color="BFBFBF" w:sz="4"/>
               <w:left w:val="none" w:color="FFFFFF" w:sz="0"/>
@@ -2414,7 +2655,7 @@
         </w:trPr>
         <w:tc>
           <w:tcPr>
-            <w:tcW w:type="dxa" w:w="2523"/>
+            <w:tcW w:type="dxa" w:w="2270"/>
             <w:tcBorders>
               <w:top w:val="single" w:color="BFBFBF" w:sz="4"/>
               <w:left w:val="none" w:color="FFFFFF" w:sz="0"/>
@@ -2448,7 +2689,7 @@
         </w:tc>
         <w:tc>
           <w:tcPr>
-            <w:tcW w:type="dxa" w:w="711"/>
+            <w:tcW w:type="dxa" w:w="640"/>
             <w:tcBorders>
               <w:top w:val="single" w:color="BFBFBF" w:sz="4"/>
               <w:left w:val="none" w:color="FFFFFF" w:sz="0"/>
@@ -2482,7 +2723,7 @@
         </w:tc>
         <w:tc>
           <w:tcPr>
-            <w:tcW w:type="dxa" w:w="1089"/>
+            <w:tcW w:type="dxa" w:w="980"/>
             <w:tcBorders>
               <w:top w:val="single" w:color="BFBFBF" w:sz="4"/>
               <w:left w:val="none" w:color="FFFFFF" w:sz="0"/>
@@ -2516,143 +2757,143 @@
         </w:tc>
         <w:tc>
           <w:tcPr>
+            <w:tcW w:type="dxa" w:w="900"/>
+            <w:tcBorders>
+              <w:top w:val="single" w:color="BFBFBF" w:sz="4"/>
+              <w:left w:val="none" w:color="FFFFFF" w:sz="0"/>
+              <w:bottom w:val="single" w:color="BFBFBF" w:sz="4"/>
+              <w:right w:val="none" w:color="FFFFFF" w:sz="0"/>
+            </w:tcBorders>
+            <w:tcMar>
+              <w:top w:type="dxa" w:w="40"/>
+              <w:left w:type="dxa" w:w="90"/>
+              <w:bottom w:type="dxa" w:w="40"/>
+              <w:right w:type="dxa" w:w="90"/>
+            </w:tcMar>
+            <w:vAlign w:val="center"/>
+          </w:tcPr>
+          <w:p>
+            <w:pPr>
+              <w:keepNext/>
+              <w:spacing w:after="0"/>
+              <w:jc w:val="center"/>
+            </w:pPr>
+            <w:r>
+              <w:rPr>
+                <w:b w:val="false"/>
+                <w:bCs w:val="false"/>
+                <w:sz w:val="18"/>
+                <w:szCs w:val="18"/>
+              </w:rPr>
+              <w:t xml:space="preserve">4.960</w:t>
+            </w:r>
+          </w:p>
+        </w:tc>
+        <w:tc>
+          <w:tcPr>
+            <w:tcW w:type="dxa" w:w="900"/>
+            <w:tcBorders>
+              <w:top w:val="single" w:color="BFBFBF" w:sz="4"/>
+              <w:left w:val="none" w:color="FFFFFF" w:sz="0"/>
+              <w:bottom w:val="single" w:color="BFBFBF" w:sz="4"/>
+              <w:right w:val="none" w:color="FFFFFF" w:sz="0"/>
+            </w:tcBorders>
+            <w:tcMar>
+              <w:top w:type="dxa" w:w="40"/>
+              <w:left w:type="dxa" w:w="90"/>
+              <w:bottom w:type="dxa" w:w="40"/>
+              <w:right w:type="dxa" w:w="90"/>
+            </w:tcMar>
+            <w:vAlign w:val="center"/>
+          </w:tcPr>
+          <w:p>
+            <w:pPr>
+              <w:keepNext/>
+              <w:spacing w:after="0"/>
+              <w:jc w:val="center"/>
+            </w:pPr>
+            <w:r>
+              <w:rPr>
+                <w:b w:val="false"/>
+                <w:bCs w:val="false"/>
+                <w:sz w:val="18"/>
+                <w:szCs w:val="18"/>
+              </w:rPr>
+              <w:t xml:space="preserve">4.708,33</w:t>
+            </w:r>
+          </w:p>
+        </w:tc>
+        <w:tc>
+          <w:tcPr>
+            <w:tcW w:type="dxa" w:w="800"/>
+            <w:tcBorders>
+              <w:top w:val="single" w:color="BFBFBF" w:sz="4"/>
+              <w:left w:val="none" w:color="FFFFFF" w:sz="0"/>
+              <w:bottom w:val="single" w:color="BFBFBF" w:sz="4"/>
+              <w:right w:val="none" w:color="FFFFFF" w:sz="0"/>
+            </w:tcBorders>
+            <w:tcMar>
+              <w:top w:type="dxa" w:w="40"/>
+              <w:left w:type="dxa" w:w="90"/>
+              <w:bottom w:type="dxa" w:w="40"/>
+              <w:right w:type="dxa" w:w="90"/>
+            </w:tcMar>
+            <w:vAlign w:val="center"/>
+          </w:tcPr>
+          <w:p>
+            <w:pPr>
+              <w:keepNext/>
+              <w:spacing w:after="0"/>
+              <w:jc w:val="center"/>
+            </w:pPr>
+            <w:r>
+              <w:rPr>
+                <w:b w:val="false"/>
+                <w:bCs w:val="false"/>
+                <w:sz w:val="18"/>
+                <w:szCs w:val="18"/>
+              </w:rPr>
+              <w:t xml:space="preserve">72,1</w:t>
+            </w:r>
+          </w:p>
+        </w:tc>
+        <w:tc>
+          <w:tcPr>
+            <w:tcW w:type="dxa" w:w="1580"/>
+            <w:tcBorders>
+              <w:top w:val="single" w:color="BFBFBF" w:sz="4"/>
+              <w:left w:val="none" w:color="FFFFFF" w:sz="0"/>
+              <w:bottom w:val="single" w:color="BFBFBF" w:sz="4"/>
+              <w:right w:val="none" w:color="FFFFFF" w:sz="0"/>
+            </w:tcBorders>
+            <w:tcMar>
+              <w:top w:type="dxa" w:w="40"/>
+              <w:left w:type="dxa" w:w="90"/>
+              <w:bottom w:type="dxa" w:w="40"/>
+              <w:right w:type="dxa" w:w="90"/>
+            </w:tcMar>
+            <w:vAlign w:val="center"/>
+          </w:tcPr>
+          <w:p>
+            <w:pPr>
+              <w:keepNext/>
+              <w:spacing w:after="0"/>
+              <w:jc w:val="center"/>
+            </w:pPr>
+            <w:r>
+              <w:rPr>
+                <w:b w:val="false"/>
+                <w:bCs w:val="false"/>
+                <w:sz w:val="18"/>
+                <w:szCs w:val="18"/>
+              </w:rPr>
+              <w:t xml:space="preserve">1.009 – 19.999</w:t>
+            </w:r>
+          </w:p>
+        </w:tc>
+        <w:tc>
+          <w:tcPr>
             <w:tcW w:type="dxa" w:w="1000"/>
-            <w:tcBorders>
-              <w:top w:val="single" w:color="BFBFBF" w:sz="4"/>
-              <w:left w:val="none" w:color="FFFFFF" w:sz="0"/>
-              <w:bottom w:val="single" w:color="BFBFBF" w:sz="4"/>
-              <w:right w:val="none" w:color="FFFFFF" w:sz="0"/>
-            </w:tcBorders>
-            <w:tcMar>
-              <w:top w:type="dxa" w:w="40"/>
-              <w:left w:type="dxa" w:w="90"/>
-              <w:bottom w:type="dxa" w:w="40"/>
-              <w:right w:type="dxa" w:w="90"/>
-            </w:tcMar>
-            <w:vAlign w:val="center"/>
-          </w:tcPr>
-          <w:p>
-            <w:pPr>
-              <w:keepNext/>
-              <w:spacing w:after="0"/>
-              <w:jc w:val="center"/>
-            </w:pPr>
-            <w:r>
-              <w:rPr>
-                <w:b w:val="false"/>
-                <w:bCs w:val="false"/>
-                <w:sz w:val="18"/>
-                <w:szCs w:val="18"/>
-              </w:rPr>
-              <w:t xml:space="preserve">4.960</w:t>
-            </w:r>
-          </w:p>
-        </w:tc>
-        <w:tc>
-          <w:tcPr>
-            <w:tcW w:type="dxa" w:w="1000"/>
-            <w:tcBorders>
-              <w:top w:val="single" w:color="BFBFBF" w:sz="4"/>
-              <w:left w:val="none" w:color="FFFFFF" w:sz="0"/>
-              <w:bottom w:val="single" w:color="BFBFBF" w:sz="4"/>
-              <w:right w:val="none" w:color="FFFFFF" w:sz="0"/>
-            </w:tcBorders>
-            <w:tcMar>
-              <w:top w:type="dxa" w:w="40"/>
-              <w:left w:type="dxa" w:w="90"/>
-              <w:bottom w:type="dxa" w:w="40"/>
-              <w:right w:type="dxa" w:w="90"/>
-            </w:tcMar>
-            <w:vAlign w:val="center"/>
-          </w:tcPr>
-          <w:p>
-            <w:pPr>
-              <w:keepNext/>
-              <w:spacing w:after="0"/>
-              <w:jc w:val="center"/>
-            </w:pPr>
-            <w:r>
-              <w:rPr>
-                <w:b w:val="false"/>
-                <w:bCs w:val="false"/>
-                <w:sz w:val="18"/>
-                <w:szCs w:val="18"/>
-              </w:rPr>
-              <w:t xml:space="preserve">4.708,33</w:t>
-            </w:r>
-          </w:p>
-        </w:tc>
-        <w:tc>
-          <w:tcPr>
-            <w:tcW w:type="dxa" w:w="889"/>
-            <w:tcBorders>
-              <w:top w:val="single" w:color="BFBFBF" w:sz="4"/>
-              <w:left w:val="none" w:color="FFFFFF" w:sz="0"/>
-              <w:bottom w:val="single" w:color="BFBFBF" w:sz="4"/>
-              <w:right w:val="none" w:color="FFFFFF" w:sz="0"/>
-            </w:tcBorders>
-            <w:tcMar>
-              <w:top w:type="dxa" w:w="40"/>
-              <w:left w:type="dxa" w:w="90"/>
-              <w:bottom w:type="dxa" w:w="40"/>
-              <w:right w:type="dxa" w:w="90"/>
-            </w:tcMar>
-            <w:vAlign w:val="center"/>
-          </w:tcPr>
-          <w:p>
-            <w:pPr>
-              <w:keepNext/>
-              <w:spacing w:after="0"/>
-              <w:jc w:val="center"/>
-            </w:pPr>
-            <w:r>
-              <w:rPr>
-                <w:b w:val="false"/>
-                <w:bCs w:val="false"/>
-                <w:sz w:val="18"/>
-                <w:szCs w:val="18"/>
-              </w:rPr>
-              <w:t xml:space="preserve">72,1</w:t>
-            </w:r>
-          </w:p>
-        </w:tc>
-        <w:tc>
-          <w:tcPr>
-            <w:tcW w:type="dxa" w:w="1756"/>
-            <w:tcBorders>
-              <w:top w:val="single" w:color="BFBFBF" w:sz="4"/>
-              <w:left w:val="none" w:color="FFFFFF" w:sz="0"/>
-              <w:bottom w:val="single" w:color="BFBFBF" w:sz="4"/>
-              <w:right w:val="none" w:color="FFFFFF" w:sz="0"/>
-            </w:tcBorders>
-            <w:tcMar>
-              <w:top w:type="dxa" w:w="40"/>
-              <w:left w:type="dxa" w:w="90"/>
-              <w:bottom w:type="dxa" w:w="40"/>
-              <w:right w:type="dxa" w:w="90"/>
-            </w:tcMar>
-            <w:vAlign w:val="center"/>
-          </w:tcPr>
-          <w:p>
-            <w:pPr>
-              <w:keepNext/>
-              <w:spacing w:after="0"/>
-              <w:jc w:val="center"/>
-            </w:pPr>
-            <w:r>
-              <w:rPr>
-                <w:b w:val="false"/>
-                <w:bCs w:val="false"/>
-                <w:sz w:val="18"/>
-                <w:szCs w:val="18"/>
-              </w:rPr>
-              <w:t xml:space="preserve">1.009 – 19.999</w:t>
-            </w:r>
-          </w:p>
-        </w:tc>
-        <w:tc>
-          <w:tcPr>
-            <w:tcW w:type="dxa" w:w="1112"/>
             <w:tcBorders>
               <w:top w:val="single" w:color="BFBFBF" w:sz="4"/>
               <w:left w:val="none" w:color="FFFFFF" w:sz="0"/>
@@ -2691,7 +2932,7 @@
         </w:trPr>
         <w:tc>
           <w:tcPr>
-            <w:tcW w:type="dxa" w:w="2523"/>
+            <w:tcW w:type="dxa" w:w="2270"/>
             <w:tcBorders>
               <w:top w:val="single" w:color="BFBFBF" w:sz="4"/>
               <w:left w:val="none" w:color="FFFFFF" w:sz="0"/>
@@ -2725,7 +2966,7 @@
         </w:tc>
         <w:tc>
           <w:tcPr>
-            <w:tcW w:type="dxa" w:w="711"/>
+            <w:tcW w:type="dxa" w:w="640"/>
             <w:tcBorders>
               <w:top w:val="single" w:color="BFBFBF" w:sz="4"/>
               <w:left w:val="none" w:color="FFFFFF" w:sz="0"/>
@@ -2759,7 +3000,7 @@
         </w:tc>
         <w:tc>
           <w:tcPr>
-            <w:tcW w:type="dxa" w:w="1089"/>
+            <w:tcW w:type="dxa" w:w="980"/>
             <w:tcBorders>
               <w:top w:val="single" w:color="BFBFBF" w:sz="4"/>
               <w:left w:val="none" w:color="FFFFFF" w:sz="0"/>
@@ -2793,143 +3034,143 @@
         </w:tc>
         <w:tc>
           <w:tcPr>
+            <w:tcW w:type="dxa" w:w="900"/>
+            <w:tcBorders>
+              <w:top w:val="single" w:color="BFBFBF" w:sz="4"/>
+              <w:left w:val="none" w:color="FFFFFF" w:sz="0"/>
+              <w:bottom w:val="single" w:color="BFBFBF" w:sz="4"/>
+              <w:right w:val="none" w:color="FFFFFF" w:sz="0"/>
+            </w:tcBorders>
+            <w:tcMar>
+              <w:top w:type="dxa" w:w="40"/>
+              <w:left w:type="dxa" w:w="90"/>
+              <w:bottom w:type="dxa" w:w="40"/>
+              <w:right w:type="dxa" w:w="90"/>
+            </w:tcMar>
+            <w:vAlign w:val="center"/>
+          </w:tcPr>
+          <w:p>
+            <w:pPr>
+              <w:keepNext/>
+              <w:spacing w:after="0"/>
+              <w:jc w:val="center"/>
+            </w:pPr>
+            <w:r>
+              <w:rPr>
+                <w:b w:val="false"/>
+                <w:bCs w:val="false"/>
+                <w:sz w:val="18"/>
+                <w:szCs w:val="18"/>
+              </w:rPr>
+              <w:t xml:space="preserve">5</w:t>
+            </w:r>
+          </w:p>
+        </w:tc>
+        <w:tc>
+          <w:tcPr>
+            <w:tcW w:type="dxa" w:w="900"/>
+            <w:tcBorders>
+              <w:top w:val="single" w:color="BFBFBF" w:sz="4"/>
+              <w:left w:val="none" w:color="FFFFFF" w:sz="0"/>
+              <w:bottom w:val="single" w:color="BFBFBF" w:sz="4"/>
+              <w:right w:val="none" w:color="FFFFFF" w:sz="0"/>
+            </w:tcBorders>
+            <w:tcMar>
+              <w:top w:type="dxa" w:w="40"/>
+              <w:left w:type="dxa" w:w="90"/>
+              <w:bottom w:type="dxa" w:w="40"/>
+              <w:right w:type="dxa" w:w="90"/>
+            </w:tcMar>
+            <w:vAlign w:val="center"/>
+          </w:tcPr>
+          <w:p>
+            <w:pPr>
+              <w:keepNext/>
+              <w:spacing w:after="0"/>
+              <w:jc w:val="center"/>
+            </w:pPr>
+            <w:r>
+              <w:rPr>
+                <w:b w:val="false"/>
+                <w:bCs w:val="false"/>
+                <w:sz w:val="18"/>
+                <w:szCs w:val="18"/>
+              </w:rPr>
+              <w:t xml:space="preserve">6,13</w:t>
+            </w:r>
+          </w:p>
+        </w:tc>
+        <w:tc>
+          <w:tcPr>
+            <w:tcW w:type="dxa" w:w="800"/>
+            <w:tcBorders>
+              <w:top w:val="single" w:color="BFBFBF" w:sz="4"/>
+              <w:left w:val="none" w:color="FFFFFF" w:sz="0"/>
+              <w:bottom w:val="single" w:color="BFBFBF" w:sz="4"/>
+              <w:right w:val="none" w:color="FFFFFF" w:sz="0"/>
+            </w:tcBorders>
+            <w:tcMar>
+              <w:top w:type="dxa" w:w="40"/>
+              <w:left w:type="dxa" w:w="90"/>
+              <w:bottom w:type="dxa" w:w="40"/>
+              <w:right w:type="dxa" w:w="90"/>
+            </w:tcMar>
+            <w:vAlign w:val="center"/>
+          </w:tcPr>
+          <w:p>
+            <w:pPr>
+              <w:keepNext/>
+              <w:spacing w:after="0"/>
+              <w:jc w:val="center"/>
+            </w:pPr>
+            <w:r>
+              <w:rPr>
+                <w:b w:val="false"/>
+                <w:bCs w:val="false"/>
+                <w:sz w:val="18"/>
+                <w:szCs w:val="18"/>
+              </w:rPr>
+              <w:t xml:space="preserve">87,4</w:t>
+            </w:r>
+          </w:p>
+        </w:tc>
+        <w:tc>
+          <w:tcPr>
+            <w:tcW w:type="dxa" w:w="1580"/>
+            <w:tcBorders>
+              <w:top w:val="single" w:color="BFBFBF" w:sz="4"/>
+              <w:left w:val="none" w:color="FFFFFF" w:sz="0"/>
+              <w:bottom w:val="single" w:color="BFBFBF" w:sz="4"/>
+              <w:right w:val="none" w:color="FFFFFF" w:sz="0"/>
+            </w:tcBorders>
+            <w:tcMar>
+              <w:top w:type="dxa" w:w="40"/>
+              <w:left w:type="dxa" w:w="90"/>
+              <w:bottom w:type="dxa" w:w="40"/>
+              <w:right w:type="dxa" w:w="90"/>
+            </w:tcMar>
+            <w:vAlign w:val="center"/>
+          </w:tcPr>
+          <w:p>
+            <w:pPr>
+              <w:keepNext/>
+              <w:spacing w:after="0"/>
+              <w:jc w:val="center"/>
+            </w:pPr>
+            <w:r>
+              <w:rPr>
+                <w:b w:val="false"/>
+                <w:bCs w:val="false"/>
+                <w:sz w:val="18"/>
+                <w:szCs w:val="18"/>
+              </w:rPr>
+              <w:t xml:space="preserve">0 – 40</w:t>
+            </w:r>
+          </w:p>
+        </w:tc>
+        <w:tc>
+          <w:tcPr>
             <w:tcW w:type="dxa" w:w="1000"/>
-            <w:tcBorders>
-              <w:top w:val="single" w:color="BFBFBF" w:sz="4"/>
-              <w:left w:val="none" w:color="FFFFFF" w:sz="0"/>
-              <w:bottom w:val="single" w:color="BFBFBF" w:sz="4"/>
-              <w:right w:val="none" w:color="FFFFFF" w:sz="0"/>
-            </w:tcBorders>
-            <w:tcMar>
-              <w:top w:type="dxa" w:w="40"/>
-              <w:left w:type="dxa" w:w="90"/>
-              <w:bottom w:type="dxa" w:w="40"/>
-              <w:right w:type="dxa" w:w="90"/>
-            </w:tcMar>
-            <w:vAlign w:val="center"/>
-          </w:tcPr>
-          <w:p>
-            <w:pPr>
-              <w:keepNext/>
-              <w:spacing w:after="0"/>
-              <w:jc w:val="center"/>
-            </w:pPr>
-            <w:r>
-              <w:rPr>
-                <w:b w:val="false"/>
-                <w:bCs w:val="false"/>
-                <w:sz w:val="18"/>
-                <w:szCs w:val="18"/>
-              </w:rPr>
-              <w:t xml:space="preserve">5</w:t>
-            </w:r>
-          </w:p>
-        </w:tc>
-        <w:tc>
-          <w:tcPr>
-            <w:tcW w:type="dxa" w:w="1000"/>
-            <w:tcBorders>
-              <w:top w:val="single" w:color="BFBFBF" w:sz="4"/>
-              <w:left w:val="none" w:color="FFFFFF" w:sz="0"/>
-              <w:bottom w:val="single" w:color="BFBFBF" w:sz="4"/>
-              <w:right w:val="none" w:color="FFFFFF" w:sz="0"/>
-            </w:tcBorders>
-            <w:tcMar>
-              <w:top w:type="dxa" w:w="40"/>
-              <w:left w:type="dxa" w:w="90"/>
-              <w:bottom w:type="dxa" w:w="40"/>
-              <w:right w:type="dxa" w:w="90"/>
-            </w:tcMar>
-            <w:vAlign w:val="center"/>
-          </w:tcPr>
-          <w:p>
-            <w:pPr>
-              <w:keepNext/>
-              <w:spacing w:after="0"/>
-              <w:jc w:val="center"/>
-            </w:pPr>
-            <w:r>
-              <w:rPr>
-                <w:b w:val="false"/>
-                <w:bCs w:val="false"/>
-                <w:sz w:val="18"/>
-                <w:szCs w:val="18"/>
-              </w:rPr>
-              <w:t xml:space="preserve">6,13</w:t>
-            </w:r>
-          </w:p>
-        </w:tc>
-        <w:tc>
-          <w:tcPr>
-            <w:tcW w:type="dxa" w:w="889"/>
-            <w:tcBorders>
-              <w:top w:val="single" w:color="BFBFBF" w:sz="4"/>
-              <w:left w:val="none" w:color="FFFFFF" w:sz="0"/>
-              <w:bottom w:val="single" w:color="BFBFBF" w:sz="4"/>
-              <w:right w:val="none" w:color="FFFFFF" w:sz="0"/>
-            </w:tcBorders>
-            <w:tcMar>
-              <w:top w:type="dxa" w:w="40"/>
-              <w:left w:type="dxa" w:w="90"/>
-              <w:bottom w:type="dxa" w:w="40"/>
-              <w:right w:type="dxa" w:w="90"/>
-            </w:tcMar>
-            <w:vAlign w:val="center"/>
-          </w:tcPr>
-          <w:p>
-            <w:pPr>
-              <w:keepNext/>
-              <w:spacing w:after="0"/>
-              <w:jc w:val="center"/>
-            </w:pPr>
-            <w:r>
-              <w:rPr>
-                <w:b w:val="false"/>
-                <w:bCs w:val="false"/>
-                <w:sz w:val="18"/>
-                <w:szCs w:val="18"/>
-              </w:rPr>
-              <w:t xml:space="preserve">87,4</w:t>
-            </w:r>
-          </w:p>
-        </w:tc>
-        <w:tc>
-          <w:tcPr>
-            <w:tcW w:type="dxa" w:w="1756"/>
-            <w:tcBorders>
-              <w:top w:val="single" w:color="BFBFBF" w:sz="4"/>
-              <w:left w:val="none" w:color="FFFFFF" w:sz="0"/>
-              <w:bottom w:val="single" w:color="BFBFBF" w:sz="4"/>
-              <w:right w:val="none" w:color="FFFFFF" w:sz="0"/>
-            </w:tcBorders>
-            <w:tcMar>
-              <w:top w:type="dxa" w:w="40"/>
-              <w:left w:type="dxa" w:w="90"/>
-              <w:bottom w:type="dxa" w:w="40"/>
-              <w:right w:type="dxa" w:w="90"/>
-            </w:tcMar>
-            <w:vAlign w:val="center"/>
-          </w:tcPr>
-          <w:p>
-            <w:pPr>
-              <w:keepNext/>
-              <w:spacing w:after="0"/>
-              <w:jc w:val="center"/>
-            </w:pPr>
-            <w:r>
-              <w:rPr>
-                <w:b w:val="false"/>
-                <w:bCs w:val="false"/>
-                <w:sz w:val="18"/>
-                <w:szCs w:val="18"/>
-              </w:rPr>
-              <w:t xml:space="preserve">0 – 40</w:t>
-            </w:r>
-          </w:p>
-        </w:tc>
-        <w:tc>
-          <w:tcPr>
-            <w:tcW w:type="dxa" w:w="1112"/>
             <w:tcBorders>
               <w:top w:val="single" w:color="BFBFBF" w:sz="4"/>
               <w:left w:val="none" w:color="FFFFFF" w:sz="0"/>
@@ -2968,7 +3209,7 @@
         </w:trPr>
         <w:tc>
           <w:tcPr>
-            <w:tcW w:type="dxa" w:w="2523"/>
+            <w:tcW w:type="dxa" w:w="2270"/>
             <w:tcBorders>
               <w:top w:val="single" w:color="BFBFBF" w:sz="4"/>
               <w:left w:val="none" w:color="FFFFFF" w:sz="0"/>
@@ -3002,7 +3243,7 @@
         </w:tc>
         <w:tc>
           <w:tcPr>
-            <w:tcW w:type="dxa" w:w="711"/>
+            <w:tcW w:type="dxa" w:w="640"/>
             <w:tcBorders>
               <w:top w:val="single" w:color="BFBFBF" w:sz="4"/>
               <w:left w:val="none" w:color="FFFFFF" w:sz="0"/>
@@ -3036,7 +3277,7 @@
         </w:tc>
         <w:tc>
           <w:tcPr>
-            <w:tcW w:type="dxa" w:w="1089"/>
+            <w:tcW w:type="dxa" w:w="980"/>
             <w:tcBorders>
               <w:top w:val="single" w:color="BFBFBF" w:sz="4"/>
               <w:left w:val="none" w:color="FFFFFF" w:sz="0"/>
@@ -3070,143 +3311,143 @@
         </w:tc>
         <w:tc>
           <w:tcPr>
+            <w:tcW w:type="dxa" w:w="900"/>
+            <w:tcBorders>
+              <w:top w:val="single" w:color="BFBFBF" w:sz="4"/>
+              <w:left w:val="none" w:color="FFFFFF" w:sz="0"/>
+              <w:bottom w:val="single" w:color="BFBFBF" w:sz="4"/>
+              <w:right w:val="none" w:color="FFFFFF" w:sz="0"/>
+            </w:tcBorders>
+            <w:tcMar>
+              <w:top w:type="dxa" w:w="40"/>
+              <w:left w:type="dxa" w:w="90"/>
+              <w:bottom w:type="dxa" w:w="40"/>
+              <w:right w:type="dxa" w:w="90"/>
+            </w:tcMar>
+            <w:vAlign w:val="center"/>
+          </w:tcPr>
+          <w:p>
+            <w:pPr>
+              <w:keepNext/>
+              <w:spacing w:after="0"/>
+              <w:jc w:val="center"/>
+            </w:pPr>
+            <w:r>
+              <w:rPr>
+                <w:b w:val="false"/>
+                <w:bCs w:val="false"/>
+                <w:sz w:val="18"/>
+                <w:szCs w:val="18"/>
+              </w:rPr>
+              <w:t xml:space="preserve">10</w:t>
+            </w:r>
+          </w:p>
+        </w:tc>
+        <w:tc>
+          <w:tcPr>
+            <w:tcW w:type="dxa" w:w="900"/>
+            <w:tcBorders>
+              <w:top w:val="single" w:color="BFBFBF" w:sz="4"/>
+              <w:left w:val="none" w:color="FFFFFF" w:sz="0"/>
+              <w:bottom w:val="single" w:color="BFBFBF" w:sz="4"/>
+              <w:right w:val="none" w:color="FFFFFF" w:sz="0"/>
+            </w:tcBorders>
+            <w:tcMar>
+              <w:top w:type="dxa" w:w="40"/>
+              <w:left w:type="dxa" w:w="90"/>
+              <w:bottom w:type="dxa" w:w="40"/>
+              <w:right w:type="dxa" w:w="90"/>
+            </w:tcMar>
+            <w:vAlign w:val="center"/>
+          </w:tcPr>
+          <w:p>
+            <w:pPr>
+              <w:keepNext/>
+              <w:spacing w:after="0"/>
+              <w:jc w:val="center"/>
+            </w:pPr>
+            <w:r>
+              <w:rPr>
+                <w:b w:val="false"/>
+                <w:bCs w:val="false"/>
+                <w:sz w:val="18"/>
+                <w:szCs w:val="18"/>
+              </w:rPr>
+              <w:t xml:space="preserve">7,78</w:t>
+            </w:r>
+          </w:p>
+        </w:tc>
+        <w:tc>
+          <w:tcPr>
+            <w:tcW w:type="dxa" w:w="800"/>
+            <w:tcBorders>
+              <w:top w:val="single" w:color="BFBFBF" w:sz="4"/>
+              <w:left w:val="none" w:color="FFFFFF" w:sz="0"/>
+              <w:bottom w:val="single" w:color="BFBFBF" w:sz="4"/>
+              <w:right w:val="none" w:color="FFFFFF" w:sz="0"/>
+            </w:tcBorders>
+            <w:tcMar>
+              <w:top w:type="dxa" w:w="40"/>
+              <w:left w:type="dxa" w:w="90"/>
+              <w:bottom w:type="dxa" w:w="40"/>
+              <w:right w:type="dxa" w:w="90"/>
+            </w:tcMar>
+            <w:vAlign w:val="center"/>
+          </w:tcPr>
+          <w:p>
+            <w:pPr>
+              <w:keepNext/>
+              <w:spacing w:after="0"/>
+              <w:jc w:val="center"/>
+            </w:pPr>
+            <w:r>
+              <w:rPr>
+                <w:b w:val="false"/>
+                <w:bCs w:val="false"/>
+                <w:sz w:val="18"/>
+                <w:szCs w:val="18"/>
+              </w:rPr>
+              <w:t xml:space="preserve">69,0</w:t>
+            </w:r>
+          </w:p>
+        </w:tc>
+        <w:tc>
+          <w:tcPr>
+            <w:tcW w:type="dxa" w:w="1580"/>
+            <w:tcBorders>
+              <w:top w:val="single" w:color="BFBFBF" w:sz="4"/>
+              <w:left w:val="none" w:color="FFFFFF" w:sz="0"/>
+              <w:bottom w:val="single" w:color="BFBFBF" w:sz="4"/>
+              <w:right w:val="none" w:color="FFFFFF" w:sz="0"/>
+            </w:tcBorders>
+            <w:tcMar>
+              <w:top w:type="dxa" w:w="40"/>
+              <w:left w:type="dxa" w:w="90"/>
+              <w:bottom w:type="dxa" w:w="40"/>
+              <w:right w:type="dxa" w:w="90"/>
+            </w:tcMar>
+            <w:vAlign w:val="center"/>
+          </w:tcPr>
+          <w:p>
+            <w:pPr>
+              <w:keepNext/>
+              <w:spacing w:after="0"/>
+              <w:jc w:val="center"/>
+            </w:pPr>
+            <w:r>
+              <w:rPr>
+                <w:b w:val="false"/>
+                <w:bCs w:val="false"/>
+                <w:sz w:val="18"/>
+                <w:szCs w:val="18"/>
+              </w:rPr>
+              <w:t xml:space="preserve">0 – 40</w:t>
+            </w:r>
+          </w:p>
+        </w:tc>
+        <w:tc>
+          <w:tcPr>
             <w:tcW w:type="dxa" w:w="1000"/>
-            <w:tcBorders>
-              <w:top w:val="single" w:color="BFBFBF" w:sz="4"/>
-              <w:left w:val="none" w:color="FFFFFF" w:sz="0"/>
-              <w:bottom w:val="single" w:color="BFBFBF" w:sz="4"/>
-              <w:right w:val="none" w:color="FFFFFF" w:sz="0"/>
-            </w:tcBorders>
-            <w:tcMar>
-              <w:top w:type="dxa" w:w="40"/>
-              <w:left w:type="dxa" w:w="90"/>
-              <w:bottom w:type="dxa" w:w="40"/>
-              <w:right w:type="dxa" w:w="90"/>
-            </w:tcMar>
-            <w:vAlign w:val="center"/>
-          </w:tcPr>
-          <w:p>
-            <w:pPr>
-              <w:keepNext/>
-              <w:spacing w:after="0"/>
-              <w:jc w:val="center"/>
-            </w:pPr>
-            <w:r>
-              <w:rPr>
-                <w:b w:val="false"/>
-                <w:bCs w:val="false"/>
-                <w:sz w:val="18"/>
-                <w:szCs w:val="18"/>
-              </w:rPr>
-              <w:t xml:space="preserve">10</w:t>
-            </w:r>
-          </w:p>
-        </w:tc>
-        <w:tc>
-          <w:tcPr>
-            <w:tcW w:type="dxa" w:w="1000"/>
-            <w:tcBorders>
-              <w:top w:val="single" w:color="BFBFBF" w:sz="4"/>
-              <w:left w:val="none" w:color="FFFFFF" w:sz="0"/>
-              <w:bottom w:val="single" w:color="BFBFBF" w:sz="4"/>
-              <w:right w:val="none" w:color="FFFFFF" w:sz="0"/>
-            </w:tcBorders>
-            <w:tcMar>
-              <w:top w:type="dxa" w:w="40"/>
-              <w:left w:type="dxa" w:w="90"/>
-              <w:bottom w:type="dxa" w:w="40"/>
-              <w:right w:type="dxa" w:w="90"/>
-            </w:tcMar>
-            <w:vAlign w:val="center"/>
-          </w:tcPr>
-          <w:p>
-            <w:pPr>
-              <w:keepNext/>
-              <w:spacing w:after="0"/>
-              <w:jc w:val="center"/>
-            </w:pPr>
-            <w:r>
-              <w:rPr>
-                <w:b w:val="false"/>
-                <w:bCs w:val="false"/>
-                <w:sz w:val="18"/>
-                <w:szCs w:val="18"/>
-              </w:rPr>
-              <w:t xml:space="preserve">7,78</w:t>
-            </w:r>
-          </w:p>
-        </w:tc>
-        <w:tc>
-          <w:tcPr>
-            <w:tcW w:type="dxa" w:w="889"/>
-            <w:tcBorders>
-              <w:top w:val="single" w:color="BFBFBF" w:sz="4"/>
-              <w:left w:val="none" w:color="FFFFFF" w:sz="0"/>
-              <w:bottom w:val="single" w:color="BFBFBF" w:sz="4"/>
-              <w:right w:val="none" w:color="FFFFFF" w:sz="0"/>
-            </w:tcBorders>
-            <w:tcMar>
-              <w:top w:type="dxa" w:w="40"/>
-              <w:left w:type="dxa" w:w="90"/>
-              <w:bottom w:type="dxa" w:w="40"/>
-              <w:right w:type="dxa" w:w="90"/>
-            </w:tcMar>
-            <w:vAlign w:val="center"/>
-          </w:tcPr>
-          <w:p>
-            <w:pPr>
-              <w:keepNext/>
-              <w:spacing w:after="0"/>
-              <w:jc w:val="center"/>
-            </w:pPr>
-            <w:r>
-              <w:rPr>
-                <w:b w:val="false"/>
-                <w:bCs w:val="false"/>
-                <w:sz w:val="18"/>
-                <w:szCs w:val="18"/>
-              </w:rPr>
-              <w:t xml:space="preserve">69,0</w:t>
-            </w:r>
-          </w:p>
-        </w:tc>
-        <w:tc>
-          <w:tcPr>
-            <w:tcW w:type="dxa" w:w="1756"/>
-            <w:tcBorders>
-              <w:top w:val="single" w:color="BFBFBF" w:sz="4"/>
-              <w:left w:val="none" w:color="FFFFFF" w:sz="0"/>
-              <w:bottom w:val="single" w:color="BFBFBF" w:sz="4"/>
-              <w:right w:val="none" w:color="FFFFFF" w:sz="0"/>
-            </w:tcBorders>
-            <w:tcMar>
-              <w:top w:type="dxa" w:w="40"/>
-              <w:left w:type="dxa" w:w="90"/>
-              <w:bottom w:type="dxa" w:w="40"/>
-              <w:right w:type="dxa" w:w="90"/>
-            </w:tcMar>
-            <w:vAlign w:val="center"/>
-          </w:tcPr>
-          <w:p>
-            <w:pPr>
-              <w:keepNext/>
-              <w:spacing w:after="0"/>
-              <w:jc w:val="center"/>
-            </w:pPr>
-            <w:r>
-              <w:rPr>
-                <w:b w:val="false"/>
-                <w:bCs w:val="false"/>
-                <w:sz w:val="18"/>
-                <w:szCs w:val="18"/>
-              </w:rPr>
-              <w:t xml:space="preserve">0 – 40</w:t>
-            </w:r>
-          </w:p>
-        </w:tc>
-        <w:tc>
-          <w:tcPr>
-            <w:tcW w:type="dxa" w:w="1112"/>
             <w:tcBorders>
               <w:top w:val="single" w:color="BFBFBF" w:sz="4"/>
               <w:left w:val="none" w:color="FFFFFF" w:sz="0"/>
@@ -3245,7 +3486,7 @@
         </w:trPr>
         <w:tc>
           <w:tcPr>
-            <w:tcW w:type="dxa" w:w="2523"/>
+            <w:tcW w:type="dxa" w:w="2270"/>
             <w:tcBorders>
               <w:top w:val="single" w:color="BFBFBF" w:sz="4"/>
               <w:left w:val="none" w:color="FFFFFF" w:sz="0"/>
@@ -3279,7 +3520,7 @@
         </w:tc>
         <w:tc>
           <w:tcPr>
-            <w:tcW w:type="dxa" w:w="711"/>
+            <w:tcW w:type="dxa" w:w="640"/>
             <w:tcBorders>
               <w:top w:val="single" w:color="BFBFBF" w:sz="4"/>
               <w:left w:val="none" w:color="FFFFFF" w:sz="0"/>
@@ -3313,7 +3554,7 @@
         </w:tc>
         <w:tc>
           <w:tcPr>
-            <w:tcW w:type="dxa" w:w="1089"/>
+            <w:tcW w:type="dxa" w:w="980"/>
             <w:tcBorders>
               <w:top w:val="single" w:color="BFBFBF" w:sz="4"/>
               <w:left w:val="none" w:color="FFFFFF" w:sz="0"/>
@@ -3347,143 +3588,143 @@
         </w:tc>
         <w:tc>
           <w:tcPr>
+            <w:tcW w:type="dxa" w:w="900"/>
+            <w:tcBorders>
+              <w:top w:val="single" w:color="BFBFBF" w:sz="4"/>
+              <w:left w:val="none" w:color="FFFFFF" w:sz="0"/>
+              <w:bottom w:val="single" w:color="BFBFBF" w:sz="4"/>
+              <w:right w:val="none" w:color="FFFFFF" w:sz="0"/>
+            </w:tcBorders>
+            <w:tcMar>
+              <w:top w:type="dxa" w:w="40"/>
+              <w:left w:type="dxa" w:w="90"/>
+              <w:bottom w:type="dxa" w:w="40"/>
+              <w:right w:type="dxa" w:w="90"/>
+            </w:tcMar>
+            <w:vAlign w:val="center"/>
+          </w:tcPr>
+          <w:p>
+            <w:pPr>
+              <w:keepNext/>
+              <w:spacing w:after="0"/>
+              <w:jc w:val="center"/>
+            </w:pPr>
+            <w:r>
+              <w:rPr>
+                <w:b w:val="false"/>
+                <w:bCs w:val="false"/>
+                <w:sz w:val="18"/>
+                <w:szCs w:val="18"/>
+              </w:rPr>
+              <w:t xml:space="preserve">7</w:t>
+            </w:r>
+          </w:p>
+        </w:tc>
+        <w:tc>
+          <w:tcPr>
+            <w:tcW w:type="dxa" w:w="900"/>
+            <w:tcBorders>
+              <w:top w:val="single" w:color="BFBFBF" w:sz="4"/>
+              <w:left w:val="none" w:color="FFFFFF" w:sz="0"/>
+              <w:bottom w:val="single" w:color="BFBFBF" w:sz="4"/>
+              <w:right w:val="none" w:color="FFFFFF" w:sz="0"/>
+            </w:tcBorders>
+            <w:tcMar>
+              <w:top w:type="dxa" w:w="40"/>
+              <w:left w:type="dxa" w:w="90"/>
+              <w:bottom w:type="dxa" w:w="40"/>
+              <w:right w:type="dxa" w:w="90"/>
+            </w:tcMar>
+            <w:vAlign w:val="center"/>
+          </w:tcPr>
+          <w:p>
+            <w:pPr>
+              <w:keepNext/>
+              <w:spacing w:after="0"/>
+              <w:jc w:val="center"/>
+            </w:pPr>
+            <w:r>
+              <w:rPr>
+                <w:b w:val="false"/>
+                <w:bCs w:val="false"/>
+                <w:sz w:val="18"/>
+                <w:szCs w:val="18"/>
+              </w:rPr>
+              <w:t xml:space="preserve">8,09</w:t>
+            </w:r>
+          </w:p>
+        </w:tc>
+        <w:tc>
+          <w:tcPr>
+            <w:tcW w:type="dxa" w:w="800"/>
+            <w:tcBorders>
+              <w:top w:val="single" w:color="BFBFBF" w:sz="4"/>
+              <w:left w:val="none" w:color="FFFFFF" w:sz="0"/>
+              <w:bottom w:val="single" w:color="BFBFBF" w:sz="4"/>
+              <w:right w:val="none" w:color="FFFFFF" w:sz="0"/>
+            </w:tcBorders>
+            <w:tcMar>
+              <w:top w:type="dxa" w:w="40"/>
+              <w:left w:type="dxa" w:w="90"/>
+              <w:bottom w:type="dxa" w:w="40"/>
+              <w:right w:type="dxa" w:w="90"/>
+            </w:tcMar>
+            <w:vAlign w:val="center"/>
+          </w:tcPr>
+          <w:p>
+            <w:pPr>
+              <w:keepNext/>
+              <w:spacing w:after="0"/>
+              <w:jc w:val="center"/>
+            </w:pPr>
+            <w:r>
+              <w:rPr>
+                <w:b w:val="false"/>
+                <w:bCs w:val="false"/>
+                <w:sz w:val="18"/>
+                <w:szCs w:val="18"/>
+              </w:rPr>
+              <w:t xml:space="preserve">88,1</w:t>
+            </w:r>
+          </w:p>
+        </w:tc>
+        <w:tc>
+          <w:tcPr>
+            <w:tcW w:type="dxa" w:w="1580"/>
+            <w:tcBorders>
+              <w:top w:val="single" w:color="BFBFBF" w:sz="4"/>
+              <w:left w:val="none" w:color="FFFFFF" w:sz="0"/>
+              <w:bottom w:val="single" w:color="BFBFBF" w:sz="4"/>
+              <w:right w:val="none" w:color="FFFFFF" w:sz="0"/>
+            </w:tcBorders>
+            <w:tcMar>
+              <w:top w:type="dxa" w:w="40"/>
+              <w:left w:type="dxa" w:w="90"/>
+              <w:bottom w:type="dxa" w:w="40"/>
+              <w:right w:type="dxa" w:w="90"/>
+            </w:tcMar>
+            <w:vAlign w:val="center"/>
+          </w:tcPr>
+          <w:p>
+            <w:pPr>
+              <w:keepNext/>
+              <w:spacing w:after="0"/>
+              <w:jc w:val="center"/>
+            </w:pPr>
+            <w:r>
+              <w:rPr>
+                <w:b w:val="false"/>
+                <w:bCs w:val="false"/>
+                <w:sz w:val="18"/>
+                <w:szCs w:val="18"/>
+              </w:rPr>
+              <w:t xml:space="preserve">1 – 29</w:t>
+            </w:r>
+          </w:p>
+        </w:tc>
+        <w:tc>
+          <w:tcPr>
             <w:tcW w:type="dxa" w:w="1000"/>
-            <w:tcBorders>
-              <w:top w:val="single" w:color="BFBFBF" w:sz="4"/>
-              <w:left w:val="none" w:color="FFFFFF" w:sz="0"/>
-              <w:bottom w:val="single" w:color="BFBFBF" w:sz="4"/>
-              <w:right w:val="none" w:color="FFFFFF" w:sz="0"/>
-            </w:tcBorders>
-            <w:tcMar>
-              <w:top w:type="dxa" w:w="40"/>
-              <w:left w:type="dxa" w:w="90"/>
-              <w:bottom w:type="dxa" w:w="40"/>
-              <w:right w:type="dxa" w:w="90"/>
-            </w:tcMar>
-            <w:vAlign w:val="center"/>
-          </w:tcPr>
-          <w:p>
-            <w:pPr>
-              <w:keepNext/>
-              <w:spacing w:after="0"/>
-              <w:jc w:val="center"/>
-            </w:pPr>
-            <w:r>
-              <w:rPr>
-                <w:b w:val="false"/>
-                <w:bCs w:val="false"/>
-                <w:sz w:val="18"/>
-                <w:szCs w:val="18"/>
-              </w:rPr>
-              <w:t xml:space="preserve">7</w:t>
-            </w:r>
-          </w:p>
-        </w:tc>
-        <w:tc>
-          <w:tcPr>
-            <w:tcW w:type="dxa" w:w="1000"/>
-            <w:tcBorders>
-              <w:top w:val="single" w:color="BFBFBF" w:sz="4"/>
-              <w:left w:val="none" w:color="FFFFFF" w:sz="0"/>
-              <w:bottom w:val="single" w:color="BFBFBF" w:sz="4"/>
-              <w:right w:val="none" w:color="FFFFFF" w:sz="0"/>
-            </w:tcBorders>
-            <w:tcMar>
-              <w:top w:type="dxa" w:w="40"/>
-              <w:left w:type="dxa" w:w="90"/>
-              <w:bottom w:type="dxa" w:w="40"/>
-              <w:right w:type="dxa" w:w="90"/>
-            </w:tcMar>
-            <w:vAlign w:val="center"/>
-          </w:tcPr>
-          <w:p>
-            <w:pPr>
-              <w:keepNext/>
-              <w:spacing w:after="0"/>
-              <w:jc w:val="center"/>
-            </w:pPr>
-            <w:r>
-              <w:rPr>
-                <w:b w:val="false"/>
-                <w:bCs w:val="false"/>
-                <w:sz w:val="18"/>
-                <w:szCs w:val="18"/>
-              </w:rPr>
-              <w:t xml:space="preserve">8,09</w:t>
-            </w:r>
-          </w:p>
-        </w:tc>
-        <w:tc>
-          <w:tcPr>
-            <w:tcW w:type="dxa" w:w="889"/>
-            <w:tcBorders>
-              <w:top w:val="single" w:color="BFBFBF" w:sz="4"/>
-              <w:left w:val="none" w:color="FFFFFF" w:sz="0"/>
-              <w:bottom w:val="single" w:color="BFBFBF" w:sz="4"/>
-              <w:right w:val="none" w:color="FFFFFF" w:sz="0"/>
-            </w:tcBorders>
-            <w:tcMar>
-              <w:top w:type="dxa" w:w="40"/>
-              <w:left w:type="dxa" w:w="90"/>
-              <w:bottom w:type="dxa" w:w="40"/>
-              <w:right w:type="dxa" w:w="90"/>
-            </w:tcMar>
-            <w:vAlign w:val="center"/>
-          </w:tcPr>
-          <w:p>
-            <w:pPr>
-              <w:keepNext/>
-              <w:spacing w:after="0"/>
-              <w:jc w:val="center"/>
-            </w:pPr>
-            <w:r>
-              <w:rPr>
-                <w:b w:val="false"/>
-                <w:bCs w:val="false"/>
-                <w:sz w:val="18"/>
-                <w:szCs w:val="18"/>
-              </w:rPr>
-              <w:t xml:space="preserve">88,1</w:t>
-            </w:r>
-          </w:p>
-        </w:tc>
-        <w:tc>
-          <w:tcPr>
-            <w:tcW w:type="dxa" w:w="1756"/>
-            <w:tcBorders>
-              <w:top w:val="single" w:color="BFBFBF" w:sz="4"/>
-              <w:left w:val="none" w:color="FFFFFF" w:sz="0"/>
-              <w:bottom w:val="single" w:color="BFBFBF" w:sz="4"/>
-              <w:right w:val="none" w:color="FFFFFF" w:sz="0"/>
-            </w:tcBorders>
-            <w:tcMar>
-              <w:top w:type="dxa" w:w="40"/>
-              <w:left w:type="dxa" w:w="90"/>
-              <w:bottom w:type="dxa" w:w="40"/>
-              <w:right w:type="dxa" w:w="90"/>
-            </w:tcMar>
-            <w:vAlign w:val="center"/>
-          </w:tcPr>
-          <w:p>
-            <w:pPr>
-              <w:keepNext/>
-              <w:spacing w:after="0"/>
-              <w:jc w:val="center"/>
-            </w:pPr>
-            <w:r>
-              <w:rPr>
-                <w:b w:val="false"/>
-                <w:bCs w:val="false"/>
-                <w:sz w:val="18"/>
-                <w:szCs w:val="18"/>
-              </w:rPr>
-              <w:t xml:space="preserve">1 – 29</w:t>
-            </w:r>
-          </w:p>
-        </w:tc>
-        <w:tc>
-          <w:tcPr>
-            <w:tcW w:type="dxa" w:w="1112"/>
             <w:tcBorders>
               <w:top w:val="single" w:color="BFBFBF" w:sz="4"/>
               <w:left w:val="none" w:color="FFFFFF" w:sz="0"/>
@@ -3567,7 +3808,7 @@
     </w:p>
     <w:tbl>
       <w:tblPr>
-        <w:tblW w:type="dxa" w:w="10080"/>
+        <w:tblW w:type="dxa" w:w="9070"/>
         <w:jc w:val="center"/>
         <w:tblBorders>
           <w:top w:val="single" w:color="auto" w:sz="4"/>
@@ -3579,9 +3820,9 @@
         </w:tblBorders>
       </w:tblPr>
       <w:tblGrid>
-        <w:gridCol w:w="3412"/>
-        <w:gridCol w:w="3334"/>
-        <w:gridCol w:w="3334"/>
+        <w:gridCol w:w="3070"/>
+        <w:gridCol w:w="3000"/>
+        <w:gridCol w:w="3000"/>
       </w:tblGrid>
       <w:tr>
         <w:trPr>
@@ -3589,7 +3830,7 @@
         </w:trPr>
         <w:tc>
           <w:tcPr>
-            <w:tcW w:type="dxa" w:w="3412"/>
+            <w:tcW w:type="dxa" w:w="3070"/>
             <w:tcBorders>
               <w:top w:val="single" w:color="BFBFBF" w:sz="4"/>
               <w:left w:val="none" w:color="FFFFFF" w:sz="0"/>
@@ -3624,7 +3865,7 @@
         </w:tc>
         <w:tc>
           <w:tcPr>
-            <w:tcW w:type="dxa" w:w="3334"/>
+            <w:tcW w:type="dxa" w:w="3000"/>
             <w:tcBorders>
               <w:top w:val="single" w:color="BFBFBF" w:sz="4"/>
               <w:left w:val="none" w:color="FFFFFF" w:sz="0"/>
@@ -3659,7 +3900,7 @@
         </w:tc>
         <w:tc>
           <w:tcPr>
-            <w:tcW w:type="dxa" w:w="3334"/>
+            <w:tcW w:type="dxa" w:w="3000"/>
             <w:tcBorders>
               <w:top w:val="single" w:color="BFBFBF" w:sz="4"/>
               <w:left w:val="none" w:color="FFFFFF" w:sz="0"/>
@@ -3699,7 +3940,7 @@
         </w:trPr>
         <w:tc>
           <w:tcPr>
-            <w:tcW w:type="dxa" w:w="3412"/>
+            <w:tcW w:type="dxa" w:w="3070"/>
             <w:tcBorders>
               <w:top w:val="single" w:color="BFBFBF" w:sz="4"/>
               <w:left w:val="none" w:color="FFFFFF" w:sz="0"/>
@@ -3733,7 +3974,7 @@
         </w:tc>
         <w:tc>
           <w:tcPr>
-            <w:tcW w:type="dxa" w:w="3334"/>
+            <w:tcW w:type="dxa" w:w="3000"/>
             <w:tcBorders>
               <w:top w:val="single" w:color="BFBFBF" w:sz="4"/>
               <w:left w:val="none" w:color="FFFFFF" w:sz="0"/>
@@ -3767,7 +4008,7 @@
         </w:tc>
         <w:tc>
           <w:tcPr>
-            <w:tcW w:type="dxa" w:w="3334"/>
+            <w:tcW w:type="dxa" w:w="3000"/>
             <w:tcBorders>
               <w:top w:val="single" w:color="BFBFBF" w:sz="4"/>
               <w:left w:val="none" w:color="FFFFFF" w:sz="0"/>
@@ -3806,7 +4047,7 @@
         </w:trPr>
         <w:tc>
           <w:tcPr>
-            <w:tcW w:type="dxa" w:w="3412"/>
+            <w:tcW w:type="dxa" w:w="3070"/>
             <w:tcBorders>
               <w:top w:val="single" w:color="BFBFBF" w:sz="4"/>
               <w:left w:val="none" w:color="FFFFFF" w:sz="0"/>
@@ -3840,7 +4081,7 @@
         </w:tc>
         <w:tc>
           <w:tcPr>
-            <w:tcW w:type="dxa" w:w="3334"/>
+            <w:tcW w:type="dxa" w:w="3000"/>
             <w:tcBorders>
               <w:top w:val="single" w:color="BFBFBF" w:sz="4"/>
               <w:left w:val="none" w:color="FFFFFF" w:sz="0"/>
@@ -3874,7 +4115,7 @@
         </w:tc>
         <w:tc>
           <w:tcPr>
-            <w:tcW w:type="dxa" w:w="3334"/>
+            <w:tcW w:type="dxa" w:w="3000"/>
             <w:tcBorders>
               <w:top w:val="single" w:color="BFBFBF" w:sz="4"/>
               <w:left w:val="none" w:color="FFFFFF" w:sz="0"/>
@@ -3913,7 +4154,7 @@
         </w:trPr>
         <w:tc>
           <w:tcPr>
-            <w:tcW w:type="dxa" w:w="3412"/>
+            <w:tcW w:type="dxa" w:w="3070"/>
             <w:tcBorders>
               <w:top w:val="single" w:color="BFBFBF" w:sz="4"/>
               <w:left w:val="none" w:color="FFFFFF" w:sz="0"/>
@@ -3947,7 +4188,7 @@
         </w:tc>
         <w:tc>
           <w:tcPr>
-            <w:tcW w:type="dxa" w:w="3334"/>
+            <w:tcW w:type="dxa" w:w="3000"/>
             <w:tcBorders>
               <w:top w:val="single" w:color="BFBFBF" w:sz="4"/>
               <w:left w:val="none" w:color="FFFFFF" w:sz="0"/>
@@ -3981,7 +4222,7 @@
         </w:tc>
         <w:tc>
           <w:tcPr>
-            <w:tcW w:type="dxa" w:w="3334"/>
+            <w:tcW w:type="dxa" w:w="3000"/>
             <w:tcBorders>
               <w:top w:val="single" w:color="BFBFBF" w:sz="4"/>
               <w:left w:val="none" w:color="FFFFFF" w:sz="0"/>
@@ -4020,7 +4261,7 @@
         </w:trPr>
         <w:tc>
           <w:tcPr>
-            <w:tcW w:type="dxa" w:w="3412"/>
+            <w:tcW w:type="dxa" w:w="3070"/>
             <w:tcBorders>
               <w:top w:val="single" w:color="BFBFBF" w:sz="4"/>
               <w:left w:val="none" w:color="FFFFFF" w:sz="0"/>
@@ -4054,7 +4295,7 @@
         </w:tc>
         <w:tc>
           <w:tcPr>
-            <w:tcW w:type="dxa" w:w="3334"/>
+            <w:tcW w:type="dxa" w:w="3000"/>
             <w:tcBorders>
               <w:top w:val="single" w:color="BFBFBF" w:sz="4"/>
               <w:left w:val="none" w:color="FFFFFF" w:sz="0"/>
@@ -4088,7 +4329,7 @@
         </w:tc>
         <w:tc>
           <w:tcPr>
-            <w:tcW w:type="dxa" w:w="3334"/>
+            <w:tcW w:type="dxa" w:w="3000"/>
             <w:tcBorders>
               <w:top w:val="single" w:color="BFBFBF" w:sz="4"/>
               <w:left w:val="none" w:color="FFFFFF" w:sz="0"/>
@@ -4127,7 +4368,7 @@
         </w:trPr>
         <w:tc>
           <w:tcPr>
-            <w:tcW w:type="dxa" w:w="3412"/>
+            <w:tcW w:type="dxa" w:w="3070"/>
             <w:tcBorders>
               <w:top w:val="single" w:color="BFBFBF" w:sz="4"/>
               <w:left w:val="none" w:color="FFFFFF" w:sz="0"/>
@@ -4161,7 +4402,7 @@
         </w:tc>
         <w:tc>
           <w:tcPr>
-            <w:tcW w:type="dxa" w:w="3334"/>
+            <w:tcW w:type="dxa" w:w="3000"/>
             <w:tcBorders>
               <w:top w:val="single" w:color="BFBFBF" w:sz="4"/>
               <w:left w:val="none" w:color="FFFFFF" w:sz="0"/>
@@ -4195,7 +4436,7 @@
         </w:tc>
         <w:tc>
           <w:tcPr>
-            <w:tcW w:type="dxa" w:w="3334"/>
+            <w:tcW w:type="dxa" w:w="3000"/>
             <w:tcBorders>
               <w:top w:val="single" w:color="BFBFBF" w:sz="4"/>
               <w:left w:val="none" w:color="FFFFFF" w:sz="0"/>
@@ -4253,7 +4494,7 @@
       <w:r>
         <w:drawing>
           <wp:inline distT="0" distB="0" distL="0" distR="0">
-            <wp:extent cx="6286500" cy="1924050"/>
+            <wp:extent cx="5762625" cy="1762125"/>
             <wp:effectExtent t="0" r="0" b="0" l="0"/>
             <wp:docPr id="1" name="" descr="" title=""/>
             <wp:cNvGraphicFramePr>
@@ -4269,7 +4510,7 @@
                     </pic:cNvPicPr>
                   </pic:nvPicPr>
                   <pic:blipFill>
-                    <a:blip r:embed="rId12" cstate="none"/>
+                    <a:blip r:embed="rId9" cstate="none"/>
                     <a:srcRect/>
                     <a:stretch>
                       <a:fillRect/>
@@ -4278,7 +4519,7 @@
                   <pic:spPr bwMode="auto">
                     <a:xfrm>
                       <a:off x="0" y="0"/>
-                      <a:ext cx="6286500" cy="1924050"/>
+                      <a:ext cx="5762625" cy="1762125"/>
                     </a:xfrm>
                     <a:prstGeom prst="rect">
                       <a:avLst/>
@@ -4315,7 +4556,7 @@
       <w:r>
         <w:drawing>
           <wp:inline distT="0" distB="0" distL="0" distR="0">
-            <wp:extent cx="5334000" cy="3667125"/>
+            <wp:extent cx="5143500" cy="3543300"/>
             <wp:effectExtent t="0" r="0" b="0" l="0"/>
             <wp:docPr id="1" name="" descr="" title=""/>
             <wp:cNvGraphicFramePr>
@@ -4331,7 +4572,7 @@
                     </pic:cNvPicPr>
                   </pic:nvPicPr>
                   <pic:blipFill>
-                    <a:blip r:embed="rId13" cstate="none"/>
+                    <a:blip r:embed="rId10" cstate="none"/>
                     <a:srcRect/>
                     <a:stretch>
                       <a:fillRect/>
@@ -4340,7 +4581,7 @@
                   <pic:spPr bwMode="auto">
                     <a:xfrm>
                       <a:off x="0" y="0"/>
-                      <a:ext cx="5334000" cy="3667125"/>
+                      <a:ext cx="5143500" cy="3543300"/>
                     </a:xfrm>
                     <a:prstGeom prst="rect">
                       <a:avLst/>
@@ -4449,7 +4690,7 @@
     </w:p>
     <w:tbl>
       <w:tblPr>
-        <w:tblW w:type="dxa" w:w="10080"/>
+        <w:tblW w:type="dxa" w:w="9070"/>
         <w:jc w:val="center"/>
         <w:tblBorders>
           <w:top w:val="single" w:color="auto" w:sz="4"/>
@@ -4461,11 +4702,11 @@
         </w:tblBorders>
       </w:tblPr>
       <w:tblGrid>
-        <w:gridCol w:w="3745"/>
-        <w:gridCol w:w="1000"/>
-        <w:gridCol w:w="1445"/>
-        <w:gridCol w:w="2334"/>
-        <w:gridCol w:w="1556"/>
+        <w:gridCol w:w="3370"/>
+        <w:gridCol w:w="900"/>
+        <w:gridCol w:w="1300"/>
+        <w:gridCol w:w="2100"/>
+        <w:gridCol w:w="1400"/>
       </w:tblGrid>
       <w:tr>
         <w:trPr>
@@ -4473,7 +4714,7 @@
         </w:trPr>
         <w:tc>
           <w:tcPr>
-            <w:tcW w:type="dxa" w:w="3745"/>
+            <w:tcW w:type="dxa" w:w="3370"/>
             <w:tcBorders>
               <w:top w:val="single" w:color="BFBFBF" w:sz="4"/>
               <w:left w:val="none" w:color="FFFFFF" w:sz="0"/>
@@ -4508,7 +4749,7 @@
         </w:tc>
         <w:tc>
           <w:tcPr>
-            <w:tcW w:type="dxa" w:w="1000"/>
+            <w:tcW w:type="dxa" w:w="900"/>
             <w:tcBorders>
               <w:top w:val="single" w:color="BFBFBF" w:sz="4"/>
               <w:left w:val="none" w:color="FFFFFF" w:sz="0"/>
@@ -4543,7 +4784,7 @@
         </w:tc>
         <w:tc>
           <w:tcPr>
-            <w:tcW w:type="dxa" w:w="1445"/>
+            <w:tcW w:type="dxa" w:w="1300"/>
             <w:tcBorders>
               <w:top w:val="single" w:color="BFBFBF" w:sz="4"/>
               <w:left w:val="none" w:color="FFFFFF" w:sz="0"/>
@@ -4578,7 +4819,7 @@
         </w:tc>
         <w:tc>
           <w:tcPr>
-            <w:tcW w:type="dxa" w:w="2334"/>
+            <w:tcW w:type="dxa" w:w="2100"/>
             <w:tcBorders>
               <w:top w:val="single" w:color="BFBFBF" w:sz="4"/>
               <w:left w:val="none" w:color="FFFFFF" w:sz="0"/>
@@ -4613,7 +4854,7 @@
         </w:tc>
         <w:tc>
           <w:tcPr>
-            <w:tcW w:type="dxa" w:w="1556"/>
+            <w:tcW w:type="dxa" w:w="1400"/>
             <w:tcBorders>
               <w:top w:val="single" w:color="BFBFBF" w:sz="4"/>
               <w:left w:val="none" w:color="FFFFFF" w:sz="0"/>
@@ -4653,7 +4894,7 @@
         </w:trPr>
         <w:tc>
           <w:tcPr>
-            <w:tcW w:type="dxa" w:w="3745"/>
+            <w:tcW w:type="dxa" w:w="3370"/>
             <w:tcBorders>
               <w:top w:val="single" w:color="BFBFBF" w:sz="4"/>
               <w:left w:val="none" w:color="FFFFFF" w:sz="0"/>
@@ -4687,7 +4928,7 @@
         </w:tc>
         <w:tc>
           <w:tcPr>
-            <w:tcW w:type="dxa" w:w="1000"/>
+            <w:tcW w:type="dxa" w:w="900"/>
             <w:tcBorders>
               <w:top w:val="single" w:color="BFBFBF" w:sz="4"/>
               <w:left w:val="none" w:color="FFFFFF" w:sz="0"/>
@@ -4721,7 +4962,7 @@
         </w:tc>
         <w:tc>
           <w:tcPr>
-            <w:tcW w:type="dxa" w:w="1445"/>
+            <w:tcW w:type="dxa" w:w="1300"/>
             <w:tcBorders>
               <w:top w:val="single" w:color="BFBFBF" w:sz="4"/>
               <w:left w:val="none" w:color="FFFFFF" w:sz="0"/>
@@ -4755,7 +4996,7 @@
         </w:tc>
         <w:tc>
           <w:tcPr>
-            <w:tcW w:type="dxa" w:w="2334"/>
+            <w:tcW w:type="dxa" w:w="2100"/>
             <w:tcBorders>
               <w:top w:val="single" w:color="BFBFBF" w:sz="4"/>
               <w:left w:val="none" w:color="FFFFFF" w:sz="0"/>
@@ -4789,7 +5030,7 @@
         </w:tc>
         <w:tc>
           <w:tcPr>
-            <w:tcW w:type="dxa" w:w="1556"/>
+            <w:tcW w:type="dxa" w:w="1400"/>
             <w:tcBorders>
               <w:top w:val="single" w:color="BFBFBF" w:sz="4"/>
               <w:left w:val="none" w:color="FFFFFF" w:sz="0"/>
@@ -4828,7 +5069,7 @@
         </w:trPr>
         <w:tc>
           <w:tcPr>
-            <w:tcW w:type="dxa" w:w="3745"/>
+            <w:tcW w:type="dxa" w:w="3370"/>
             <w:tcBorders>
               <w:top w:val="single" w:color="BFBFBF" w:sz="4"/>
               <w:left w:val="none" w:color="FFFFFF" w:sz="0"/>
@@ -4862,7 +5103,7 @@
         </w:tc>
         <w:tc>
           <w:tcPr>
-            <w:tcW w:type="dxa" w:w="1000"/>
+            <w:tcW w:type="dxa" w:w="900"/>
             <w:tcBorders>
               <w:top w:val="single" w:color="BFBFBF" w:sz="4"/>
               <w:left w:val="none" w:color="FFFFFF" w:sz="0"/>
@@ -4896,7 +5137,7 @@
         </w:tc>
         <w:tc>
           <w:tcPr>
-            <w:tcW w:type="dxa" w:w="1445"/>
+            <w:tcW w:type="dxa" w:w="1300"/>
             <w:tcBorders>
               <w:top w:val="single" w:color="BFBFBF" w:sz="4"/>
               <w:left w:val="none" w:color="FFFFFF" w:sz="0"/>
@@ -4930,7 +5171,7 @@
         </w:tc>
         <w:tc>
           <w:tcPr>
-            <w:tcW w:type="dxa" w:w="2334"/>
+            <w:tcW w:type="dxa" w:w="2100"/>
             <w:tcBorders>
               <w:top w:val="single" w:color="BFBFBF" w:sz="4"/>
               <w:left w:val="none" w:color="FFFFFF" w:sz="0"/>
@@ -4964,7 +5205,7 @@
         </w:tc>
         <w:tc>
           <w:tcPr>
-            <w:tcW w:type="dxa" w:w="1556"/>
+            <w:tcW w:type="dxa" w:w="1400"/>
             <w:tcBorders>
               <w:top w:val="single" w:color="BFBFBF" w:sz="4"/>
               <w:left w:val="none" w:color="FFFFFF" w:sz="0"/>
@@ -5003,7 +5244,7 @@
         </w:trPr>
         <w:tc>
           <w:tcPr>
-            <w:tcW w:type="dxa" w:w="3745"/>
+            <w:tcW w:type="dxa" w:w="3370"/>
             <w:tcBorders>
               <w:top w:val="single" w:color="BFBFBF" w:sz="4"/>
               <w:left w:val="none" w:color="FFFFFF" w:sz="0"/>
@@ -5037,7 +5278,7 @@
         </w:tc>
         <w:tc>
           <w:tcPr>
-            <w:tcW w:type="dxa" w:w="1000"/>
+            <w:tcW w:type="dxa" w:w="900"/>
             <w:tcBorders>
               <w:top w:val="single" w:color="BFBFBF" w:sz="4"/>
               <w:left w:val="none" w:color="FFFFFF" w:sz="0"/>
@@ -5071,7 +5312,7 @@
         </w:tc>
         <w:tc>
           <w:tcPr>
-            <w:tcW w:type="dxa" w:w="1445"/>
+            <w:tcW w:type="dxa" w:w="1300"/>
             <w:tcBorders>
               <w:top w:val="single" w:color="BFBFBF" w:sz="4"/>
               <w:left w:val="none" w:color="FFFFFF" w:sz="0"/>
@@ -5105,7 +5346,7 @@
         </w:tc>
         <w:tc>
           <w:tcPr>
-            <w:tcW w:type="dxa" w:w="2334"/>
+            <w:tcW w:type="dxa" w:w="2100"/>
             <w:tcBorders>
               <w:top w:val="single" w:color="BFBFBF" w:sz="4"/>
               <w:left w:val="none" w:color="FFFFFF" w:sz="0"/>
@@ -5139,7 +5380,7 @@
         </w:tc>
         <w:tc>
           <w:tcPr>
-            <w:tcW w:type="dxa" w:w="1556"/>
+            <w:tcW w:type="dxa" w:w="1400"/>
             <w:tcBorders>
               <w:top w:val="single" w:color="BFBFBF" w:sz="4"/>
               <w:left w:val="none" w:color="FFFFFF" w:sz="0"/>
@@ -5178,7 +5419,7 @@
         </w:trPr>
         <w:tc>
           <w:tcPr>
-            <w:tcW w:type="dxa" w:w="3745"/>
+            <w:tcW w:type="dxa" w:w="3370"/>
             <w:tcBorders>
               <w:top w:val="single" w:color="BFBFBF" w:sz="4"/>
               <w:left w:val="none" w:color="FFFFFF" w:sz="0"/>
@@ -5212,7 +5453,7 @@
         </w:tc>
         <w:tc>
           <w:tcPr>
-            <w:tcW w:type="dxa" w:w="1000"/>
+            <w:tcW w:type="dxa" w:w="900"/>
             <w:tcBorders>
               <w:top w:val="single" w:color="BFBFBF" w:sz="4"/>
               <w:left w:val="none" w:color="FFFFFF" w:sz="0"/>
@@ -5246,7 +5487,7 @@
         </w:tc>
         <w:tc>
           <w:tcPr>
-            <w:tcW w:type="dxa" w:w="1445"/>
+            <w:tcW w:type="dxa" w:w="1300"/>
             <w:tcBorders>
               <w:top w:val="single" w:color="BFBFBF" w:sz="4"/>
               <w:left w:val="none" w:color="FFFFFF" w:sz="0"/>
@@ -5280,7 +5521,7 @@
         </w:tc>
         <w:tc>
           <w:tcPr>
-            <w:tcW w:type="dxa" w:w="2334"/>
+            <w:tcW w:type="dxa" w:w="2100"/>
             <w:tcBorders>
               <w:top w:val="single" w:color="BFBFBF" w:sz="4"/>
               <w:left w:val="none" w:color="FFFFFF" w:sz="0"/>
@@ -5314,7 +5555,7 @@
         </w:tc>
         <w:tc>
           <w:tcPr>
-            <w:tcW w:type="dxa" w:w="1556"/>
+            <w:tcW w:type="dxa" w:w="1400"/>
             <w:tcBorders>
               <w:top w:val="single" w:color="BFBFBF" w:sz="4"/>
               <w:left w:val="none" w:color="FFFFFF" w:sz="0"/>
@@ -5459,7 +5700,7 @@
     </w:p>
     <w:tbl>
       <w:tblPr>
-        <w:tblW w:type="dxa" w:w="10080"/>
+        <w:tblW w:type="dxa" w:w="9070"/>
         <w:jc w:val="center"/>
         <w:tblBorders>
           <w:top w:val="single" w:color="auto" w:sz="4"/>
@@ -5471,11 +5712,11 @@
         </w:tblBorders>
       </w:tblPr>
       <w:tblGrid>
-        <w:gridCol w:w="2634"/>
-        <w:gridCol w:w="2278"/>
-        <w:gridCol w:w="1667"/>
-        <w:gridCol w:w="1389"/>
-        <w:gridCol w:w="2112"/>
+        <w:gridCol w:w="2370"/>
+        <w:gridCol w:w="2050"/>
+        <w:gridCol w:w="1500"/>
+        <w:gridCol w:w="1250"/>
+        <w:gridCol w:w="1900"/>
       </w:tblGrid>
       <w:tr>
         <w:trPr>
@@ -5483,7 +5724,7 @@
         </w:trPr>
         <w:tc>
           <w:tcPr>
-            <w:tcW w:type="dxa" w:w="2634"/>
+            <w:tcW w:type="dxa" w:w="2370"/>
             <w:tcBorders>
               <w:top w:val="single" w:color="BFBFBF" w:sz="4"/>
               <w:left w:val="none" w:color="FFFFFF" w:sz="0"/>
@@ -5518,7 +5759,7 @@
         </w:tc>
         <w:tc>
           <w:tcPr>
-            <w:tcW w:type="dxa" w:w="2278"/>
+            <w:tcW w:type="dxa" w:w="2050"/>
             <w:tcBorders>
               <w:top w:val="single" w:color="BFBFBF" w:sz="4"/>
               <w:left w:val="none" w:color="FFFFFF" w:sz="0"/>
@@ -5553,7 +5794,7 @@
         </w:tc>
         <w:tc>
           <w:tcPr>
-            <w:tcW w:type="dxa" w:w="1667"/>
+            <w:tcW w:type="dxa" w:w="1500"/>
             <w:tcBorders>
               <w:top w:val="single" w:color="BFBFBF" w:sz="4"/>
               <w:left w:val="none" w:color="FFFFFF" w:sz="0"/>
@@ -5588,7 +5829,7 @@
         </w:tc>
         <w:tc>
           <w:tcPr>
-            <w:tcW w:type="dxa" w:w="1389"/>
+            <w:tcW w:type="dxa" w:w="1250"/>
             <w:tcBorders>
               <w:top w:val="single" w:color="BFBFBF" w:sz="4"/>
               <w:left w:val="none" w:color="FFFFFF" w:sz="0"/>
@@ -5623,7 +5864,7 @@
         </w:tc>
         <w:tc>
           <w:tcPr>
-            <w:tcW w:type="dxa" w:w="2112"/>
+            <w:tcW w:type="dxa" w:w="1900"/>
             <w:tcBorders>
               <w:top w:val="single" w:color="BFBFBF" w:sz="4"/>
               <w:left w:val="none" w:color="FFFFFF" w:sz="0"/>
@@ -5663,7 +5904,7 @@
         </w:trPr>
         <w:tc>
           <w:tcPr>
-            <w:tcW w:type="dxa" w:w="2634"/>
+            <w:tcW w:type="dxa" w:w="2370"/>
             <w:tcBorders>
               <w:top w:val="single" w:color="BFBFBF" w:sz="4"/>
               <w:left w:val="none" w:color="FFFFFF" w:sz="0"/>
@@ -5697,7 +5938,7 @@
         </w:tc>
         <w:tc>
           <w:tcPr>
-            <w:tcW w:type="dxa" w:w="2278"/>
+            <w:tcW w:type="dxa" w:w="2050"/>
             <w:tcBorders>
               <w:top w:val="single" w:color="BFBFBF" w:sz="4"/>
               <w:left w:val="none" w:color="FFFFFF" w:sz="0"/>
@@ -5731,7 +5972,7 @@
         </w:tc>
         <w:tc>
           <w:tcPr>
-            <w:tcW w:type="dxa" w:w="1667"/>
+            <w:tcW w:type="dxa" w:w="1500"/>
             <w:tcBorders>
               <w:top w:val="single" w:color="BFBFBF" w:sz="4"/>
               <w:left w:val="none" w:color="FFFFFF" w:sz="0"/>
@@ -5765,7 +6006,7 @@
         </w:tc>
         <w:tc>
           <w:tcPr>
-            <w:tcW w:type="dxa" w:w="1389"/>
+            <w:tcW w:type="dxa" w:w="1250"/>
             <w:tcBorders>
               <w:top w:val="single" w:color="BFBFBF" w:sz="4"/>
               <w:left w:val="none" w:color="FFFFFF" w:sz="0"/>
@@ -5799,7 +6040,7 @@
         </w:tc>
         <w:tc>
           <w:tcPr>
-            <w:tcW w:type="dxa" w:w="2112"/>
+            <w:tcW w:type="dxa" w:w="1900"/>
             <w:tcBorders>
               <w:top w:val="single" w:color="BFBFBF" w:sz="4"/>
               <w:left w:val="none" w:color="FFFFFF" w:sz="0"/>
@@ -5838,7 +6079,7 @@
         </w:trPr>
         <w:tc>
           <w:tcPr>
-            <w:tcW w:type="dxa" w:w="2634"/>
+            <w:tcW w:type="dxa" w:w="2370"/>
             <w:tcBorders>
               <w:top w:val="single" w:color="BFBFBF" w:sz="4"/>
               <w:left w:val="none" w:color="FFFFFF" w:sz="0"/>
@@ -5872,7 +6113,7 @@
         </w:tc>
         <w:tc>
           <w:tcPr>
-            <w:tcW w:type="dxa" w:w="2278"/>
+            <w:tcW w:type="dxa" w:w="2050"/>
             <w:tcBorders>
               <w:top w:val="single" w:color="BFBFBF" w:sz="4"/>
               <w:left w:val="none" w:color="FFFFFF" w:sz="0"/>
@@ -5906,7 +6147,7 @@
         </w:tc>
         <w:tc>
           <w:tcPr>
-            <w:tcW w:type="dxa" w:w="1667"/>
+            <w:tcW w:type="dxa" w:w="1500"/>
             <w:tcBorders>
               <w:top w:val="single" w:color="BFBFBF" w:sz="4"/>
               <w:left w:val="none" w:color="FFFFFF" w:sz="0"/>
@@ -5940,7 +6181,7 @@
         </w:tc>
         <w:tc>
           <w:tcPr>
-            <w:tcW w:type="dxa" w:w="1389"/>
+            <w:tcW w:type="dxa" w:w="1250"/>
             <w:tcBorders>
               <w:top w:val="single" w:color="BFBFBF" w:sz="4"/>
               <w:left w:val="none" w:color="FFFFFF" w:sz="0"/>
@@ -5974,7 +6215,7 @@
         </w:tc>
         <w:tc>
           <w:tcPr>
-            <w:tcW w:type="dxa" w:w="2112"/>
+            <w:tcW w:type="dxa" w:w="1900"/>
             <w:tcBorders>
               <w:top w:val="single" w:color="BFBFBF" w:sz="4"/>
               <w:left w:val="none" w:color="FFFFFF" w:sz="0"/>
@@ -6013,7 +6254,7 @@
         </w:trPr>
         <w:tc>
           <w:tcPr>
-            <w:tcW w:type="dxa" w:w="2634"/>
+            <w:tcW w:type="dxa" w:w="2370"/>
             <w:tcBorders>
               <w:top w:val="single" w:color="BFBFBF" w:sz="4"/>
               <w:left w:val="none" w:color="FFFFFF" w:sz="0"/>
@@ -6047,7 +6288,7 @@
         </w:tc>
         <w:tc>
           <w:tcPr>
-            <w:tcW w:type="dxa" w:w="2278"/>
+            <w:tcW w:type="dxa" w:w="2050"/>
             <w:tcBorders>
               <w:top w:val="single" w:color="BFBFBF" w:sz="4"/>
               <w:left w:val="none" w:color="FFFFFF" w:sz="0"/>
@@ -6081,7 +6322,7 @@
         </w:tc>
         <w:tc>
           <w:tcPr>
-            <w:tcW w:type="dxa" w:w="1667"/>
+            <w:tcW w:type="dxa" w:w="1500"/>
             <w:tcBorders>
               <w:top w:val="single" w:color="BFBFBF" w:sz="4"/>
               <w:left w:val="none" w:color="FFFFFF" w:sz="0"/>
@@ -6115,7 +6356,7 @@
         </w:tc>
         <w:tc>
           <w:tcPr>
-            <w:tcW w:type="dxa" w:w="1389"/>
+            <w:tcW w:type="dxa" w:w="1250"/>
             <w:tcBorders>
               <w:top w:val="single" w:color="BFBFBF" w:sz="4"/>
               <w:left w:val="none" w:color="FFFFFF" w:sz="0"/>
@@ -6149,7 +6390,7 @@
         </w:tc>
         <w:tc>
           <w:tcPr>
-            <w:tcW w:type="dxa" w:w="2112"/>
+            <w:tcW w:type="dxa" w:w="1900"/>
             <w:tcBorders>
               <w:top w:val="single" w:color="BFBFBF" w:sz="4"/>
               <w:left w:val="none" w:color="FFFFFF" w:sz="0"/>
@@ -6188,7 +6429,7 @@
         </w:trPr>
         <w:tc>
           <w:tcPr>
-            <w:tcW w:type="dxa" w:w="2634"/>
+            <w:tcW w:type="dxa" w:w="2370"/>
             <w:tcBorders>
               <w:top w:val="single" w:color="BFBFBF" w:sz="4"/>
               <w:left w:val="none" w:color="FFFFFF" w:sz="0"/>
@@ -6222,7 +6463,7 @@
         </w:tc>
         <w:tc>
           <w:tcPr>
-            <w:tcW w:type="dxa" w:w="2278"/>
+            <w:tcW w:type="dxa" w:w="2050"/>
             <w:tcBorders>
               <w:top w:val="single" w:color="BFBFBF" w:sz="4"/>
               <w:left w:val="none" w:color="FFFFFF" w:sz="0"/>
@@ -6256,7 +6497,7 @@
         </w:tc>
         <w:tc>
           <w:tcPr>
-            <w:tcW w:type="dxa" w:w="1667"/>
+            <w:tcW w:type="dxa" w:w="1500"/>
             <w:tcBorders>
               <w:top w:val="single" w:color="BFBFBF" w:sz="4"/>
               <w:left w:val="none" w:color="FFFFFF" w:sz="0"/>
@@ -6290,7 +6531,7 @@
         </w:tc>
         <w:tc>
           <w:tcPr>
-            <w:tcW w:type="dxa" w:w="1389"/>
+            <w:tcW w:type="dxa" w:w="1250"/>
             <w:tcBorders>
               <w:top w:val="single" w:color="BFBFBF" w:sz="4"/>
               <w:left w:val="none" w:color="FFFFFF" w:sz="0"/>
@@ -6324,7 +6565,7 @@
         </w:tc>
         <w:tc>
           <w:tcPr>
-            <w:tcW w:type="dxa" w:w="2112"/>
+            <w:tcW w:type="dxa" w:w="1900"/>
             <w:tcBorders>
               <w:top w:val="single" w:color="BFBFBF" w:sz="4"/>
               <w:left w:val="none" w:color="FFFFFF" w:sz="0"/>
@@ -6559,7 +6800,7 @@
     </w:p>
     <w:tbl>
       <w:tblPr>
-        <w:tblW w:type="dxa" w:w="10080"/>
+        <w:tblW w:type="dxa" w:w="9070"/>
         <w:jc w:val="center"/>
         <w:tblBorders>
           <w:top w:val="single" w:color="auto" w:sz="4"/>
@@ -6571,9 +6812,9 @@
         </w:tblBorders>
       </w:tblPr>
       <w:tblGrid>
-        <w:gridCol w:w="1889"/>
-        <w:gridCol w:w="5412"/>
-        <w:gridCol w:w="2779"/>
+        <w:gridCol w:w="1700"/>
+        <w:gridCol w:w="4870"/>
+        <w:gridCol w:w="2500"/>
       </w:tblGrid>
       <w:tr>
         <w:trPr>
@@ -6581,7 +6822,7 @@
         </w:trPr>
         <w:tc>
           <w:tcPr>
-            <w:tcW w:type="dxa" w:w="1889"/>
+            <w:tcW w:type="dxa" w:w="1700"/>
             <w:tcBorders>
               <w:top w:val="single" w:color="BFBFBF" w:sz="4"/>
               <w:left w:val="none" w:color="FFFFFF" w:sz="0"/>
@@ -6616,7 +6857,7 @@
         </w:tc>
         <w:tc>
           <w:tcPr>
-            <w:tcW w:type="dxa" w:w="5412"/>
+            <w:tcW w:type="dxa" w:w="4870"/>
             <w:tcBorders>
               <w:top w:val="single" w:color="BFBFBF" w:sz="4"/>
               <w:left w:val="none" w:color="FFFFFF" w:sz="0"/>
@@ -6651,7 +6892,7 @@
         </w:tc>
         <w:tc>
           <w:tcPr>
-            <w:tcW w:type="dxa" w:w="2779"/>
+            <w:tcW w:type="dxa" w:w="2500"/>
             <w:tcBorders>
               <w:top w:val="single" w:color="BFBFBF" w:sz="4"/>
               <w:left w:val="none" w:color="FFFFFF" w:sz="0"/>
@@ -6691,7 +6932,7 @@
         </w:trPr>
         <w:tc>
           <w:tcPr>
-            <w:tcW w:type="dxa" w:w="1889"/>
+            <w:tcW w:type="dxa" w:w="1700"/>
             <w:tcBorders>
               <w:top w:val="single" w:color="BFBFBF" w:sz="4"/>
               <w:left w:val="none" w:color="FFFFFF" w:sz="0"/>
@@ -6725,7 +6966,7 @@
         </w:tc>
         <w:tc>
           <w:tcPr>
-            <w:tcW w:type="dxa" w:w="5412"/>
+            <w:tcW w:type="dxa" w:w="4870"/>
             <w:tcBorders>
               <w:top w:val="single" w:color="BFBFBF" w:sz="4"/>
               <w:left w:val="none" w:color="FFFFFF" w:sz="0"/>
@@ -6759,7 +7000,7 @@
         </w:tc>
         <w:tc>
           <w:tcPr>
-            <w:tcW w:type="dxa" w:w="2779"/>
+            <w:tcW w:type="dxa" w:w="2500"/>
             <w:tcBorders>
               <w:top w:val="single" w:color="BFBFBF" w:sz="4"/>
               <w:left w:val="none" w:color="FFFFFF" w:sz="0"/>
@@ -6798,7 +7039,7 @@
         </w:trPr>
         <w:tc>
           <w:tcPr>
-            <w:tcW w:type="dxa" w:w="1889"/>
+            <w:tcW w:type="dxa" w:w="1700"/>
             <w:tcBorders>
               <w:top w:val="single" w:color="BFBFBF" w:sz="4"/>
               <w:left w:val="none" w:color="FFFFFF" w:sz="0"/>
@@ -6832,7 +7073,7 @@
         </w:tc>
         <w:tc>
           <w:tcPr>
-            <w:tcW w:type="dxa" w:w="5412"/>
+            <w:tcW w:type="dxa" w:w="4870"/>
             <w:tcBorders>
               <w:top w:val="single" w:color="BFBFBF" w:sz="4"/>
               <w:left w:val="none" w:color="FFFFFF" w:sz="0"/>
@@ -6866,7 +7107,7 @@
         </w:tc>
         <w:tc>
           <w:tcPr>
-            <w:tcW w:type="dxa" w:w="2779"/>
+            <w:tcW w:type="dxa" w:w="2500"/>
             <w:tcBorders>
               <w:top w:val="single" w:color="BFBFBF" w:sz="4"/>
               <w:left w:val="none" w:color="FFFFFF" w:sz="0"/>
@@ -6905,7 +7146,7 @@
         </w:trPr>
         <w:tc>
           <w:tcPr>
-            <w:tcW w:type="dxa" w:w="1889"/>
+            <w:tcW w:type="dxa" w:w="1700"/>
             <w:tcBorders>
               <w:top w:val="single" w:color="BFBFBF" w:sz="4"/>
               <w:left w:val="none" w:color="FFFFFF" w:sz="0"/>
@@ -6939,7 +7180,7 @@
         </w:tc>
         <w:tc>
           <w:tcPr>
-            <w:tcW w:type="dxa" w:w="5412"/>
+            <w:tcW w:type="dxa" w:w="4870"/>
             <w:tcBorders>
               <w:top w:val="single" w:color="BFBFBF" w:sz="4"/>
               <w:left w:val="none" w:color="FFFFFF" w:sz="0"/>
@@ -6973,7 +7214,7 @@
         </w:tc>
         <w:tc>
           <w:tcPr>
-            <w:tcW w:type="dxa" w:w="2779"/>
+            <w:tcW w:type="dxa" w:w="2500"/>
             <w:tcBorders>
               <w:top w:val="single" w:color="BFBFBF" w:sz="4"/>
               <w:left w:val="none" w:color="FFFFFF" w:sz="0"/>
@@ -7012,7 +7253,7 @@
         </w:trPr>
         <w:tc>
           <w:tcPr>
-            <w:tcW w:type="dxa" w:w="1889"/>
+            <w:tcW w:type="dxa" w:w="1700"/>
             <w:tcBorders>
               <w:top w:val="single" w:color="BFBFBF" w:sz="4"/>
               <w:left w:val="none" w:color="FFFFFF" w:sz="0"/>
@@ -7046,7 +7287,7 @@
         </w:tc>
         <w:tc>
           <w:tcPr>
-            <w:tcW w:type="dxa" w:w="5412"/>
+            <w:tcW w:type="dxa" w:w="4870"/>
             <w:tcBorders>
               <w:top w:val="single" w:color="BFBFBF" w:sz="4"/>
               <w:left w:val="none" w:color="FFFFFF" w:sz="0"/>
@@ -7080,7 +7321,7 @@
         </w:tc>
         <w:tc>
           <w:tcPr>
-            <w:tcW w:type="dxa" w:w="2779"/>
+            <w:tcW w:type="dxa" w:w="2500"/>
             <w:tcBorders>
               <w:top w:val="single" w:color="BFBFBF" w:sz="4"/>
               <w:left w:val="none" w:color="FFFFFF" w:sz="0"/>
@@ -7119,7 +7360,7 @@
         </w:trPr>
         <w:tc>
           <w:tcPr>
-            <w:tcW w:type="dxa" w:w="1889"/>
+            <w:tcW w:type="dxa" w:w="1700"/>
             <w:tcBorders>
               <w:top w:val="single" w:color="BFBFBF" w:sz="4"/>
               <w:left w:val="none" w:color="FFFFFF" w:sz="0"/>
@@ -7153,7 +7394,7 @@
         </w:tc>
         <w:tc>
           <w:tcPr>
-            <w:tcW w:type="dxa" w:w="5412"/>
+            <w:tcW w:type="dxa" w:w="4870"/>
             <w:tcBorders>
               <w:top w:val="single" w:color="BFBFBF" w:sz="4"/>
               <w:left w:val="none" w:color="FFFFFF" w:sz="0"/>
@@ -7187,7 +7428,7 @@
         </w:tc>
         <w:tc>
           <w:tcPr>
-            <w:tcW w:type="dxa" w:w="2779"/>
+            <w:tcW w:type="dxa" w:w="2500"/>
             <w:tcBorders>
               <w:top w:val="single" w:color="BFBFBF" w:sz="4"/>
               <w:left w:val="none" w:color="FFFFFF" w:sz="0"/>
@@ -7226,7 +7467,7 @@
         </w:trPr>
         <w:tc>
           <w:tcPr>
-            <w:tcW w:type="dxa" w:w="1889"/>
+            <w:tcW w:type="dxa" w:w="1700"/>
             <w:tcBorders>
               <w:top w:val="single" w:color="BFBFBF" w:sz="4"/>
               <w:left w:val="none" w:color="FFFFFF" w:sz="0"/>
@@ -7260,7 +7501,7 @@
         </w:tc>
         <w:tc>
           <w:tcPr>
-            <w:tcW w:type="dxa" w:w="5412"/>
+            <w:tcW w:type="dxa" w:w="4870"/>
             <w:tcBorders>
               <w:top w:val="single" w:color="BFBFBF" w:sz="4"/>
               <w:left w:val="none" w:color="FFFFFF" w:sz="0"/>
@@ -7294,7 +7535,7 @@
         </w:tc>
         <w:tc>
           <w:tcPr>
-            <w:tcW w:type="dxa" w:w="2779"/>
+            <w:tcW w:type="dxa" w:w="2500"/>
             <w:tcBorders>
               <w:top w:val="single" w:color="BFBFBF" w:sz="4"/>
               <w:left w:val="none" w:color="FFFFFF" w:sz="0"/>
@@ -7750,14 +7991,10 @@
       </w:r>
     </w:p>
     <w:sectPr>
-      <w:headerReference w:type="default" r:id="rId7"/>
-      <w:headerReference w:type="first" r:id="rId8"/>
-      <w:footerReference w:type="default" r:id="rId9"/>
-      <w:footerReference w:type="first" r:id="rId10"/>
-      <w:pgSz w:w="12240" w:h="15840" w:orient="portrait"/>
-      <w:pgMar w:top="936" w:right="1080" w:bottom="1300" w:left="1080" w:header="720" w:footer="720" w:gutter="0"/>
-      <w:pgNumType w:start="0"/>
-      <w:titlePg/>
+      <w:footerReference w:type="default" r:id="rId7"/>
+      <w:pgSz w:w="11906" w:h="16838" w:orient="portrait"/>
+      <w:pgMar w:top="1300" w:right="1418" w:bottom="1300" w:left="1418" w:header="708" w:footer="600" w:gutter="0"/>
+      <w:pgNumType/>
       <w:docGrid w:linePitch="360"/>
     </w:sectPr>
   </w:body>
@@ -7808,61 +8045,35 @@
 <file path=word/footer1.xml><?xml version="1.0" encoding="utf-8"?>
 <w:ftr xmlns:wpc="http://schemas.microsoft.com/office/word/2010/wordprocessingCanvas" xmlns:mc="http://schemas.openxmlformats.org/markup-compatibility/2006" xmlns:o="urn:schemas-microsoft-com:office:office" xmlns:r="http://schemas.openxmlformats.org/officeDocument/2006/relationships" xmlns:m="http://schemas.openxmlformats.org/officeDocument/2006/math" xmlns:v="urn:schemas-microsoft-com:vml" xmlns:wp14="http://schemas.microsoft.com/office/word/2010/wordprocessingDrawing" xmlns:wp="http://schemas.openxmlformats.org/drawingml/2006/wordprocessingDrawing" xmlns:w10="urn:schemas-microsoft-com:office:word" xmlns:w="http://schemas.openxmlformats.org/wordprocessingml/2006/main" xmlns:w14="http://schemas.microsoft.com/office/word/2010/wordml" xmlns:w15="http://schemas.microsoft.com/office/word/2012/wordml" xmlns:wpg="http://schemas.microsoft.com/office/word/2010/wordprocessingGroup" xmlns:wpi="http://schemas.microsoft.com/office/word/2010/wordprocessingInk" xmlns:wne="http://schemas.microsoft.com/office/word/2006/wordml" xmlns:wps="http://schemas.microsoft.com/office/word/2010/wordprocessingShape">
   <w:p>
+    <w:pPr>
+      <w:pBdr>
+        <w:top w:val="single" w:color="BFBFBF" w:sz="4" w:space="4"/>
+      </w:pBdr>
+      <w:tabs>
+        <w:tab w:val="right" w:pos="9070"/>
+      </w:tabs>
+    </w:pPr>
     <w:r>
-      <w:drawing>
-        <wp:anchor distT="0" distB="0" distL="0" distR="0" simplePos="0" allowOverlap="1" behindDoc="1" locked="0" layoutInCell="1" relativeHeight="428625">
-          <wp:simplePos x="0" y="0"/>
-          <wp:positionH relativeFrom="page">
-            <wp:posOffset>518160</wp:posOffset>
-          </wp:positionH>
-          <wp:positionV relativeFrom="page">
-            <wp:posOffset>9174480</wp:posOffset>
-          </wp:positionV>
-          <wp:extent cx="6734175" cy="428625"/>
-          <wp:effectExtent t="0" r="0" b="0" l="0"/>
-          <wp:wrapNone/>
-          <wp:docPr id="1" name="" descr="" title=""/>
-          <wp:cNvGraphicFramePr>
-            <a:graphicFrameLocks xmlns:a="http://schemas.openxmlformats.org/drawingml/2006/main" noChangeAspect="1"/>
-          </wp:cNvGraphicFramePr>
-          <a:graphic xmlns:a="http://schemas.openxmlformats.org/drawingml/2006/main">
-            <a:graphicData uri="http://schemas.openxmlformats.org/drawingml/2006/picture">
-              <pic:pic xmlns:pic="http://schemas.openxmlformats.org/drawingml/2006/picture">
-                <pic:nvPicPr>
-                  <pic:cNvPr id="0" name="" descr=""/>
-                  <pic:cNvPicPr>
-                    <a:picLocks noChangeAspect="1" noChangeArrowheads="1"/>
-                  </pic:cNvPicPr>
-                </pic:nvPicPr>
-                <pic:blipFill>
-                  <a:blip r:embed="rId0" cstate="none"/>
-                  <a:srcRect/>
-                  <a:stretch>
-                    <a:fillRect/>
-                  </a:stretch>
-                </pic:blipFill>
-                <pic:spPr bwMode="auto">
-                  <a:xfrm>
-                    <a:off x="0" y="0"/>
-                    <a:ext cx="6734175" cy="428625"/>
-                  </a:xfrm>
-                  <a:prstGeom prst="rect">
-                    <a:avLst/>
-                  </a:prstGeom>
-                </pic:spPr>
-              </pic:pic>
-            </a:graphicData>
-          </a:graphic>
-        </wp:anchor>
-      </w:drawing>
+      <w:rPr>
+        <w:color w:val="7F7F7F"/>
+        <w:sz w:val="17"/>
+        <w:szCs w:val="17"/>
+      </w:rPr>
+      <w:t xml:space="preserve">Magíster en Ciencia de Datos e Inteligencia Artificial</w:t>
+    </w:r>
+    <w:r>
+      <w:rPr>
+        <w:color w:val="7F7F7F"/>
+        <w:sz w:val="17"/>
+        <w:szCs w:val="17"/>
+      </w:rPr>
+      <w:t xml:space="preserve">	</w:t>
+      <w:fldChar w:fldCharType="begin"/>
+      <w:instrText xml:space="preserve">PAGE</w:instrText>
+      <w:fldChar w:fldCharType="separate"/>
+      <w:fldChar w:fldCharType="end"/>
     </w:r>
   </w:p>
-</w:ftr>
-</file>
-
-<file path=word/footer2.xml><?xml version="1.0" encoding="utf-8"?>
-<w:ftr xmlns:wpc="http://schemas.microsoft.com/office/word/2010/wordprocessingCanvas" xmlns:mc="http://schemas.openxmlformats.org/markup-compatibility/2006" xmlns:o="urn:schemas-microsoft-com:office:office" xmlns:r="http://schemas.openxmlformats.org/officeDocument/2006/relationships" xmlns:m="http://schemas.openxmlformats.org/officeDocument/2006/math" xmlns:v="urn:schemas-microsoft-com:vml" xmlns:wp14="http://schemas.microsoft.com/office/word/2010/wordprocessingDrawing" xmlns:wp="http://schemas.openxmlformats.org/drawingml/2006/wordprocessingDrawing" xmlns:w10="urn:schemas-microsoft-com:office:word" xmlns:w="http://schemas.openxmlformats.org/wordprocessingml/2006/main" xmlns:w14="http://schemas.microsoft.com/office/word/2010/wordml" xmlns:w15="http://schemas.microsoft.com/office/word/2012/wordml" xmlns:wpg="http://schemas.microsoft.com/office/word/2010/wordprocessingGroup" xmlns:wpi="http://schemas.microsoft.com/office/word/2010/wordprocessingInk" xmlns:wne="http://schemas.microsoft.com/office/word/2006/wordml" xmlns:wps="http://schemas.microsoft.com/office/word/2010/wordprocessingShape">
-  <w:p/>
 </w:ftr>
 </file>
 
@@ -7901,82 +8112,6 @@
     </w:p>
   </w:footnote>
 </w:footnotes>
-</file>
-
-<file path=word/header1.xml><?xml version="1.0" encoding="utf-8"?>
-<w:hdr xmlns:wpc="http://schemas.microsoft.com/office/word/2010/wordprocessingCanvas" xmlns:mc="http://schemas.openxmlformats.org/markup-compatibility/2006" xmlns:o="urn:schemas-microsoft-com:office:office" xmlns:r="http://schemas.openxmlformats.org/officeDocument/2006/relationships" xmlns:m="http://schemas.openxmlformats.org/officeDocument/2006/math" xmlns:v="urn:schemas-microsoft-com:vml" xmlns:wp14="http://schemas.microsoft.com/office/word/2010/wordprocessingDrawing" xmlns:wp="http://schemas.openxmlformats.org/drawingml/2006/wordprocessingDrawing" xmlns:w10="urn:schemas-microsoft-com:office:word" xmlns:w="http://schemas.openxmlformats.org/wordprocessingml/2006/main" xmlns:w14="http://schemas.microsoft.com/office/word/2010/wordml" xmlns:w15="http://schemas.microsoft.com/office/word/2012/wordml" xmlns:wpg="http://schemas.microsoft.com/office/word/2010/wordprocessingGroup" xmlns:wpi="http://schemas.microsoft.com/office/word/2010/wordprocessingInk" xmlns:wne="http://schemas.microsoft.com/office/word/2006/wordml" xmlns:wps="http://schemas.microsoft.com/office/word/2010/wordprocessingShape" xmlns:cx="http://schemas.microsoft.com/office/drawing/2014/chartex" xmlns:cx1="http://schemas.microsoft.com/office/drawing/2015/9/8/chartex" xmlns:cx2="http://schemas.microsoft.com/office/drawing/2015/10/21/chartex" xmlns:cx3="http://schemas.microsoft.com/office/drawing/2016/5/9/chartex" xmlns:cx4="http://schemas.microsoft.com/office/drawing/2016/5/10/chartex" xmlns:cx5="http://schemas.microsoft.com/office/drawing/2016/5/11/chartex" xmlns:cx6="http://schemas.microsoft.com/office/drawing/2016/5/12/chartex" xmlns:cx7="http://schemas.microsoft.com/office/drawing/2016/5/13/chartex" xmlns:cx8="http://schemas.microsoft.com/office/drawing/2016/5/14/chartex" xmlns:w16cid="http://schemas.microsoft.com/office/word/2016/wordml/cid" xmlns:w16se="http://schemas.microsoft.com/office/word/2015/wordml/symex">
-  <w:p>
-    <w:pPr>
-      <w:jc w:val="right"/>
-    </w:pPr>
-    <w:r>
-      <w:rPr>
-        <w:rFonts w:ascii="Calibri" w:cs="Calibri" w:eastAsia="Calibri" w:hAnsi="Calibri"/>
-        <w:sz w:val="22"/>
-        <w:szCs w:val="22"/>
-      </w:rPr>
-      <w:fldChar w:fldCharType="begin"/>
-      <w:instrText xml:space="preserve">PAGE</w:instrText>
-      <w:fldChar w:fldCharType="separate"/>
-      <w:fldChar w:fldCharType="end"/>
-    </w:r>
-  </w:p>
-</w:hdr>
-</file>
-
-<file path=word/header2.xml><?xml version="1.0" encoding="utf-8"?>
-<w:hdr xmlns:wpc="http://schemas.microsoft.com/office/word/2010/wordprocessingCanvas" xmlns:mc="http://schemas.openxmlformats.org/markup-compatibility/2006" xmlns:o="urn:schemas-microsoft-com:office:office" xmlns:r="http://schemas.openxmlformats.org/officeDocument/2006/relationships" xmlns:m="http://schemas.openxmlformats.org/officeDocument/2006/math" xmlns:v="urn:schemas-microsoft-com:vml" xmlns:wp14="http://schemas.microsoft.com/office/word/2010/wordprocessingDrawing" xmlns:wp="http://schemas.openxmlformats.org/drawingml/2006/wordprocessingDrawing" xmlns:w10="urn:schemas-microsoft-com:office:word" xmlns:w="http://schemas.openxmlformats.org/wordprocessingml/2006/main" xmlns:w14="http://schemas.microsoft.com/office/word/2010/wordml" xmlns:w15="http://schemas.microsoft.com/office/word/2012/wordml" xmlns:wpg="http://schemas.microsoft.com/office/word/2010/wordprocessingGroup" xmlns:wpi="http://schemas.microsoft.com/office/word/2010/wordprocessingInk" xmlns:wne="http://schemas.microsoft.com/office/word/2006/wordml" xmlns:wps="http://schemas.microsoft.com/office/word/2010/wordprocessingShape" xmlns:cx="http://schemas.microsoft.com/office/drawing/2014/chartex" xmlns:cx1="http://schemas.microsoft.com/office/drawing/2015/9/8/chartex" xmlns:cx2="http://schemas.microsoft.com/office/drawing/2015/10/21/chartex" xmlns:cx3="http://schemas.microsoft.com/office/drawing/2016/5/9/chartex" xmlns:cx4="http://schemas.microsoft.com/office/drawing/2016/5/10/chartex" xmlns:cx5="http://schemas.microsoft.com/office/drawing/2016/5/11/chartex" xmlns:cx6="http://schemas.microsoft.com/office/drawing/2016/5/12/chartex" xmlns:cx7="http://schemas.microsoft.com/office/drawing/2016/5/13/chartex" xmlns:cx8="http://schemas.microsoft.com/office/drawing/2016/5/14/chartex" xmlns:w16cid="http://schemas.microsoft.com/office/word/2016/wordml/cid" xmlns:w16se="http://schemas.microsoft.com/office/word/2015/wordml/symex">
-  <w:p>
-    <w:r>
-      <w:drawing>
-        <wp:anchor distT="0" distB="0" distL="0" distR="0" simplePos="0" allowOverlap="1" behindDoc="1" locked="0" layoutInCell="1" relativeHeight="171450">
-          <wp:simplePos x="0" y="0"/>
-          <wp:positionH relativeFrom="page">
-            <wp:posOffset>655320</wp:posOffset>
-          </wp:positionH>
-          <wp:positionV relativeFrom="page">
-            <wp:posOffset>426720</wp:posOffset>
-          </wp:positionV>
-          <wp:extent cx="6753225" cy="171450"/>
-          <wp:effectExtent t="0" r="0" b="0" l="0"/>
-          <wp:wrapNone/>
-          <wp:docPr id="1" name="" descr="" title=""/>
-          <wp:cNvGraphicFramePr>
-            <a:graphicFrameLocks xmlns:a="http://schemas.openxmlformats.org/drawingml/2006/main" noChangeAspect="1"/>
-          </wp:cNvGraphicFramePr>
-          <a:graphic xmlns:a="http://schemas.openxmlformats.org/drawingml/2006/main">
-            <a:graphicData uri="http://schemas.openxmlformats.org/drawingml/2006/picture">
-              <pic:pic xmlns:pic="http://schemas.openxmlformats.org/drawingml/2006/picture">
-                <pic:nvPicPr>
-                  <pic:cNvPr id="0" name="" descr=""/>
-                  <pic:cNvPicPr>
-                    <a:picLocks noChangeAspect="1" noChangeArrowheads="1"/>
-                  </pic:cNvPicPr>
-                </pic:nvPicPr>
-                <pic:blipFill>
-                  <a:blip r:embed="rId0" cstate="none"/>
-                  <a:srcRect/>
-                  <a:stretch>
-                    <a:fillRect/>
-                  </a:stretch>
-                </pic:blipFill>
-                <pic:spPr bwMode="auto">
-                  <a:xfrm>
-                    <a:off x="0" y="0"/>
-                    <a:ext cx="6753225" cy="171450"/>
-                  </a:xfrm>
-                  <a:prstGeom prst="rect">
-                    <a:avLst/>
-                  </a:prstGeom>
-                </pic:spPr>
-              </pic:pic>
-            </a:graphicData>
-          </a:graphic>
-        </wp:anchor>
-      </w:drawing>
-    </w:r>
-  </w:p>
-</w:hdr>
 </file>
 
 <file path=word/numbering.xml><?xml version="1.0" encoding="utf-8"?>
@@ -8097,9 +8232,9 @@
   <w:docDefaults>
     <w:rPrDefault>
       <w:rPr>
-        <w:rFonts w:ascii="Arial" w:cs="Arial" w:eastAsia="Arial" w:hAnsi="Arial"/>
-        <w:sz w:val="20"/>
-        <w:szCs w:val="20"/>
+        <w:rFonts w:ascii="Calibri" w:cs="Calibri" w:eastAsia="Calibri" w:hAnsi="Calibri"/>
+        <w:sz w:val="21"/>
+        <w:szCs w:val="21"/>
       </w:rPr>
     </w:rPrDefault>
     <w:pPrDefault/>
@@ -8288,8 +8423,8 @@
       <w:b/>
       <w:bCs/>
       <w:color w:val="1F4E79"/>
-      <w:sz w:val="30"/>
-      <w:szCs w:val="30"/>
+      <w:sz w:val="28"/>
+      <w:szCs w:val="28"/>
     </w:rPr>
   </w:style>
   <w:style w:type="paragraph" w:styleId="Heading2">
@@ -8304,9 +8439,9 @@
       <w:rFonts w:ascii="Calibri" w:cs="Calibri" w:eastAsia="Calibri" w:hAnsi="Calibri"/>
       <w:b/>
       <w:bCs/>
-      <w:color w:val="A61C2D"/>
-      <w:sz w:val="24"/>
-      <w:szCs w:val="24"/>
+      <w:color w:val="2E2E2E"/>
+      <w:sz w:val="23"/>
+      <w:szCs w:val="23"/>
     </w:rPr>
   </w:style>
 </w:styles>

</xml_diff>